<commit_message>
feat: add mandatory profile onboarding and dashboard flow
</commit_message>
<xml_diff>
--- a/output/lab2/Fit_Nutrition_Supply_LR2.docx
+++ b/output/lab2/Fit_Nutrition_Supply_LR2.docx
@@ -1282,7 +1282,7 @@
         </w:rPr>
         <w:t>4 Модель данных</w:t>
         <w:tab/>
-        <w:t>9</w:t>
+        <w:t>10</w:t>
       </w:r>
     </w:p>
     <w:p>
@@ -1301,7 +1301,7 @@
         </w:rPr>
         <w:t>5 Программные интерфейсы</w:t>
         <w:tab/>
-        <w:t>11</w:t>
+        <w:t>12</w:t>
       </w:r>
     </w:p>
     <w:p>
@@ -1320,7 +1320,7 @@
         </w:rPr>
         <w:t>6 Архитектурные решения</w:t>
         <w:tab/>
-        <w:t>13</w:t>
+        <w:t>14</w:t>
       </w:r>
     </w:p>
     <w:p>
@@ -1339,7 +1339,7 @@
         </w:rPr>
         <w:t>7 Проверка прототипа и покрытие требований</w:t>
         <w:tab/>
-        <w:t>18</w:t>
+        <w:t>20</w:t>
       </w:r>
     </w:p>
     <w:p>
@@ -1358,7 +1358,7 @@
         </w:rPr>
         <w:t>8 Работа с ИИ агентом</w:t>
         <w:tab/>
-        <w:t>20</w:t>
+        <w:t>22</w:t>
       </w:r>
     </w:p>
     <w:p>
@@ -1377,7 +1377,7 @@
         </w:rPr>
         <w:t>Заключение</w:t>
         <w:tab/>
-        <w:t>21</w:t>
+        <w:t>24</w:t>
       </w:r>
     </w:p>
     <w:p>
@@ -1396,7 +1396,7 @@
         </w:rPr>
         <w:t>Источники</w:t>
         <w:tab/>
-        <w:t>22</w:t>
+        <w:t>25</w:t>
       </w:r>
     </w:p>
     <w:p>
@@ -1415,7 +1415,7 @@
         </w:rPr>
         <w:t>Приложение А Схемы</w:t>
         <w:tab/>
-        <w:t>23</w:t>
+        <w:t>26</w:t>
       </w:r>
     </w:p>
     <w:p>
@@ -1434,7 +1434,7 @@
         </w:rPr>
         <w:t>Приложение Б Протокол проверки</w:t>
         <w:tab/>
-        <w:t>30</w:t>
+        <w:t>35</w:t>
       </w:r>
     </w:p>
     <w:p>
@@ -1453,7 +1453,7 @@
         <w:jc w:val="both"/>
       </w:pPr>
       <w:r>
-        <w:t>Цель работы — спроектировать архитектуру Fit Nutrition Supply и создать исполняемый прототип с экранными формами и навигацией. Работу выполняют Фазлыев А. А. и Чипига А. А., группа Б23-191-2. Основание требований — сданный отчёт ЛР1, сохранённый в sources/submitted-lab1/. Номера требований в данном документе относятся именно к нему.</w:t>
+        <w:t>Цель работы - спроектировать архитектуру Fit Nutrition Supply и создать исполняемый прототип с экранными формами и навигацией. Работу выполняют Фазлыев А. А. и Чипига А. А., группа Б23-191-2. Основание требований - сданный отчёт ЛР1, сохранённый в sources/submitted-lab1/. Номера требований в данном документе относятся именно к нему.</w:t>
       </w:r>
     </w:p>
     <w:p>
@@ -1482,7 +1482,7 @@
         <w:jc w:val="both"/>
       </w:pPr>
       <w:r>
-        <w:t>Основная целевая аудитория — взрослые люди, заинтересованные в снижении веса и планирующие готовить самостоятельно. Приложение помогает связать калорийность меню с повседневными покупками. Возможность использования людьми с другими целями не меняет основную ЦА. Ижевск — город пилота, а не признак принадлежности к аудитории.</w:t>
+        <w:t>Основная целевая аудитория - взрослые люди, заинтересованные в снижении веса и планирующие готовить самостоятельно. Приложение помогает связать калорийность меню с повседневными покупками. Возможность использования людьми с другими целями не меняет основную ЦА. Ижевск - город пилота, а не признак принадлежности к аудитории.</w:t>
       </w:r>
     </w:p>
     <w:p>
@@ -2150,7 +2150,7 @@
         <w:jc w:val="both"/>
       </w:pPr>
       <w:r>
-        <w:t>Актор — взрослый пользователь. Он регистрируется или входит, задаёт параметры, получает меню, открывает рецепты, выбирает замену, учитывает запасы и сравнивает закупку. Получение списка входит в состав сценария меню, а расчёт целых упаковок — в сравнение корзин. Источник учебных цен является внутренним компонентом, поэтому на диаграмме он не изображён как реальный внешний магазин.</w:t>
+        <w:t>Актор - взрослый пользователь. Он регистрируется или входит, задаёт параметры, получает меню, открывает рецепты, выбирает замену, учитывает запасы и сравнивает закупку. Получение списка входит в состав сценария меню, а расчёт целых упаковок - в сравнение корзин. Источник учебных цен является внутренним компонентом, поэтому на диаграмме он не изображён как реальный внешний магазин.</w:t>
       </w:r>
     </w:p>
     <w:p>
@@ -2184,7 +2184,7 @@
         <w:jc w:val="both"/>
       </w:pPr>
       <w:r>
-        <w:t>После входа пользователь заполняет параметры и период 7–31 день, выбирает 3–5 приёмов пищи, бюджет, время и исключения. Сервер проверяет поля и рассчитывает ориентир калорий. Для каждого приёма выбирается допустимый рецепт, затем размер порции масштабируется под долю суточной энергии. Лимит повторов проверяется в календарной неделе. Новый план записывается транзакцией только после успешного подбора всех позиций.</w:t>
+        <w:t>После регистрации пользователь проходит обязательный профиль: параметры, активность и цель, необязательные ограничения и сводку. Сохранение открывает дашборд. Отдельный экран плана принимает период 7-31 день, 3-5 приёмов пищи, бюджет периода, время и предпочтения. Параметры человека берутся из сохранённого профиля. Для каждого приёма выбирается допустимый рецепт, затем размер порции масштабируется под долю суточной энергии. Новый план записывается транзакцией только после успешного подбора всех позиций.</w:t>
       </w:r>
     </w:p>
     <w:p>
@@ -2342,7 +2342,67 @@
         <w:jc w:val="both"/>
       </w:pPr>
       <w:r>
-        <w:t>Настройки, меню, рецепт с заменой, список и корзины образуют основной сценарий. Вход и регистрация — вспомогательная форма перед ним. На малой ширине навигация и карточки перестраиваются.</w:t>
+        <w:t>Настройки, меню, рецепт с заменой, список и корзины образуют основной сценарий. Вход и регистрация - вспомогательная форма перед ним. На малой ширине навигация и карточки перестраиваются.</w:t>
+      </w:r>
+    </w:p>
+    <w:p>
+      <w:pPr>
+        <w:pStyle w:val="2"/>
+      </w:pPr>
+      <w:r>
+        <w:t>3.6 Обновление потока от 26.10.2026</w:t>
+      </w:r>
+    </w:p>
+    <w:p>
+      <w:pPr>
+        <w:spacing w:line="360" w:lineRule="auto"/>
+        <w:ind w:firstLine="709"/>
+        <w:jc w:val="both"/>
+      </w:pPr>
+      <w:r>
+        <w:t>Пользователь явно задал обязательный онбординг из трёх шагов и сводки, затем дашборд и отдельный план. Профиль сохраняется в SQLite, а незавершённый ввод и номер шага восстанавливаются из браузерного черновика по аккаунту. После сохранения профиль становится доступен на дашборде. Прямой переход к генерации без профиля блокируется в UI и API.</w:t>
+      </w:r>
+    </w:p>
+    <w:p>
+      <w:pPr>
+        <w:spacing w:line="360" w:lineRule="auto"/>
+        <w:ind w:firstLine="709"/>
+        <w:jc w:val="both"/>
+      </w:pPr>
+      <w:r>
+        <w:t>Профиль и настройки плана разделены, чтобы новый период не перезаписывал параметры человека. Шкалы ограничивают диапазон и шаг, рядом показано текущее значение. Числовые поля как единственный способ ввода, одна длинная форма и пропускаемый профиль отклонены: они не соответствуют постановке этой итерации. Подробнее: docs/lab2/entry_flow.md и ADR-006.</w:t>
+      </w:r>
+    </w:p>
+    <w:p>
+      <w:pPr>
+        <w:spacing w:line="276" w:lineRule="auto" w:after="100"/>
+        <w:ind w:firstLine="709"/>
+        <w:jc w:val="both"/>
+      </w:pPr>
+      <w:r>
+        <w:rPr>
+          <w:rFonts w:ascii="Times New Roman" w:hAnsi="Times New Roman"/>
+          <w:b w:val="0"/>
+          <w:color w:val="000000"/>
+          <w:sz w:val="24"/>
+        </w:rPr>
+        <w:t>См. рисунок 8 - Поток регистрации, профиля, дашборда и плана (приложение А).</w:t>
+      </w:r>
+    </w:p>
+    <w:p>
+      <w:pPr>
+        <w:spacing w:line="276" w:lineRule="auto" w:after="100"/>
+        <w:ind w:firstLine="709"/>
+        <w:jc w:val="both"/>
+      </w:pPr>
+      <w:r>
+        <w:rPr>
+          <w:rFonts w:ascii="Times New Roman" w:hAnsi="Times New Roman"/>
+          <w:b w:val="0"/>
+          <w:color w:val="000000"/>
+          <w:sz w:val="24"/>
+        </w:rPr>
+        <w:t>См. рисунок 9 - Четыре экрана онбординга (приложение А).</w:t>
       </w:r>
     </w:p>
     <w:p>
@@ -2361,7 +2421,7 @@
         <w:jc w:val="both"/>
       </w:pPr>
       <w:r>
-        <w:t>Схема хранения приведена в prototype/schema.sql. Для каждого соединения включаются внешние ключи. Идентификаторы предметных сущностей — UUID или стабильные идентификаторы каталога. Деньги хранятся целым числом копеек. Даты предложений и создания — строки ISO 8601 с часовым поясом; начало меню — календарная дата.</w:t>
+        <w:t>Схема хранения приведена в prototype/schema.sql. Для каждого соединения включаются внешние ключи. Идентификаторы предметных сущностей - UUID или стабильные идентификаторы каталога. Деньги хранятся целым числом копеек. Даты предложений и создания - строки ISO 8601 с часовым поясом; начало меню - календарная дата.</w:t>
       </w:r>
     </w:p>
     <w:p>
@@ -2925,7 +2985,7 @@
                 <w:color w:val="000000"/>
                 <w:sz w:val="22"/>
               </w:rPr>
-              <w:t>Ингредиенты и шаги — JSON, состав хранится на базовую порцию</w:t>
+              <w:t>Ингредиенты и шаги - JSON, состав хранится на базовую порцию</w:t>
             </w:r>
           </w:p>
         </w:tc>
@@ -3240,7 +3300,7 @@
         <w:jc w:val="both"/>
       </w:pPr>
       <w:r>
-        <w:t>API доступен по пути /api. Формат запросов и ответов — application/json, UTF-8. После входа браузер получает HttpOnly cookie session с SameSite=Strict. На сервере хранится SHA-256 токена, а не сам токен. Наличие авторизации проверяется до чтения пользовательского плана; чужая позиция не возвращается и не заменяется.</w:t>
+        <w:t>API доступен по пути /api. Формат запросов и ответов - application/json, UTF-8. После входа браузер получает HttpOnly cookie session с SameSite=Strict. На сервере хранится SHA-256 токена, а не сам токен. Наличие авторизации проверяется до чтения пользовательского плана; чужая позиция не возвращается и не заменяется.</w:t>
       </w:r>
     </w:p>
     <w:p>
@@ -3250,7 +3310,7 @@
         <w:jc w:val="both"/>
       </w:pPr>
       <w:r>
-        <w:t>Коды ответов: 200 — успешное чтение или изменение; 201 — создан план; 401 — нет сессии или неверные данные входа; 403 — недопустимый Origin; 404 — ресурс не найден; 422 — ошибка полей или невыполнимые ограничения; 429 — превышен лимит попыток входа; 503 — отказ источника цен. Ответ об ошибке имеет поле error, а при ошибке ввода — fields. Тела запросов ограничены 64 КиБ. Пароли и тела запросов не записываются в журнал.</w:t>
+        <w:t>Коды ответов: 200 - успешное чтение или изменение; 201 - создан план; 401 - нет сессии или неверные данные входа; 403 - недопустимый Origin; 404 - ресурс не найден; 422 - ошибка полей или невыполнимые ограничения; 429 - превышен лимит попыток входа; 503 - отказ источника цен. Ответ об ошибке имеет поле error, а при ошибке ввода - fields. Тела запросов ограничены 64 КиБ. Пароли и тела запросов не записываются в журнал.</w:t>
       </w:r>
     </w:p>
     <w:p>
@@ -3766,7 +3826,7 @@
                 <w:color w:val="000000"/>
                 <w:sz w:val="22"/>
               </w:rPr>
-              <w:t>POST /api/plan</w:t>
+              <w:t>PUT /api/profile</w:t>
             </w:r>
           </w:p>
         </w:tc>
@@ -3786,7 +3846,7 @@
                 <w:color w:val="000000"/>
                 <w:sz w:val="22"/>
               </w:rPr>
-              <w:t>Объект настроек</w:t>
+              <w:t>Параметры человека, активность, цель, ограничения</w:t>
             </w:r>
           </w:p>
         </w:tc>
@@ -3806,7 +3866,7 @@
                 <w:color w:val="000000"/>
                 <w:sz w:val="22"/>
               </w:rPr>
-              <w:t>201 и согласованный снимок нового плана; 422 при неверном вводе</w:t>
+              <w:t>Сохранённый профиль, profile_complete и состояние приложения</w:t>
             </w:r>
           </w:p>
         </w:tc>
@@ -3831,7 +3891,7 @@
                 <w:color w:val="000000"/>
                 <w:sz w:val="22"/>
               </w:rPr>
-              <w:t>GET /api/alternatives?item_id=…</w:t>
+              <w:t>POST /api/plan</w:t>
             </w:r>
           </w:p>
         </w:tc>
@@ -3851,7 +3911,7 @@
                 <w:color w:val="000000"/>
                 <w:sz w:val="22"/>
               </w:rPr>
-              <w:t>ID позиции своего плана</w:t>
+              <w:t>Период и настройки плана</w:t>
             </w:r>
           </w:p>
         </w:tc>
@@ -3871,7 +3931,7 @@
                 <w:color w:val="000000"/>
                 <w:sz w:val="22"/>
               </w:rPr>
-              <w:t>Массив допустимых рецептов</w:t>
+              <w:t>201; параметры человека берутся из готового профиля</w:t>
             </w:r>
           </w:p>
         </w:tc>
@@ -3896,7 +3956,7 @@
                 <w:color w:val="000000"/>
                 <w:sz w:val="22"/>
               </w:rPr>
-              <w:t>POST /api/replace</w:t>
+              <w:t>GET /api/alternatives?item_id=…</w:t>
             </w:r>
           </w:p>
         </w:tc>
@@ -3916,7 +3976,7 @@
                 <w:color w:val="000000"/>
                 <w:sz w:val="22"/>
               </w:rPr>
-              <w:t>item_id, recipe_id</w:t>
+              <w:t>ID позиции своего плана</w:t>
             </w:r>
           </w:p>
         </w:tc>
@@ -3936,7 +3996,7 @@
                 <w:color w:val="000000"/>
                 <w:sz w:val="22"/>
               </w:rPr>
-              <w:t>Изменение одной позиции и пересчитанный снимок</w:t>
+              <w:t>Массив допустимых рецептов</w:t>
             </w:r>
           </w:p>
         </w:tc>
@@ -3961,7 +4021,7 @@
                 <w:color w:val="000000"/>
                 <w:sz w:val="22"/>
               </w:rPr>
-              <w:t>PUT /api/pantry</w:t>
+              <w:t>POST /api/replace</w:t>
             </w:r>
           </w:p>
         </w:tc>
@@ -3981,7 +4041,7 @@
                 <w:color w:val="000000"/>
                 <w:sz w:val="22"/>
               </w:rPr>
-              <w:t>ingredient_id, amount, purchased</w:t>
+              <w:t>item_id, recipe_id</w:t>
             </w:r>
           </w:p>
         </w:tc>
@@ -4001,7 +4061,7 @@
                 <w:color w:val="000000"/>
                 <w:sz w:val="22"/>
               </w:rPr>
-              <w:t>Сохранённый запас и пересчитанный снимок</w:t>
+              <w:t>Изменение одной позиции и пересчитанный снимок</w:t>
             </w:r>
           </w:p>
         </w:tc>
@@ -4026,6 +4086,71 @@
                 <w:color w:val="000000"/>
                 <w:sz w:val="22"/>
               </w:rPr>
+              <w:t>PUT /api/pantry</w:t>
+            </w:r>
+          </w:p>
+        </w:tc>
+        <w:tc>
+          <w:tcPr>
+            <w:tcW w:type="dxa" w:w="3458"/>
+          </w:tcPr>
+          <w:p>
+            <w:pPr>
+              <w:spacing w:line="252" w:lineRule="auto" w:after="60" w:before="60"/>
+              <w:ind w:firstLine="0"/>
+            </w:pPr>
+            <w:r>
+              <w:rPr>
+                <w:rFonts w:ascii="Times New Roman" w:hAnsi="Times New Roman"/>
+                <w:b w:val="0"/>
+                <w:color w:val="000000"/>
+                <w:sz w:val="22"/>
+              </w:rPr>
+              <w:t>ingredient_id, amount, purchased</w:t>
+            </w:r>
+          </w:p>
+        </w:tc>
+        <w:tc>
+          <w:tcPr>
+            <w:tcW w:type="dxa" w:w="3515"/>
+          </w:tcPr>
+          <w:p>
+            <w:pPr>
+              <w:spacing w:line="252" w:lineRule="auto" w:after="60" w:before="60"/>
+              <w:ind w:firstLine="0"/>
+            </w:pPr>
+            <w:r>
+              <w:rPr>
+                <w:rFonts w:ascii="Times New Roman" w:hAnsi="Times New Roman"/>
+                <w:b w:val="0"/>
+                <w:color w:val="000000"/>
+                <w:sz w:val="22"/>
+              </w:rPr>
+              <w:t>Сохранённый запас и пересчитанный снимок</w:t>
+            </w:r>
+          </w:p>
+        </w:tc>
+      </w:tr>
+      <w:tr>
+        <w:trPr>
+          <w:cantSplit/>
+        </w:trPr>
+        <w:tc>
+          <w:tcPr>
+            <w:tcW w:type="dxa" w:w="2381"/>
+          </w:tcPr>
+          <w:p>
+            <w:pPr>
+              <w:spacing w:line="252" w:lineRule="auto" w:after="60" w:before="60"/>
+              <w:ind w:firstLine="0"/>
+            </w:pPr>
+            <w:r>
+              <w:rPr>
+                <w:rFonts w:ascii="Times New Roman" w:hAnsi="Times New Roman"/>
+                <w:b w:val="0"/>
+                <w:color w:val="000000"/>
+                <w:sz w:val="22"/>
+              </w:rPr>
               <w:t>POST /api/prices/refresh</w:t>
             </w:r>
           </w:p>
@@ -4084,7 +4209,7 @@
         <w:jc w:val="both"/>
       </w:pPr>
       <w:r>
-        <w:t>Пример запроса составления меню:</w:t>
+        <w:t>Пример запроса для готового профиля:</w:t>
       </w:r>
     </w:p>
     <w:p>
@@ -4096,7 +4221,7 @@
           <w:rFonts w:ascii="Consolas" w:hAnsi="Consolas"/>
           <w:sz w:val="18"/>
         </w:rPr>
-        <w:t>{"age":30,"sex":"male","height":180,"weight":80,</w:t>
+        <w:t>{"days":7,"meals":3,</w:t>
       </w:r>
     </w:p>
     <w:p>
@@ -4108,7 +4233,7 @@
           <w:rFonts w:ascii="Consolas" w:hAnsi="Consolas"/>
           <w:sz w:val="18"/>
         </w:rPr>
-        <w:t>"activity":1.55,"goal":"lose","days":7,"meals":3,</w:t>
+        <w:t>"budget":3500,"minutes":30,"repeat":2,</w:t>
       </w:r>
     </w:p>
     <w:p>
@@ -4120,7 +4245,7 @@
           <w:rFonts w:ascii="Consolas" w:hAnsi="Consolas"/>
           <w:sz w:val="18"/>
         </w:rPr>
-        <w:t>"budget":3500,"minutes":30,"repeat":2,</w:t>
+        <w:t>"start_date":"2026-10-26",</w:t>
       </w:r>
     </w:p>
     <w:p>
@@ -4132,7 +4257,7 @@
           <w:rFonts w:ascii="Consolas" w:hAnsi="Consolas"/>
           <w:sz w:val="18"/>
         </w:rPr>
-        <w:t>"start_date":"2026-10-26","allergens":["арахис"],"excluded":[]}</w:t>
+        <w:t>"preferences":["no_fish"]}</w:t>
       </w:r>
     </w:p>
     <w:p>
@@ -4297,7 +4422,7 @@
         <w:jc w:val="both"/>
       </w:pPr>
       <w:r>
-        <w:t>Приняты пять ADR: архитектурный стиль, хранение, детерминированные расчёты, изоляция источника цен и безопасность учётных записей. Каждый документ содержит контекст с FR/NFR, альтернативы, решение, последствия и фактическую роль агента. Полные тексты включены далее; отдельные файлы находятся в docs/lab2/adr/.</w:t>
+        <w:t>Приняты шесть ADR: архитектурный стиль, хранение, детерминированные расчёты, изоляция источника цен, безопасность учётных записей и разделение профиля с планом. Каждый документ содержит контекст с FR/NFR, альтернативы, решение, последствия и роль агента. Полные тексты включены далее; отдельные файлы находятся в docs/lab2/adr/.</w:t>
       </w:r>
     </w:p>
     <w:p>
@@ -4375,7 +4500,7 @@
           <w:color w:val="000000"/>
           <w:sz w:val="24"/>
         </w:rPr>
-        <w:t>FR-05–15 связывают меню, список и стоимость. Изменение блюда должно согласованно пересчитывать производные данные. FR-01 требует входа и сохранения данных пользователя, NFR-05 — браузерного интерфейса на нескольких ширинах. Команде нужен запускаемый срез без отдельной инфраструктуры для каждого компонента.</w:t>
+        <w:t>FR-05–15 связывают меню, список и стоимость. Изменение блюда должно согласованно пересчитывать производные данные. FR-01 требует входа и сохранения данных пользователя, NFR-05 - браузерного интерфейса на нескольких ширинах. Команде нужен запускаемый срез без отдельной инфраструктуры для каждого компонента.</w:t>
       </w:r>
     </w:p>
     <w:p>
@@ -4469,7 +4594,7 @@
           <w:color w:val="000000"/>
           <w:sz w:val="24"/>
         </w:rPr>
-        <w:t>Один Python-процесс отдаёт статический HTML/CSS/JavaScript и HTTP API. Вычисления вынесены в domain.py, источник цен — в prices.py; транспорт и SQL пока находятся в server.py. В браузере нет второго независимого механизма расчёта корзины: он отображает согласованный снимок сервера.</w:t>
+        <w:t>Один Python-процесс отдаёт статический HTML/CSS/JavaScript и HTTP API. Вычисления вынесены в domain.py, источник цен - в prices.py; транспорт и SQL пока находятся в server.py. В браузере нет второго независимого механизма расчёта корзины: он отображает согласованный снимок сервера.</w:t>
       </w:r>
     </w:p>
     <w:p>
@@ -4500,7 +4625,7 @@
           <w:color w:val="000000"/>
           <w:sz w:val="24"/>
         </w:rPr>
-        <w:t>Упрощаются запуск, отладка и транзакционная запись плана. Усложняется дальнейшее выделение авторизации и хранения из HTTP-обработчика. Риск — рост server.py при добавлении функций; границы уже заданы контрактами. Стандартный HTTP-сервер годится для локальной демонстрации, но требует замены или production-обвязки при публикации.</w:t>
+        <w:t>Упрощаются запуск, отладка и транзакционная запись плана. Усложняется дальнейшее выделение авторизации и хранения из HTTP-обработчика. Риск - рост server.py при добавлении функций; границы уже заданы контрактами. Стандартный HTTP-сервер годится для локальной демонстрации, но требует замены или production-обвязки при публикации.</w:t>
       </w:r>
     </w:p>
     <w:p>
@@ -4609,7 +4734,7 @@
           <w:color w:val="000000"/>
           <w:sz w:val="24"/>
         </w:rPr>
-        <w:t>FR-01 требует сохранить данные учётной записи; FR-10 — запасы после повторного входа; FR-05 и FR-07 — целостное меню и замену одной позиции. Нельзя записать половину нового плана и потерять предыдущий при нехватке рецептов.</w:t>
+        <w:t>FR-01 требует сохранить данные учётной записи; FR-10 - запасы после повторного входа; FR-05 и FR-07 - целостное меню и замену одной позиции. Нельзя записать половину нового плана и потерять предыдущий при нехватке рецептов.</w:t>
       </w:r>
     </w:p>
     <w:p>
@@ -4843,7 +4968,7 @@
           <w:color w:val="000000"/>
           <w:sz w:val="24"/>
         </w:rPr>
-        <w:t>FR-02 задаёт пример нормы калорий; FR-05 требует ограничений меню; FR-07 — пересчёта после замены; FR-09–13 — списка и целых упаковок; FR-15 — проверки бюджета. В FR-17 уже указано, что числа для анализа должен считать код.</w:t>
+        <w:t>FR-02 задаёт пример нормы калорий; FR-05 требует ограничений меню; FR-07 - пересчёта после замены; FR-09–13 - списка и целых упаковок; FR-15 - проверки бюджета. В FR-17 уже указано, что числа для анализа должен считать код.</w:t>
       </w:r>
     </w:p>
     <w:p>
@@ -5202,7 +5327,7 @@
           <w:color w:val="000000"/>
           <w:sz w:val="24"/>
         </w:rPr>
-        <w:t>Упрощаются повторяемая защита и тестирование ошибок. Нельзя делать вывод об экономии в настоящих магазинах или считать выполненным суточное обновление NFR-03. Риск — принять учебные данные за реальные; он снижен явной маркировкой и документированием. Доставка в первом сравнении не учитывается: сценарий обозначен как самовывоз.</w:t>
+        <w:t>Упрощаются повторяемая защита и тестирование ошибок. Нельзя делать вывод об экономии в настоящих магазинах или считать выполненным суточное обновление NFR-03. Риск - принять учебные данные за реальные; он снижен явной маркировкой и документированием. Доставка в первом сравнении не учитывается: сценарий обозначен как самовывоз.</w:t>
       </w:r>
     </w:p>
     <w:p>
@@ -5311,7 +5436,7 @@
           <w:color w:val="000000"/>
           <w:sz w:val="24"/>
         </w:rPr>
-        <w:t>FR-01 предусматривает email и пароль. NFR-01 требует bcrypt cost 12, HTTPS и блокировку после пяти неверных попыток за 15 минут. Доступ к позиции плана должен проверять владельца, а демонстрация — не требовать публикации настоящих учётных данных.</w:t>
+        <w:t>FR-01 предусматривает email и пароль. NFR-01 требует bcrypt cost 12, HTTPS и блокировку после пяти неверных попыток за 15 минут. Доступ к позиции плана должен проверять владельца, а демонстрация - не требовать публикации настоящих учётных данных.</w:t>
       </w:r>
     </w:p>
     <w:p>
@@ -5468,6 +5593,240 @@
           <w:sz w:val="24"/>
         </w:rPr>
         <w:t>Агент сверился с конкретным NFR-01 сданного отчёта и выбрал bcrypt вместо замены алгоритма без объяснения. Добавил проверку префикса хеша cost 12, входа второй сессии, изоляции другого пользователя и блокировки попыток. Выбор и его ограничения сформулированы агентом; отсутствующие production-проверки не приписаны студентам.</w:t>
+      </w:r>
+    </w:p>
+    <w:p>
+      <w:pPr>
+        <w:pStyle w:val="2"/>
+        <w:pageBreakBefore/>
+        <w:spacing w:line="288" w:lineRule="auto" w:before="160" w:after="80"/>
+      </w:pPr>
+      <w:r>
+        <w:rPr>
+          <w:rFonts w:ascii="Times New Roman" w:hAnsi="Times New Roman"/>
+          <w:b/>
+          <w:color w:val="000000"/>
+          <w:sz w:val="28"/>
+        </w:rPr>
+        <w:t>ADR-006: Обязательный профиль отдельно от плана</w:t>
+      </w:r>
+    </w:p>
+    <w:p>
+      <w:pPr>
+        <w:pStyle w:val="2"/>
+        <w:spacing w:line="288" w:lineRule="auto" w:before="80" w:after="40"/>
+      </w:pPr>
+      <w:r>
+        <w:rPr>
+          <w:rFonts w:ascii="Times New Roman" w:hAnsi="Times New Roman"/>
+          <w:b/>
+          <w:color w:val="000000"/>
+          <w:sz w:val="24"/>
+        </w:rPr>
+        <w:t>Статус</w:t>
+      </w:r>
+    </w:p>
+    <w:p>
+      <w:pPr>
+        <w:spacing w:line="288" w:lineRule="auto" w:after="40"/>
+        <w:ind w:firstLine="709"/>
+        <w:jc w:val="both"/>
+      </w:pPr>
+      <w:r>
+        <w:rPr>
+          <w:rFonts w:ascii="Times New Roman" w:hAnsi="Times New Roman"/>
+          <w:b w:val="0"/>
+          <w:color w:val="000000"/>
+          <w:sz w:val="24"/>
+        </w:rPr>
+        <w:t>Принято</w:t>
+      </w:r>
+    </w:p>
+    <w:p>
+      <w:pPr>
+        <w:pStyle w:val="2"/>
+        <w:spacing w:line="288" w:lineRule="auto" w:before="80" w:after="40"/>
+      </w:pPr>
+      <w:r>
+        <w:rPr>
+          <w:rFonts w:ascii="Times New Roman" w:hAnsi="Times New Roman"/>
+          <w:b/>
+          <w:color w:val="000000"/>
+          <w:sz w:val="24"/>
+        </w:rPr>
+        <w:t>Контекст</w:t>
+      </w:r>
+    </w:p>
+    <w:p>
+      <w:pPr>
+        <w:spacing w:line="288" w:lineRule="auto" w:after="40"/>
+        <w:ind w:firstLine="709"/>
+        <w:jc w:val="both"/>
+      </w:pPr>
+      <w:r>
+        <w:rPr>
+          <w:rFonts w:ascii="Times New Roman" w:hAnsi="Times New Roman"/>
+          <w:b w:val="0"/>
+          <w:color w:val="000000"/>
+          <w:sz w:val="24"/>
+        </w:rPr>
+        <w:t>FR-01 предусматривает регистрацию, FR-02 и FR-03 задают параметры человека и исключения, FR-05 и FR-15 относятся к плану на выбранный период. В задании пользователя от 26.10.2026 после регистрации обязателен профиль из трёх шагов и сводки, затем дашборд и отдельная настройка плана.</w:t>
+      </w:r>
+    </w:p>
+    <w:p>
+      <w:pPr>
+        <w:pStyle w:val="2"/>
+        <w:spacing w:line="288" w:lineRule="auto" w:before="80" w:after="40"/>
+      </w:pPr>
+      <w:r>
+        <w:rPr>
+          <w:rFonts w:ascii="Times New Roman" w:hAnsi="Times New Roman"/>
+          <w:b/>
+          <w:color w:val="000000"/>
+          <w:sz w:val="24"/>
+        </w:rPr>
+        <w:t>Рассмотренные альтернативы</w:t>
+      </w:r>
+    </w:p>
+    <w:p>
+      <w:pPr>
+        <w:spacing w:line="288" w:lineRule="auto" w:after="40"/>
+        <w:ind w:firstLine="709"/>
+        <w:jc w:val="both"/>
+      </w:pPr>
+      <w:r>
+        <w:rPr>
+          <w:rFonts w:ascii="Times New Roman" w:hAnsi="Times New Roman"/>
+          <w:b w:val="0"/>
+          <w:color w:val="000000"/>
+          <w:sz w:val="24"/>
+        </w:rPr>
+        <w:t>1. Одна форма: меньше экранов, но смешивает устойчивые данные с периодом и не соответствует заданному потоку.</w:t>
+      </w:r>
+    </w:p>
+    <w:p>
+      <w:pPr>
+        <w:spacing w:line="288" w:lineRule="auto" w:after="40"/>
+        <w:ind w:firstLine="709"/>
+        <w:jc w:val="both"/>
+      </w:pPr>
+      <w:r>
+        <w:rPr>
+          <w:rFonts w:ascii="Times New Roman" w:hAnsi="Times New Roman"/>
+          <w:b w:val="0"/>
+          <w:color w:val="000000"/>
+          <w:sz w:val="24"/>
+        </w:rPr>
+        <w:t>2. Пропускаемый профиль: быстрее открывает приложение, но допускает расчёт без обязательных исходных данных.</w:t>
+      </w:r>
+    </w:p>
+    <w:p>
+      <w:pPr>
+        <w:spacing w:line="288" w:lineRule="auto" w:after="40"/>
+        <w:ind w:firstLine="709"/>
+        <w:jc w:val="both"/>
+      </w:pPr>
+      <w:r>
+        <w:rPr>
+          <w:rFonts w:ascii="Times New Roman" w:hAnsi="Times New Roman"/>
+          <w:b w:val="0"/>
+          <w:color w:val="000000"/>
+          <w:sz w:val="24"/>
+        </w:rPr>
+        <w:t>3. Только localStorage: не требует серверного маршрута, но готовый профиль оказывается привязан к одному браузеру и расходится с существующей авторизацией.</w:t>
+      </w:r>
+    </w:p>
+    <w:p>
+      <w:pPr>
+        <w:pStyle w:val="2"/>
+        <w:spacing w:line="288" w:lineRule="auto" w:before="80" w:after="40"/>
+      </w:pPr>
+      <w:r>
+        <w:rPr>
+          <w:rFonts w:ascii="Times New Roman" w:hAnsi="Times New Roman"/>
+          <w:b/>
+          <w:color w:val="000000"/>
+          <w:sz w:val="24"/>
+        </w:rPr>
+        <w:t>Принятое решение</w:t>
+      </w:r>
+    </w:p>
+    <w:p>
+      <w:pPr>
+        <w:spacing w:line="288" w:lineRule="auto" w:after="40"/>
+        <w:ind w:firstLine="709"/>
+        <w:jc w:val="both"/>
+      </w:pPr>
+      <w:r>
+        <w:rPr>
+          <w:rFonts w:ascii="Times New Roman" w:hAnsi="Times New Roman"/>
+          <w:b w:val="0"/>
+          <w:color w:val="000000"/>
+          <w:sz w:val="24"/>
+        </w:rPr>
+        <w:t>Хранить профиль в profiles отдельно от снимка settings_json конкретного плана. Ввести PUT /api/profile и серверную проверку profile_complete перед генерацией. Черновик шагов хранить в localStorage по аккаунту; после успешного сохранения удалять его и переходить на дашборд. Для ограниченных чисел применять заданные пользователем шкалы, подтверждая значения серверной валидацией. В плане сохранять отпечаток значимых параметров профиля, чтобы не выдавать старый рацион за актуальный после изменения исключений.</w:t>
+      </w:r>
+    </w:p>
+    <w:p>
+      <w:pPr>
+        <w:pStyle w:val="2"/>
+        <w:spacing w:line="288" w:lineRule="auto" w:before="80" w:after="40"/>
+      </w:pPr>
+      <w:r>
+        <w:rPr>
+          <w:rFonts w:ascii="Times New Roman" w:hAnsi="Times New Roman"/>
+          <w:b/>
+          <w:color w:val="000000"/>
+          <w:sz w:val="24"/>
+        </w:rPr>
+        <w:t>Последствия</w:t>
+      </w:r>
+    </w:p>
+    <w:p>
+      <w:pPr>
+        <w:spacing w:line="288" w:lineRule="auto" w:after="40"/>
+        <w:ind w:firstLine="709"/>
+        <w:jc w:val="both"/>
+      </w:pPr>
+      <w:r>
+        <w:rPr>
+          <w:rFonts w:ascii="Times New Roman" w:hAnsi="Times New Roman"/>
+          <w:b w:val="0"/>
+          <w:color w:val="000000"/>
+          <w:sz w:val="24"/>
+        </w:rPr>
+        <w:t>Повторный план не требует заново заполнять профиль. Возврат и перезагрузка не стирают черновик. Усложняется синхронизация черновика и готового профиля; теперь есть два состояния данных. Старый план после изменения параметров нужно пересоставить, хотя запись сохраняется. Дополнительный API требует проверки входных значений и принадлежности аккаунту. Автоматический расчёт для возраста 14-17 лет в этой итерации не добавляется.</w:t>
+      </w:r>
+    </w:p>
+    <w:p>
+      <w:pPr>
+        <w:pStyle w:val="2"/>
+        <w:spacing w:line="288" w:lineRule="auto" w:before="80" w:after="40"/>
+      </w:pPr>
+      <w:r>
+        <w:rPr>
+          <w:rFonts w:ascii="Times New Roman" w:hAnsi="Times New Roman"/>
+          <w:b/>
+          <w:color w:val="000000"/>
+          <w:sz w:val="24"/>
+        </w:rPr>
+        <w:t>Роль агента</w:t>
+      </w:r>
+    </w:p>
+    <w:p>
+      <w:pPr>
+        <w:spacing w:line="288" w:lineRule="auto" w:after="40"/>
+        <w:ind w:firstLine="709"/>
+        <w:jc w:val="both"/>
+      </w:pPr>
+      <w:r>
+        <w:rPr>
+          <w:rFonts w:ascii="Times New Roman" w:hAnsi="Times New Roman"/>
+          <w:b w:val="0"/>
+          <w:color w:val="000000"/>
+          <w:sz w:val="24"/>
+        </w:rPr>
+        <w:t>Пользователь сформулировал явную задачу с четырьмя состояниями онбординга и дашбордом. Агент разделил модели, реализовал формы и серверную защиту, сохранил заданные диапазоны шкал, добавил тесты возврата, перезагрузки и обхода маршрута. Отпечаток плана предложен и реализован агентом как защита от скрытого использования старых ограничений. Числовые поля и одна общая форма рассмотрены при реализации и отклонены по требованиям этого запроса.</w:t>
       </w:r>
     </w:p>
     <w:p>
@@ -5701,7 +6060,7 @@
                 <w:color w:val="000000"/>
                 <w:sz w:val="22"/>
               </w:rPr>
-              <w:t>Расчёт и валидация реализованы; нижняя граница возраста уточнена до 18 лет под взрослую ЦА</w:t>
+              <w:t>Профиль: возраст 14-90, вес 40-200 с шагом 0,5, рост 140-220. Автоматический расчёт текущего прототипа доступен с 18 лет</w:t>
             </w:r>
           </w:p>
         </w:tc>
@@ -6394,7 +6753,7 @@
         <w:jc w:val="both"/>
       </w:pPr>
       <w:r>
-        <w:t>Такое покрытие соответствует цели ЛР2 — исполняемый интерактивный прототип. Оно не означает выполнения всей спецификации будущего продукта.</w:t>
+        <w:t>Такое покрытие соответствует цели ЛР2 - исполняемый интерактивный прототип. Оно не означает выполнения всей спецификации будущего продукта.</w:t>
       </w:r>
     </w:p>
     <w:p>
@@ -6413,6 +6772,16 @@
         <w:jc w:val="both"/>
       </w:pPr>
       <w:r>
+        <w:t>Следующая итерация началась с явной постановки пользователя: «Спроектируй и реализуй поток входа в Fit Nutrition Supply». Пользователь задал регистрацию, три шага профиля со сводкой, дашборд и отдельный план, точные диапазоны шкал и правила переходов. Агент реализовал поток, сравнил способы хранения, сформировал две редактируемые схемы и добавил проверки. Постановка и результат этой итерации сохранены в docs/lab2/prompts/2026-10-26-entry-flow.md и docs/lab2/entry_flow.md.</w:t>
+      </w:r>
+    </w:p>
+    <w:p>
+      <w:pPr>
+        <w:spacing w:line="360" w:lineRule="auto"/>
+        <w:ind w:firstLine="709"/>
+        <w:jc w:val="both"/>
+      </w:pPr>
+      <w:r>
         <w:t>Пользователь передал агенту сданные материалы и замечания. До начала кода агент запросил уточнение аудитории, согласование экранов и смысл замечания NFR-05. Пользователь заменил предложенную агентом группу студентов на людей с интересом к похудению, подтвердил экраны и уточнил, что нужны версии браузеров. Эти ответы изменили проект до реализации.</w:t>
       </w:r>
     </w:p>
@@ -6423,7 +6792,7 @@
         <w:jc w:val="both"/>
       </w:pPr>
       <w:r>
-        <w:t>Дословные значимые фрагменты запроса: «надо уже вторую лабу делать — реализовывать начинать продукт»; уточнение ЦА: «ЦА — люди с интересом в похудании»; ответ по экранам: «Да, подходит»; ответ по NFR-05: «указать версии браузеров вроде». Пунктуация первой фразы приведена к читаемому виду без изменения смысла. Полная переписка не подменяется вымышленными промптами.</w:t>
+        <w:t>Дословные значимые фрагменты запроса: «надо уже вторую лабу делать - реализовывать начинать продукт»; уточнение ЦА: «ЦА - люди с интересом в похудании»; ответ по экранам: «Да, подходит»; ответ по NFR-05: «указать версии браузеров вроде». Пунктуация первой фразы приведена к читаемому виду без изменения смысла. Полная переписка не подменяется вымышленными промптами.</w:t>
       </w:r>
     </w:p>
     <w:p>
@@ -6472,7 +6841,7 @@
         <w:jc w:val="both"/>
       </w:pPr>
       <w:r>
-        <w:t>Подготовлены структурная схема, use case, три диаграммы активности, ER-модель, контракты, предварительные экраны и пять ADR. Реализован запускаемый прототип с регистрацией, меню, заменой, списком и сравнением пяти учебных корзин. Документы и код находятся в одном репозитории. Следующий этап — расширить проверенный каталог и подключить реальный разрешённый источник цен, сохранив контракт адаптера.</w:t>
+        <w:t>Подготовлены структурная схема, use case, три диаграммы активности, ER-модель, контракты, экраны и шесть ADR. Прототип включает регистрацию, обязательный профиль, дашборд, отдельный план, замену блюд, список и пять учебных корзин. Документы и код находятся в одном репозитории. Следующий этап: проверенный каталог и реальный разрешённый источник цен.</w:t>
       </w:r>
     </w:p>
     <w:p>
@@ -7159,6 +7528,166 @@
     </w:p>
     <w:p>
       <w:pPr>
+        <w:spacing w:after="240"/>
+      </w:pPr>
+      <w:r>
+        <w:rPr>
+          <w:rFonts w:ascii="Times New Roman" w:hAnsi="Times New Roman"/>
+          <w:b w:val="0"/>
+          <w:color w:val="000000"/>
+          <w:sz w:val="24"/>
+        </w:rPr>
+        <w:t>Приложение А Продолжение</w:t>
+      </w:r>
+    </w:p>
+    <w:p>
+      <w:pPr>
+        <w:keepNext/>
+        <w:spacing w:line="240" w:lineRule="auto"/>
+        <w:jc w:val="center"/>
+      </w:pPr>
+      <w:r>
+        <w:drawing>
+          <wp:inline xmlns:a="http://schemas.openxmlformats.org/drawingml/2006/main" xmlns:pic="http://schemas.openxmlformats.org/drawingml/2006/picture">
+            <wp:extent cx="13860145" cy="6816465"/>
+            <wp:docPr id="8" name="Picture 8"/>
+            <wp:cNvGraphicFramePr>
+              <a:graphicFrameLocks noChangeAspect="1"/>
+            </wp:cNvGraphicFramePr>
+            <a:graphic>
+              <a:graphicData uri="http://schemas.openxmlformats.org/drawingml/2006/picture">
+                <pic:pic>
+                  <pic:nvPicPr>
+                    <pic:cNvPr id="0" name="entry_flow.png"/>
+                    <pic:cNvPicPr/>
+                  </pic:nvPicPr>
+                  <pic:blipFill>
+                    <a:blip r:embed="rId16"/>
+                    <a:stretch>
+                      <a:fillRect/>
+                    </a:stretch>
+                  </pic:blipFill>
+                  <pic:spPr>
+                    <a:xfrm>
+                      <a:off x="0" y="0"/>
+                      <a:ext cx="13860145" cy="6816465"/>
+                    </a:xfrm>
+                    <a:prstGeom prst="rect"/>
+                  </pic:spPr>
+                </pic:pic>
+              </a:graphicData>
+            </a:graphic>
+          </wp:inline>
+        </w:drawing>
+      </w:r>
+    </w:p>
+    <w:p>
+      <w:pPr>
+        <w:spacing w:line="276" w:lineRule="auto"/>
+        <w:jc w:val="center"/>
+      </w:pPr>
+      <w:r>
+        <w:rPr>
+          <w:rFonts w:ascii="Times New Roman" w:hAnsi="Times New Roman"/>
+          <w:b w:val="0"/>
+          <w:color w:val="000000"/>
+          <w:sz w:val="24"/>
+        </w:rPr>
+        <w:t>Рисунок 8 - Поток регистрации, профиля, дашборда и плана</w:t>
+      </w:r>
+    </w:p>
+    <w:p>
+      <w:pPr>
+        <w:sectPr>
+          <w:pgSz w:w="23811" w:h="16838" w:orient="landscape"/>
+          <w:pgMar w:top="850" w:right="850" w:bottom="850" w:left="1134" w:header="708" w:footer="567" w:gutter="0"/>
+          <w:cols w:space="708"/>
+          <w:docGrid w:linePitch="360"/>
+        </w:sectPr>
+      </w:pPr>
+    </w:p>
+    <w:p>
+      <w:pPr>
+        <w:spacing w:after="240"/>
+      </w:pPr>
+      <w:r>
+        <w:rPr>
+          <w:rFonts w:ascii="Times New Roman" w:hAnsi="Times New Roman"/>
+          <w:b w:val="0"/>
+          <w:color w:val="000000"/>
+          <w:sz w:val="24"/>
+        </w:rPr>
+        <w:t>Приложение А Продолжение</w:t>
+      </w:r>
+    </w:p>
+    <w:p>
+      <w:pPr>
+        <w:keepNext/>
+        <w:spacing w:line="240" w:lineRule="auto"/>
+        <w:jc w:val="center"/>
+      </w:pPr>
+      <w:r>
+        <w:drawing>
+          <wp:inline xmlns:a="http://schemas.openxmlformats.org/drawingml/2006/main" xmlns:pic="http://schemas.openxmlformats.org/drawingml/2006/picture">
+            <wp:extent cx="10751113" cy="8532629"/>
+            <wp:docPr id="9" name="Picture 9"/>
+            <wp:cNvGraphicFramePr>
+              <a:graphicFrameLocks noChangeAspect="1"/>
+            </wp:cNvGraphicFramePr>
+            <a:graphic>
+              <a:graphicData uri="http://schemas.openxmlformats.org/drawingml/2006/picture">
+                <pic:pic>
+                  <pic:nvPicPr>
+                    <pic:cNvPr id="0" name="onboarding_screens.png"/>
+                    <pic:cNvPicPr/>
+                  </pic:nvPicPr>
+                  <pic:blipFill>
+                    <a:blip r:embed="rId17"/>
+                    <a:stretch>
+                      <a:fillRect/>
+                    </a:stretch>
+                  </pic:blipFill>
+                  <pic:spPr>
+                    <a:xfrm>
+                      <a:off x="0" y="0"/>
+                      <a:ext cx="10751113" cy="8532629"/>
+                    </a:xfrm>
+                    <a:prstGeom prst="rect"/>
+                  </pic:spPr>
+                </pic:pic>
+              </a:graphicData>
+            </a:graphic>
+          </wp:inline>
+        </w:drawing>
+      </w:r>
+    </w:p>
+    <w:p>
+      <w:pPr>
+        <w:spacing w:line="276" w:lineRule="auto"/>
+        <w:jc w:val="center"/>
+      </w:pPr>
+      <w:r>
+        <w:rPr>
+          <w:rFonts w:ascii="Times New Roman" w:hAnsi="Times New Roman"/>
+          <w:b w:val="0"/>
+          <w:color w:val="000000"/>
+          <w:sz w:val="24"/>
+        </w:rPr>
+        <w:t>Рисунок 9 - Четыре экрана онбординга</w:t>
+      </w:r>
+    </w:p>
+    <w:p>
+      <w:pPr>
+        <w:sectPr>
+          <w:pgSz w:w="23811" w:h="16838" w:orient="landscape"/>
+          <w:pgMar w:top="850" w:right="850" w:bottom="850" w:left="1134" w:header="708" w:footer="567" w:gutter="0"/>
+          <w:cols w:space="708"/>
+          <w:docGrid w:linePitch="360"/>
+        </w:sectPr>
+      </w:pPr>
+    </w:p>
+    <w:p>
+      <w:pPr>
         <w:pStyle w:val="1"/>
         <w:pageBreakBefore w:val="0"/>
       </w:pPr>
@@ -7179,7 +7708,7 @@
           <w:color w:val="000000"/>
           <w:sz w:val="24"/>
         </w:rPr>
-        <w:t>Дата: 25.10.2026. Среда: Windows 11 Pro, версия 10.0.26200; Python 3.12.14; Google Chrome 155.0.8059.85. Браузер управляется Playwright, приложение запущено на 127.0.0.1. Тестовые аккаунты и временные базы не содержат пользовательских данных.</w:t>
+        <w:t>Дата: 26.10.2026. Среда: Windows 11 Pro, версия 10.0.26200; Python 3.12.14 и дополнительный прогон Python 3.10; Google Chrome 155.0.8059.85. Браузер управляется Playwright, приложение запущено на 127.0.0.1. Тестовые аккаунты и временные базы не содержат пользовательских данных.</w:t>
       </w:r>
     </w:p>
     <w:p>
@@ -7219,7 +7748,7 @@
           <w:color w:val="000000"/>
           <w:sz w:val="24"/>
         </w:rPr>
-        <w:t>Результат: 16 тестов пройдены, ошибок и пропусков нет. Проверены 9 доменных и 7 API-сценариев. API-тесты поднимают отдельный сервер на свободном порту и используют временную SQLite.</w:t>
+        <w:t>Результат: 20 тестов пройдены, ошибок и пропусков нет. Проверены 9 доменных и 11 API-сценариев. API-тесты поднимают отдельный сервер на свободном порту и используют временную SQLite.</w:t>
       </w:r>
     </w:p>
     <w:p>
@@ -9094,7 +9623,23 @@
           <w:color w:val="000000"/>
           <w:sz w:val="24"/>
         </w:rPr>
-        <w:t>Нагрузочные условия NFR-02 и NFR-04 не воспроизводились; 24-часовое обновление реальных цен NFR-03 не проверялось. Проверка примера нормы — проверка арифметики, а не медицинской пригодности. Тестовый каталог не подтверждает качество рецептов и рыночную экономию. Полная матрица NFR-05 остаётся незавершённой до Firefox и Safari.</w:t>
+        <w:t>Новый поток: четыре шага, дашборд и план проверены на 360/768/1440 px, 18 сочетаний без горизонтальной прокрутки. Проверены возврат, черновик после перезагрузки, сводка, корзины и запрет расчёта без профиля. Результат: evidence/onboarding-results.json.</w:t>
+      </w:r>
+    </w:p>
+    <w:p>
+      <w:pPr>
+        <w:spacing w:line="288" w:lineRule="auto" w:after="40"/>
+        <w:ind w:firstLine="709"/>
+        <w:jc w:val="both"/>
+      </w:pPr>
+      <w:r>
+        <w:rPr>
+          <w:rFonts w:ascii="Times New Roman" w:hAnsi="Times New Roman"/>
+          <w:b w:val="0"/>
+          <w:color w:val="000000"/>
+          <w:sz w:val="24"/>
+        </w:rPr>
+        <w:t>Нагрузочные условия NFR-02 и NFR-04 не воспроизводились; 24-часовое обновление реальных цен NFR-03 не проверялось. Проверка примера нормы - проверка арифметики, а не медицинской пригодности. Тестовый каталог не подтверждает качество рецептов и рыночную экономию. Полная матрица NFR-05 остаётся незавершённой до Firefox и Safari.</w:t>
       </w:r>
     </w:p>
     <w:sectPr>

</xml_diff>

<commit_message>
feat: add plan results and priced meal replacements
</commit_message>
<xml_diff>
--- a/output/lab2/Fit_Nutrition_Supply_LR2.docx
+++ b/output/lab2/Fit_Nutrition_Supply_LR2.docx
@@ -2238,6 +2238,26 @@
         <w:jc w:val="both"/>
       </w:pPr>
       <w:r>
+        <w:t>В результате меню сгруппировано по дням; у блюда есть калории, оценка цены ингредиентов и кнопка замены. Отдельная корзина сравнивается с бюджетом, превышение выделяется красным. Кандидаты проверяются по калорийности одинаковой базовой порции: допустимо отклонение до 15%. Затем размер выбранной порции уточняется под энергетику приёма пищи.</w:t>
+      </w:r>
+    </w:p>
+    <w:p>
+      <w:pPr>
+        <w:spacing w:line="360" w:lineRule="auto"/>
+        <w:ind w:firstLine="709"/>
+        <w:jc w:val="both"/>
+      </w:pPr>
+      <w:r>
+        <w:t>Для каждого кандидата без записи в базу пересчитывается весь список и лучшая полная корзина. Разница цены показывается до выбора. «Выбрать» применяет замену, а «Сохранить план» фиксирует статус saved. При новой замене статус снова draft. Номер версии защищает от устаревшего окна выбора, конфликт возвращает 409. Полная логика: docs/lab2/replacement_logic.md; исходники: replacements.py и result.js.</w:t>
+      </w:r>
+    </w:p>
+    <w:p>
+      <w:pPr>
+        <w:spacing w:line="360" w:lineRule="auto"/>
+        <w:ind w:firstLine="709"/>
+        <w:jc w:val="both"/>
+      </w:pPr>
+      <w:r>
         <w:t>Каталог может не дать три допустимые альтернативы, требуемые FR-07: в таком случае прототип честно показывает доступное количество или отсутствие вариантов. Условие «не менее трёх» требует расширения каталога и не объявляется выполненным для любого ввода.</w:t>
       </w:r>
     </w:p>
@@ -3956,7 +3976,7 @@
                 <w:color w:val="000000"/>
                 <w:sz w:val="22"/>
               </w:rPr>
-              <w:t>GET /api/alternatives?item_id=…</w:t>
+              <w:t>POST /api/plan/save</w:t>
             </w:r>
           </w:p>
         </w:tc>
@@ -3976,7 +3996,7 @@
                 <w:color w:val="000000"/>
                 <w:sz w:val="22"/>
               </w:rPr>
-              <w:t>ID позиции своего плана</w:t>
+              <w:t>plan_id, expected_revision</w:t>
             </w:r>
           </w:p>
         </w:tc>
@@ -3996,7 +4016,7 @@
                 <w:color w:val="000000"/>
                 <w:sz w:val="22"/>
               </w:rPr>
-              <w:t>Массив допустимых рецептов</w:t>
+              <w:t>Статус saved и дата; 409 при устаревшей версии</w:t>
             </w:r>
           </w:p>
         </w:tc>
@@ -4021,6 +4041,71 @@
                 <w:color w:val="000000"/>
                 <w:sz w:val="22"/>
               </w:rPr>
+              <w:t>GET /api/alternatives?item_id=…</w:t>
+            </w:r>
+          </w:p>
+        </w:tc>
+        <w:tc>
+          <w:tcPr>
+            <w:tcW w:type="dxa" w:w="3458"/>
+          </w:tcPr>
+          <w:p>
+            <w:pPr>
+              <w:spacing w:line="252" w:lineRule="auto" w:after="60" w:before="60"/>
+              <w:ind w:firstLine="0"/>
+            </w:pPr>
+            <w:r>
+              <w:rPr>
+                <w:rFonts w:ascii="Times New Roman" w:hAnsi="Times New Roman"/>
+                <w:b w:val="0"/>
+                <w:color w:val="000000"/>
+                <w:sz w:val="22"/>
+              </w:rPr>
+              <w:t>ID позиции своего плана</w:t>
+            </w:r>
+          </w:p>
+        </w:tc>
+        <w:tc>
+          <w:tcPr>
+            <w:tcW w:type="dxa" w:w="3515"/>
+          </w:tcPr>
+          <w:p>
+            <w:pPr>
+              <w:spacing w:line="252" w:lineRule="auto" w:after="60" w:before="60"/>
+              <w:ind w:firstLine="0"/>
+            </w:pPr>
+            <w:r>
+              <w:rPr>
+                <w:rFonts w:ascii="Times New Roman" w:hAnsi="Times New Roman"/>
+                <w:b w:val="0"/>
+                <w:color w:val="000000"/>
+                <w:sz w:val="22"/>
+              </w:rPr>
+              <w:t>Массив допустимых рецептов</w:t>
+            </w:r>
+          </w:p>
+        </w:tc>
+      </w:tr>
+      <w:tr>
+        <w:trPr>
+          <w:cantSplit/>
+        </w:trPr>
+        <w:tc>
+          <w:tcPr>
+            <w:tcW w:type="dxa" w:w="2381"/>
+          </w:tcPr>
+          <w:p>
+            <w:pPr>
+              <w:spacing w:line="252" w:lineRule="auto" w:after="60" w:before="60"/>
+              <w:ind w:firstLine="0"/>
+            </w:pPr>
+            <w:r>
+              <w:rPr>
+                <w:rFonts w:ascii="Times New Roman" w:hAnsi="Times New Roman"/>
+                <w:b w:val="0"/>
+                <w:color w:val="000000"/>
+                <w:sz w:val="22"/>
+              </w:rPr>
               <w:t>POST /api/replace</w:t>
             </w:r>
           </w:p>
@@ -4041,7 +4126,7 @@
                 <w:color w:val="000000"/>
                 <w:sz w:val="22"/>
               </w:rPr>
-              <w:t>item_id, recipe_id</w:t>
+              <w:t>item_id, recipe_id, expected_revision</w:t>
             </w:r>
           </w:p>
         </w:tc>
@@ -4061,7 +4146,7 @@
                 <w:color w:val="000000"/>
                 <w:sz w:val="22"/>
               </w:rPr>
-              <w:t>Изменение одной позиции и пересчитанный снимок</w:t>
+              <w:t>Замена одной позиции, корзина и новая версия; 409 при конфликте</w:t>
             </w:r>
           </w:p>
         </w:tc>
@@ -6763,6 +6848,16 @@
       </w:pPr>
       <w:r>
         <w:t>8 Работа с ИИ агентом</w:t>
+      </w:r>
+    </w:p>
+    <w:p>
+      <w:pPr>
+        <w:spacing w:line="360" w:lineRule="auto"/>
+        <w:ind w:firstLine="709"/>
+        <w:jc w:val="both"/>
+      </w:pPr>
+      <w:r>
+        <w:t>Следующая явная задача пользователя: «Реализуй экран результата после нажатия кнопки "Составить меню"». В постановке заданы дни, калории, цены, бюджет, сохранение и замены с влиянием на всю корзину. Агент реализовал экран, общий фильтр и предварительный пересчёт, затем проверил равенство прогноза и итоговой суммы. Activity-схема обновлена по фактическому процессу. Это отдельная реальная итерация разработки после онбординга.</w:t>
       </w:r>
     </w:p>
     <w:p>
@@ -7229,7 +7324,7 @@
       <w:r>
         <w:drawing>
           <wp:inline xmlns:a="http://schemas.openxmlformats.org/drawingml/2006/main" xmlns:pic="http://schemas.openxmlformats.org/drawingml/2006/picture">
-            <wp:extent cx="5288239" cy="8532630"/>
+            <wp:extent cx="8139372" cy="12960483"/>
             <wp:docPr id="4" name="Picture 4"/>
             <wp:cNvGraphicFramePr>
               <a:graphicFrameLocks noChangeAspect="1"/>
@@ -7250,7 +7345,7 @@
                   <pic:spPr>
                     <a:xfrm>
                       <a:off x="0" y="0"/>
-                      <a:ext cx="5288239" cy="8532630"/>
+                      <a:ext cx="8139372" cy="12960483"/>
                     </a:xfrm>
                     <a:prstGeom prst="rect"/>
                   </pic:spPr>
@@ -7279,7 +7374,7 @@
     <w:p>
       <w:pPr>
         <w:sectPr>
-          <w:pgSz w:w="11906" w:h="16838"/>
+          <w:pgSz w:w="16838" w:h="23811"/>
           <w:pgMar w:top="850" w:right="850" w:bottom="850" w:left="1134" w:header="708" w:footer="567" w:gutter="0"/>
           <w:cols w:space="708"/>
           <w:docGrid w:linePitch="360"/>
@@ -7469,7 +7564,7 @@
       <w:r>
         <w:drawing>
           <wp:inline xmlns:a="http://schemas.openxmlformats.org/drawingml/2006/main" xmlns:pic="http://schemas.openxmlformats.org/drawingml/2006/picture">
-            <wp:extent cx="10288157" cy="8532629"/>
+            <wp:extent cx="9879546" cy="8532629"/>
             <wp:docPr id="7" name="Picture 7"/>
             <wp:cNvGraphicFramePr>
               <a:graphicFrameLocks noChangeAspect="1"/>
@@ -7490,7 +7585,7 @@
                   <pic:spPr>
                     <a:xfrm>
                       <a:off x="0" y="0"/>
-                      <a:ext cx="10288157" cy="8532629"/>
+                      <a:ext cx="9879546" cy="8532629"/>
                     </a:xfrm>
                     <a:prstGeom prst="rect"/>
                   </pic:spPr>
@@ -7748,7 +7843,7 @@
           <w:color w:val="000000"/>
           <w:sz w:val="24"/>
         </w:rPr>
-        <w:t>Результат: 20 тестов пройдены, ошибок и пропусков нет. Проверены 9 доменных и 11 API-сценариев. API-тесты поднимают отдельный сервер на свободном порту и используют временную SQLite.</w:t>
+        <w:t>Результат: 24 теста пройдены, ошибок и пропусков нет. Проверены 9 доменных и 15 API-сценариев. API-тесты поднимают отдельный сервер на свободном порту и используют временную SQLite.</w:t>
       </w:r>
     </w:p>
     <w:p>
@@ -9623,6 +9718,22 @@
           <w:color w:val="000000"/>
           <w:sz w:val="24"/>
         </w:rPr>
+        <w:t>Сценарий result.cjs подтвердил совпадение прогноза цены с итогом, отмену, бюджет и сохранение. Замена не перезагружает документ. Экран: 360/768/1920 px; окно: 360/1440 px. Протокол: evidence/result-results.json.</w:t>
+      </w:r>
+    </w:p>
+    <w:p>
+      <w:pPr>
+        <w:spacing w:line="288" w:lineRule="auto" w:after="40"/>
+        <w:ind w:firstLine="709"/>
+        <w:jc w:val="both"/>
+      </w:pPr>
+      <w:r>
+        <w:rPr>
+          <w:rFonts w:ascii="Times New Roman" w:hAnsi="Times New Roman"/>
+          <w:b w:val="0"/>
+          <w:color w:val="000000"/>
+          <w:sz w:val="24"/>
+        </w:rPr>
         <w:t>Новый поток: четыре шага, дашборд и план проверены на 360/768/1440 px, 18 сочетаний без горизонтальной прокрутки. Проверены возврат, черновик после перезагрузки, сводка, корзины и запрет расчёта без профиля. Результат: evidence/onboarding-results.json.</w:t>
       </w:r>
     </w:p>
@@ -9639,7 +9750,7 @@
           <w:color w:val="000000"/>
           <w:sz w:val="24"/>
         </w:rPr>
-        <w:t>Нагрузочные условия NFR-02 и NFR-04 не воспроизводились; 24-часовое обновление реальных цен NFR-03 не проверялось. Проверка примера нормы - проверка арифметики, а не медицинской пригодности. Тестовый каталог не подтверждает качество рецептов и рыночную экономию. Полная матрица NFR-05 остаётся незавершённой до Firefox и Safari.</w:t>
+        <w:t>Нагрузочные условия NFR-02/04 и реальные обновления NFR-03 не проверялись. Каталог учебный; проверка арифметики не подтверждает медицинскую пригодность или рыночную экономию. Firefox и Safari не проверены.</w:t>
       </w:r>
     </w:p>
     <w:sectPr>

</xml_diff>

<commit_message>
docs: finish report pagination
</commit_message>
<xml_diff>
--- a/output/lab2/Fit_Nutrition_Supply_LR2.docx
+++ b/output/lab2/Fit_Nutrition_Supply_LR2.docx
@@ -9718,7 +9718,7 @@
           <w:color w:val="000000"/>
           <w:sz w:val="24"/>
         </w:rPr>
-        <w:t>Сценарий result.cjs подтвердил совпадение прогноза цены с итогом, отмену, бюджет и сохранение. Замена не перезагружает документ. Экран: 360/768/1920 px; окно: 360/1440 px. Протокол: evidence/result-results.json.</w:t>
+        <w:t>Result.cjs: прогноз цены, отмена, бюджет, сохранение и замена без перезагрузки проверены на 360/768/1920 px. Онбординг: 18 сочетаний без переполнения, возврат и восстановление черновика. Протоколы: evidence/result-results.json и evidence/onboarding-results.json.</w:t>
       </w:r>
     </w:p>
     <w:p>
@@ -9734,23 +9734,7 @@
           <w:color w:val="000000"/>
           <w:sz w:val="24"/>
         </w:rPr>
-        <w:t>Новый поток: четыре шага, дашборд и план проверены на 360/768/1440 px, 18 сочетаний без горизонтальной прокрутки. Проверены возврат, черновик после перезагрузки, сводка, корзины и запрет расчёта без профиля. Результат: evidence/onboarding-results.json.</w:t>
-      </w:r>
-    </w:p>
-    <w:p>
-      <w:pPr>
-        <w:spacing w:line="288" w:lineRule="auto" w:after="40"/>
-        <w:ind w:firstLine="709"/>
-        <w:jc w:val="both"/>
-      </w:pPr>
-      <w:r>
-        <w:rPr>
-          <w:rFonts w:ascii="Times New Roman" w:hAnsi="Times New Roman"/>
-          <w:b w:val="0"/>
-          <w:color w:val="000000"/>
-          <w:sz w:val="24"/>
-        </w:rPr>
-        <w:t>Нагрузочные условия NFR-02/04 и реальные обновления NFR-03 не проверялись. Каталог учебный; проверка арифметики не подтверждает медицинскую пригодность или рыночную экономию. Firefox и Safari не проверены.</w:t>
+        <w:t>NFR-02/04, реальные обновления NFR-03, Firefox и Safari не проверены. Каталог учебный, результаты не подтверждают рыночную экономию или медицинскую пригодность.</w:t>
       </w:r>
     </w:p>
     <w:sectPr>

</xml_diff>

<commit_message>
docs: complete lab2 ER models API contracts and ADRs
</commit_message>
<xml_diff>
--- a/output/lab2/Fit_Nutrition_Supply_LR2.docx
+++ b/output/lab2/Fit_Nutrition_Supply_LR2.docx
@@ -1263,7 +1263,7 @@
         </w:rPr>
         <w:t>3 Сценарии использования и интерфейс</w:t>
         <w:tab/>
-        <w:t>7</w:t>
+        <w:t>6</w:t>
       </w:r>
     </w:p>
     <w:p>
@@ -1301,7 +1301,7 @@
         </w:rPr>
         <w:t>5 Программные интерфейсы</w:t>
         <w:tab/>
-        <w:t>12</w:t>
+        <w:t>13</w:t>
       </w:r>
     </w:p>
     <w:p>
@@ -1320,7 +1320,7 @@
         </w:rPr>
         <w:t>6 Архитектурные решения</w:t>
         <w:tab/>
-        <w:t>14</w:t>
+        <w:t>19</w:t>
       </w:r>
     </w:p>
     <w:p>
@@ -1339,7 +1339,7 @@
         </w:rPr>
         <w:t>7 Проверка прототипа и покрытие требований</w:t>
         <w:tab/>
-        <w:t>20</w:t>
+        <w:t>29</w:t>
       </w:r>
     </w:p>
     <w:p>
@@ -1358,7 +1358,7 @@
         </w:rPr>
         <w:t>8 Работа с ИИ агентом</w:t>
         <w:tab/>
-        <w:t>22</w:t>
+        <w:t>31</w:t>
       </w:r>
     </w:p>
     <w:p>
@@ -1377,7 +1377,7 @@
         </w:rPr>
         <w:t>Заключение</w:t>
         <w:tab/>
-        <w:t>24</w:t>
+        <w:t>33</w:t>
       </w:r>
     </w:p>
     <w:p>
@@ -1396,7 +1396,7 @@
         </w:rPr>
         <w:t>Источники</w:t>
         <w:tab/>
-        <w:t>25</w:t>
+        <w:t>34</w:t>
       </w:r>
     </w:p>
     <w:p>
@@ -1415,7 +1415,7 @@
         </w:rPr>
         <w:t>Приложение А Схемы</w:t>
         <w:tab/>
-        <w:t>26</w:t>
+        <w:t>35</w:t>
       </w:r>
     </w:p>
     <w:p>
@@ -1434,7 +1434,7 @@
         </w:rPr>
         <w:t>Приложение Б Протокол проверки</w:t>
         <w:tab/>
-        <w:t>35</w:t>
+        <w:t>47</w:t>
       </w:r>
     </w:p>
     <w:p>
@@ -2103,7 +2103,7 @@
         <w:jc w:val="both"/>
       </w:pPr>
       <w:r>
-        <w:t>Подсистемы выделены по ответственности. Авторизация и SQL пока находятся в server.py; вычисления и источник цен вынесены отдельно. Это модульный прототип, а не набор независимых сетевых сервисов.</w:t>
+        <w:t>Авторизация и SQL находятся в server.py; вычисления и источник цен вынесены в отдельные модули одного процесса.</w:t>
       </w:r>
     </w:p>
     <w:p>
@@ -2113,7 +2113,7 @@
         <w:jc w:val="both"/>
       </w:pPr>
       <w:r>
-        <w:t>Стек: Python 3.12, http.server, sqlite3, SQLite, bcrypt 5.0.0, HTML5, CSS3, JavaScript ES2020, HTTP/JSON. Проверки: unittest и Playwright. Документация: Graphviz, draw.io, python-docx и LibreOffice; эти инструменты не нужны для запуска приложения.</w:t>
+        <w:t>Стек: Python 3.10+, http.server, sqlite3, SQLite, bcrypt 5.0.0, HTML5, CSS3, JavaScript ES2020, HTTP/JSON. Документы строятся через Graphviz, draw.io, python-docx и LibreOffice.</w:t>
       </w:r>
     </w:p>
     <w:p>
@@ -2123,7 +2123,7 @@
         <w:jc w:val="both"/>
       </w:pPr>
       <w:r>
-        <w:t>В прототипе HTTP-сервер слушает только 127.0.0.1. Это локальная демонстрация. Публикация в интернете потребует сервера приложений и HTTPS; NFR-01 в части HTTPS пока не выполнено.</w:t>
+        <w:t>HTTP-сервер слушает 127.0.0.1. Для публикации нужны сервер приложений и HTTPS; эта часть NFR-01 пока не выполнена.</w:t>
       </w:r>
     </w:p>
     <w:p>
@@ -2427,11 +2427,79 @@
     </w:p>
     <w:p>
       <w:pPr>
+        <w:pStyle w:val="2"/>
+      </w:pPr>
+      <w:r>
+        <w:t>3.7 Дополнительные диаграммы активности</w:t>
+      </w:r>
+    </w:p>
+    <w:p>
+      <w:pPr>
+        <w:spacing w:line="360" w:lineRule="auto"/>
+        <w:ind w:firstLine="709"/>
+        <w:jc w:val="both"/>
+      </w:pPr>
+      <w:r>
+        <w:t>Регистрация и заполнение профиля показаны отдельно от настройки периода. После успешной регистрации сервер создаёт пользователя и незавершённый профиль. Интерфейс последовательно показывает три шага и сводку. Переход назад не удаляет ввод; черновик хранится в localStorage в пределах аккаунта. Ошибка проверки оставляет пользователя в форме. Только успешный PUT /api/profile открывает дашборд.</w:t>
+      </w:r>
+    </w:p>
+    <w:p>
+      <w:pPr>
+        <w:spacing w:line="276" w:lineRule="auto" w:after="100"/>
+        <w:ind w:firstLine="709"/>
+        <w:jc w:val="both"/>
+      </w:pPr>
+      <w:r>
+        <w:rPr>
+          <w:rFonts w:ascii="Times New Roman" w:hAnsi="Times New Roman"/>
+          <w:b w:val="0"/>
+          <w:color w:val="000000"/>
+          <w:sz w:val="24"/>
+        </w:rPr>
+        <w:t>См. рисунок 11 - Регистрация и заполнение профиля (приложение А).</w:t>
+      </w:r>
+    </w:p>
+    <w:p>
+      <w:pPr>
+        <w:spacing w:line="360" w:lineRule="auto"/>
+        <w:ind w:firstLine="709"/>
+        <w:jc w:val="both"/>
+      </w:pPr>
+      <w:r>
+        <w:t>При генерации API сначала проверяет сессию и завершённый профиль, затем объединяет его с разрешёнными параметрами периода. Аллергии из профиля нельзя снять полями запроса. После полного подбора сервер одной транзакцией создаёт план и позиции, затем формирует снимок со списком и корзинами. Недостаток рецептов не разрушает прежний план. План может превышать бюджет: это состояние результата, а не ошибка записи.</w:t>
+      </w:r>
+    </w:p>
+    <w:p>
+      <w:pPr>
+        <w:spacing w:line="276" w:lineRule="auto" w:after="100"/>
+        <w:ind w:firstLine="709"/>
+        <w:jc w:val="both"/>
+      </w:pPr>
+      <w:r>
+        <w:rPr>
+          <w:rFonts w:ascii="Times New Roman" w:hAnsi="Times New Roman"/>
+          <w:b w:val="0"/>
+          <w:color w:val="000000"/>
+          <w:sz w:val="24"/>
+        </w:rPr>
+        <w:t>См. рисунок 12 - Генерация меню (приложение А).</w:t>
+      </w:r>
+    </w:p>
+    <w:p>
+      <w:pPr>
         <w:pStyle w:val="1"/>
         <w:pageBreakBefore/>
       </w:pPr>
       <w:r>
         <w:t>4 Модель данных</w:t>
+      </w:r>
+    </w:p>
+    <w:p>
+      <w:pPr>
+        <w:pStyle w:val="2"/>
+      </w:pPr>
+      <w:r>
+        <w:t>4.1 Физическая схема SQLite</w:t>
       </w:r>
     </w:p>
     <w:p>
@@ -3298,19 +3366,10 @@
     </w:p>
     <w:p>
       <w:pPr>
-        <w:pStyle w:val="1"/>
-        <w:pageBreakBefore/>
-      </w:pPr>
-      <w:r>
-        <w:t>5 Программные интерфейсы</w:t>
-      </w:r>
-    </w:p>
-    <w:p>
-      <w:pPr>
         <w:pStyle w:val="2"/>
       </w:pPr>
       <w:r>
-        <w:t>5.1 Общие правила</w:t>
+        <w:t>4.2 Предметные сущности и связи</w:t>
       </w:r>
     </w:p>
     <w:p>
@@ -3320,25 +3379,7 @@
         <w:jc w:val="both"/>
       </w:pPr>
       <w:r>
-        <w:t>API доступен по пути /api. Формат запросов и ответов - application/json, UTF-8. После входа браузер получает HttpOnly cookie session с SameSite=Strict. На сервере хранится SHA-256 токена, а не сам токен. Наличие авторизации проверяется до чтения пользовательского плана; чужая позиция не возвращается и не заменяется.</w:t>
-      </w:r>
-    </w:p>
-    <w:p>
-      <w:pPr>
-        <w:spacing w:line="360" w:lineRule="auto"/>
-        <w:ind w:firstLine="709"/>
-        <w:jc w:val="both"/>
-      </w:pPr>
-      <w:r>
-        <w:t>Коды ответов: 200 - успешное чтение или изменение; 201 - создан план; 401 - нет сессии или неверные данные входа; 403 - недопустимый Origin; 404 - ресурс не найден; 422 - ошибка полей или невыполнимые ограничения; 429 - превышен лимит попыток входа; 503 - отказ источника цен. Ответ об ошибке имеет поле error, а при ошибке ввода - fields. Тела запросов ограничены 64 КиБ. Пароли и тела запросов не записываются в журнал.</w:t>
-      </w:r>
-    </w:p>
-    <w:p>
-      <w:pPr>
-        <w:pStyle w:val="2"/>
-      </w:pPr>
-      <w:r>
-        <w:t>5.2 HTTP контракты</w:t>
+        <w:t>Предметная ER-модель содержит шесть требуемых сущностей. Их имена сопоставлены с существующими таблицами, чтобы логическая схема не создавала впечатления, что в базе есть новые таблицы User, Meal или Dish.</w:t>
       </w:r>
     </w:p>
     <w:p>
@@ -3389,7 +3430,7 @@
                 <w:color w:val="000000"/>
                 <w:sz w:val="22"/>
               </w:rPr>
-              <w:t>Метод и маршрут</w:t>
+              <w:t>Предметная сущность</w:t>
             </w:r>
           </w:p>
         </w:tc>
@@ -3410,7 +3451,7 @@
                 <w:color w:val="000000"/>
                 <w:sz w:val="22"/>
               </w:rPr>
-              <w:t>Вход</w:t>
+              <w:t>Таблица SQLite</w:t>
             </w:r>
           </w:p>
         </w:tc>
@@ -3431,7 +3472,7 @@
                 <w:color w:val="000000"/>
                 <w:sz w:val="22"/>
               </w:rPr>
-              <w:t>Результат</w:t>
+              <w:t>Основные атрибуты</w:t>
             </w:r>
           </w:p>
         </w:tc>
@@ -3456,7 +3497,7 @@
                 <w:color w:val="000000"/>
                 <w:sz w:val="22"/>
               </w:rPr>
-              <w:t>GET /api/session</w:t>
+              <w:t>Пользователь User</w:t>
             </w:r>
           </w:p>
         </w:tc>
@@ -3476,7 +3517,7 @@
                 <w:color w:val="000000"/>
                 <w:sz w:val="22"/>
               </w:rPr>
-              <w:t>Cookie, если есть</w:t>
+              <w:t>users</w:t>
             </w:r>
           </w:p>
         </w:tc>
@@ -3496,7 +3537,7 @@
                 <w:color w:val="000000"/>
                 <w:sz w:val="22"/>
               </w:rPr>
-              <w:t>authenticated и email</w:t>
+              <w:t>id TEXT PK; email TEXT UNIQUE; password_hash TEXT; created_at TEXT</w:t>
             </w:r>
           </w:p>
         </w:tc>
@@ -3521,7 +3562,7 @@
                 <w:color w:val="000000"/>
                 <w:sz w:val="22"/>
               </w:rPr>
-              <w:t>POST /api/auth/register</w:t>
+              <w:t>Профиль Profile</w:t>
             </w:r>
           </w:p>
         </w:tc>
@@ -3541,7 +3582,7 @@
                 <w:color w:val="000000"/>
                 <w:sz w:val="22"/>
               </w:rPr>
-              <w:t>email, password</w:t>
+              <w:t>profiles</w:t>
             </w:r>
           </w:p>
         </w:tc>
@@ -3561,7 +3602,7 @@
                 <w:color w:val="000000"/>
                 <w:sz w:val="22"/>
               </w:rPr>
-              <w:t>Создание учётной записи, cookie; 422 при занятом email</w:t>
+              <w:t>user_id TEXT PK и FK; settings_json TEXT: имя, пол, возраст, вес, рост, активность, цель, ограничения, бюджет, completed</w:t>
             </w:r>
           </w:p>
         </w:tc>
@@ -3586,7 +3627,7 @@
                 <w:color w:val="000000"/>
                 <w:sz w:val="22"/>
               </w:rPr>
-              <w:t>POST /api/auth/login</w:t>
+              <w:t>План Plan</w:t>
             </w:r>
           </w:p>
         </w:tc>
@@ -3606,7 +3647,7 @@
                 <w:color w:val="000000"/>
                 <w:sz w:val="22"/>
               </w:rPr>
-              <w:t>email, password</w:t>
+              <w:t>plans</w:t>
             </w:r>
           </w:p>
         </w:tc>
@@ -3626,7 +3667,7 @@
                 <w:color w:val="000000"/>
                 <w:sz w:val="22"/>
               </w:rPr>
-              <w:t>Cookie; 401 при неверном пароле, 429 после пяти ошибок</w:t>
+              <w:t>id TEXT PK; user_id TEXT FK; start_date TEXT; days INTEGER; settings_json TEXT; created_at TEXT; status TEXT; revision INTEGER; saved_at TEXT nullable</w:t>
             </w:r>
           </w:p>
         </w:tc>
@@ -3651,7 +3692,7 @@
                 <w:color w:val="000000"/>
                 <w:sz w:val="22"/>
               </w:rPr>
-              <w:t>POST /api/auth/demo</w:t>
+              <w:t>Приём пищи Meal</w:t>
             </w:r>
           </w:p>
         </w:tc>
@@ -3671,7 +3712,7 @@
                 <w:color w:val="000000"/>
                 <w:sz w:val="22"/>
               </w:rPr>
-              <w:t>Пустой объект</w:t>
+              <w:t>plan_items</w:t>
             </w:r>
           </w:p>
         </w:tc>
@@ -3691,7 +3732,7 @@
                 <w:color w:val="000000"/>
                 <w:sz w:val="22"/>
               </w:rPr>
-              <w:t>Отдельная демонстрационная учётная запись без пароля</w:t>
+              <w:t>id TEXT PK; plan_id TEXT FK; day INTEGER; slot INTEGER; recipe_id TEXT FK; scale REAL</w:t>
             </w:r>
           </w:p>
         </w:tc>
@@ -3716,7 +3757,7 @@
                 <w:color w:val="000000"/>
                 <w:sz w:val="22"/>
               </w:rPr>
-              <w:t>POST /api/auth/logout</w:t>
+              <w:t>Блюдо Dish</w:t>
             </w:r>
           </w:p>
         </w:tc>
@@ -3736,7 +3777,7 @@
                 <w:color w:val="000000"/>
                 <w:sz w:val="22"/>
               </w:rPr>
-              <w:t>Пустой объект</w:t>
+              <w:t>recipes</w:t>
             </w:r>
           </w:p>
         </w:tc>
@@ -3756,7 +3797,7 @@
                 <w:color w:val="000000"/>
                 <w:sz w:val="22"/>
               </w:rPr>
-              <w:t>Удаление сессии и cookie</w:t>
+              <w:t>id TEXT PK; name TEXT; meal TEXT; minutes INTEGER; ingredients_json TEXT; steps_json TEXT</w:t>
             </w:r>
           </w:p>
         </w:tc>
@@ -3781,7 +3822,7 @@
                 <w:color w:val="000000"/>
                 <w:sz w:val="22"/>
               </w:rPr>
-              <w:t>GET /api/state</w:t>
+              <w:t>Ингредиент Ingredient</w:t>
             </w:r>
           </w:p>
         </w:tc>
@@ -3801,7 +3842,7 @@
                 <w:color w:val="000000"/>
                 <w:sz w:val="22"/>
               </w:rPr>
-              <w:t>Сессия</w:t>
+              <w:t>ingredients</w:t>
             </w:r>
           </w:p>
         </w:tc>
@@ -3821,7 +3862,219 @@
                 <w:color w:val="000000"/>
                 <w:sz w:val="22"/>
               </w:rPr>
-              <w:t>Профиль, каталог, текущий план, список и корзины</w:t>
+              <w:t>id TEXT PK; name TEXT; category TEXT; unit TEXT; kcal, protein, fat, carbs REAL; allergens_json TEXT</w:t>
+            </w:r>
+          </w:p>
+        </w:tc>
+      </w:tr>
+    </w:tbl>
+    <w:p>
+      <w:pPr>
+        <w:spacing w:after="60"/>
+      </w:pPr>
+    </w:p>
+    <w:p>
+      <w:pPr>
+        <w:spacing w:line="276" w:lineRule="auto" w:after="100"/>
+        <w:ind w:firstLine="709"/>
+        <w:jc w:val="both"/>
+      </w:pPr>
+      <w:r>
+        <w:rPr>
+          <w:rFonts w:ascii="Times New Roman" w:hAnsi="Times New Roman"/>
+          <w:b w:val="0"/>
+          <w:color w:val="000000"/>
+          <w:sz w:val="24"/>
+        </w:rPr>
+        <w:t>См. рисунок 10 - Предметная ER-модель и соответствие SQLite (приложение А).</w:t>
+      </w:r>
+    </w:p>
+    <w:p>
+      <w:pPr>
+        <w:spacing w:line="360" w:lineRule="auto"/>
+        <w:ind w:firstLine="709"/>
+        <w:jc w:val="both"/>
+      </w:pPr>
+      <w:r>
+        <w:t>User связан с Profile как 1 к 0..1 по ограничениям БД. Регистрация сразу создаёт Profile с completed=false, поэтому прикладной поток имеет отношение 1:1, хотя SQL допускает отсутствие профиля.</w:t>
+      </w:r>
+    </w:p>
+    <w:p>
+      <w:pPr>
+        <w:spacing w:line="360" w:lineRule="auto"/>
+        <w:ind w:firstLine="709"/>
+        <w:jc w:val="both"/>
+      </w:pPr>
+      <w:r>
+        <w:t>Связи User с Plan, Plan с Meal и Dish с Meal имеют тип 1:N. Каждый приём принадлежит одному плану и содержит одно блюдо. Нижняя граница на физической схеме равна 0: SQL не требует дочерних строк. Генератор создаёт days × meals позиций одной транзакцией. Индексы day и slot начинаются с нуля; UNIQUE(plan_id, day, slot) запрещает дублирование позиции.</w:t>
+      </w:r>
+    </w:p>
+    <w:p>
+      <w:pPr>
+        <w:spacing w:line="360" w:lineRule="auto"/>
+        <w:ind w:firstLine="709"/>
+        <w:jc w:val="both"/>
+      </w:pPr>
+      <w:r>
+        <w:t>Plan и Dish связаны как M:N через Meal: разные блюда встречаются в разных планах. Таблица plan_items хранит эту связь, день, номер приёма и коэффициент порции; отдельная PlanDish не нужна.</w:t>
+      </w:r>
+    </w:p>
+    <w:p>
+      <w:pPr>
+        <w:spacing w:line="360" w:lineRule="auto"/>
+        <w:ind w:firstLine="709"/>
+        <w:jc w:val="both"/>
+      </w:pPr>
+      <w:r>
+        <w:t>Dish и Ingredient связаны как M:N. Количества на базовую порцию записаны в recipes.ingredients_json, например {"oats": 60, "milk": 180}. Пунктир на схеме обозначает логические ссылки без SQL FK. Для нормализации предложена будущая таблица DishIngredient / recipe_ingredients с PK (recipe_id, ingredient_id), двумя FK и amount. Сейчас её в базе нет.</w:t>
+      </w:r>
+    </w:p>
+    <w:p>
+      <w:pPr>
+        <w:spacing w:line="360" w:lineRule="auto"/>
+        <w:ind w:firstLine="709"/>
+        <w:jc w:val="both"/>
+      </w:pPr>
+      <w:r>
+        <w:t>recipes.meal задаёт тип breakfast/lunch/dinner/snack, а Meal обозначает позицию плана. Калории вычисляются из состава и scale; корзина вычисляется из списка, запасов и предложений. Готовые суммы отдельными столбцами не хранятся. Остальные таблицы показаны на физической схеме, рисунок 7.</w:t>
+      </w:r>
+    </w:p>
+    <w:p>
+      <w:pPr>
+        <w:pStyle w:val="1"/>
+        <w:pageBreakBefore/>
+      </w:pPr>
+      <w:r>
+        <w:t>5 Программные интерфейсы</w:t>
+      </w:r>
+    </w:p>
+    <w:p>
+      <w:pPr>
+        <w:pStyle w:val="2"/>
+      </w:pPr>
+      <w:r>
+        <w:t>5.1 Общие правила</w:t>
+      </w:r>
+    </w:p>
+    <w:p>
+      <w:pPr>
+        <w:spacing w:line="360" w:lineRule="auto"/>
+        <w:ind w:firstLine="709"/>
+        <w:jc w:val="both"/>
+      </w:pPr>
+      <w:r>
+        <w:t>API доступен по пути /api. Формат запросов и ответов - application/json, UTF-8. После входа браузер получает HttpOnly cookie session с SameSite=Strict. На сервере хранится SHA-256 токена, а не сам токен. Наличие авторизации проверяется до чтения пользовательского плана; чужая позиция не возвращается и не заменяется.</w:t>
+      </w:r>
+    </w:p>
+    <w:p>
+      <w:pPr>
+        <w:spacing w:line="360" w:lineRule="auto"/>
+        <w:ind w:firstLine="709"/>
+        <w:jc w:val="both"/>
+      </w:pPr>
+      <w:r>
+        <w:t>Конфликт версии плана возвращает 409 с code: PLAN_CHANGED. Коды ответов: 200 - успешное чтение или изменение; 201 - создан план; 401 - нет сессии или неверные данные входа; 403 - недопустимый Origin; 404 - ресурс не найден; 422 - ошибка полей или невыполнимые ограничения; 429 - превышен лимит попыток входа; 503 - отказ источника цен. Ответ об ошибке имеет поле error, а при ошибке ввода - fields. Тела запросов ограничены 64 КиБ. Пароли и тела запросов не записываются в журнал.</w:t>
+      </w:r>
+    </w:p>
+    <w:p>
+      <w:pPr>
+        <w:pStyle w:val="2"/>
+      </w:pPr>
+      <w:r>
+        <w:t>5.2 HTTP контракты</w:t>
+      </w:r>
+    </w:p>
+    <w:p>
+      <w:pPr>
+        <w:keepNext/>
+      </w:pPr>
+      <w:r>
+        <w:rPr>
+          <w:rFonts w:ascii="Times New Roman" w:hAnsi="Times New Roman"/>
+          <w:b w:val="0"/>
+          <w:color w:val="000000"/>
+          <w:sz w:val="24"/>
+        </w:rPr>
+        <w:t>Таблица 4</w:t>
+      </w:r>
+    </w:p>
+    <w:tbl>
+      <w:tblPr>
+        <w:tblStyle w:val="ae"/>
+        <w:tblW w:type="auto" w:w="0"/>
+        <w:tblLayout w:type="fixed"/>
+        <w:tblLook w:firstColumn="1" w:firstRow="1" w:lastColumn="0" w:lastRow="0" w:noHBand="0" w:noVBand="1" w:val="04A0"/>
+      </w:tblPr>
+      <w:tblGrid>
+        <w:gridCol w:w="2381"/>
+        <w:gridCol w:w="3458"/>
+        <w:gridCol w:w="3515"/>
+      </w:tblGrid>
+      <w:tr>
+        <w:trPr>
+          <w:cantSplit/>
+          <w:tblHeader/>
+        </w:trPr>
+        <w:tc>
+          <w:tcPr>
+            <w:tcW w:type="dxa" w:w="2381"/>
+          </w:tcPr>
+          <w:p>
+            <w:pPr>
+              <w:spacing w:line="252" w:lineRule="auto" w:after="60" w:before="60"/>
+              <w:ind w:firstLine="0"/>
+              <w:jc w:val="center"/>
+            </w:pPr>
+            <w:r>
+              <w:rPr>
+                <w:rFonts w:ascii="Times New Roman" w:hAnsi="Times New Roman"/>
+                <w:b/>
+                <w:color w:val="000000"/>
+                <w:sz w:val="22"/>
+              </w:rPr>
+              <w:t>Метод и маршрут</w:t>
+            </w:r>
+          </w:p>
+        </w:tc>
+        <w:tc>
+          <w:tcPr>
+            <w:tcW w:type="dxa" w:w="3458"/>
+          </w:tcPr>
+          <w:p>
+            <w:pPr>
+              <w:spacing w:line="252" w:lineRule="auto" w:after="60" w:before="60"/>
+              <w:ind w:firstLine="0"/>
+              <w:jc w:val="center"/>
+            </w:pPr>
+            <w:r>
+              <w:rPr>
+                <w:rFonts w:ascii="Times New Roman" w:hAnsi="Times New Roman"/>
+                <w:b/>
+                <w:color w:val="000000"/>
+                <w:sz w:val="22"/>
+              </w:rPr>
+              <w:t>Вход</w:t>
+            </w:r>
+          </w:p>
+        </w:tc>
+        <w:tc>
+          <w:tcPr>
+            <w:tcW w:type="dxa" w:w="3515"/>
+          </w:tcPr>
+          <w:p>
+            <w:pPr>
+              <w:spacing w:line="252" w:lineRule="auto" w:after="60" w:before="60"/>
+              <w:ind w:firstLine="0"/>
+              <w:jc w:val="center"/>
+            </w:pPr>
+            <w:r>
+              <w:rPr>
+                <w:rFonts w:ascii="Times New Roman" w:hAnsi="Times New Roman"/>
+                <w:b/>
+                <w:color w:val="000000"/>
+                <w:sz w:val="22"/>
+              </w:rPr>
+              <w:t>Результат</w:t>
             </w:r>
           </w:p>
         </w:tc>
@@ -3846,7 +4099,7 @@
                 <w:color w:val="000000"/>
                 <w:sz w:val="22"/>
               </w:rPr>
-              <w:t>PUT /api/profile</w:t>
+              <w:t>GET /api/session</w:t>
             </w:r>
           </w:p>
         </w:tc>
@@ -3866,7 +4119,7 @@
                 <w:color w:val="000000"/>
                 <w:sz w:val="22"/>
               </w:rPr>
-              <w:t>Параметры человека, активность, цель, ограничения</w:t>
+              <w:t>Cookie, если есть</w:t>
             </w:r>
           </w:p>
         </w:tc>
@@ -3886,7 +4139,7 @@
                 <w:color w:val="000000"/>
                 <w:sz w:val="22"/>
               </w:rPr>
-              <w:t>Сохранённый профиль, profile_complete и состояние приложения</w:t>
+              <w:t>authenticated и email</w:t>
             </w:r>
           </w:p>
         </w:tc>
@@ -3911,7 +4164,7 @@
                 <w:color w:val="000000"/>
                 <w:sz w:val="22"/>
               </w:rPr>
-              <w:t>POST /api/plan</w:t>
+              <w:t>POST /api/auth/register</w:t>
             </w:r>
           </w:p>
         </w:tc>
@@ -3931,7 +4184,7 @@
                 <w:color w:val="000000"/>
                 <w:sz w:val="22"/>
               </w:rPr>
-              <w:t>Период и настройки плана</w:t>
+              <w:t>email, password</w:t>
             </w:r>
           </w:p>
         </w:tc>
@@ -3951,7 +4204,7 @@
                 <w:color w:val="000000"/>
                 <w:sz w:val="22"/>
               </w:rPr>
-              <w:t>201; параметры человека берутся из готового профиля</w:t>
+              <w:t>Создание учётной записи, cookie; 422 при занятом email</w:t>
             </w:r>
           </w:p>
         </w:tc>
@@ -3976,7 +4229,7 @@
                 <w:color w:val="000000"/>
                 <w:sz w:val="22"/>
               </w:rPr>
-              <w:t>POST /api/plan/save</w:t>
+              <w:t>POST /api/auth/login</w:t>
             </w:r>
           </w:p>
         </w:tc>
@@ -3996,7 +4249,7 @@
                 <w:color w:val="000000"/>
                 <w:sz w:val="22"/>
               </w:rPr>
-              <w:t>plan_id, expected_revision</w:t>
+              <w:t>email, password</w:t>
             </w:r>
           </w:p>
         </w:tc>
@@ -4016,7 +4269,7 @@
                 <w:color w:val="000000"/>
                 <w:sz w:val="22"/>
               </w:rPr>
-              <w:t>Статус saved и дата; 409 при устаревшей версии</w:t>
+              <w:t>Cookie; 401 при неверном пароле, 429 после пяти ошибок</w:t>
             </w:r>
           </w:p>
         </w:tc>
@@ -4041,7 +4294,7 @@
                 <w:color w:val="000000"/>
                 <w:sz w:val="22"/>
               </w:rPr>
-              <w:t>GET /api/alternatives?item_id=…</w:t>
+              <w:t>POST /api/auth/demo</w:t>
             </w:r>
           </w:p>
         </w:tc>
@@ -4061,7 +4314,7 @@
                 <w:color w:val="000000"/>
                 <w:sz w:val="22"/>
               </w:rPr>
-              <w:t>ID позиции своего плана</w:t>
+              <w:t>Пустой объект</w:t>
             </w:r>
           </w:p>
         </w:tc>
@@ -4081,7 +4334,7 @@
                 <w:color w:val="000000"/>
                 <w:sz w:val="22"/>
               </w:rPr>
-              <w:t>Массив допустимых рецептов</w:t>
+              <w:t>Отдельная демонстрационная учётная запись без пароля</w:t>
             </w:r>
           </w:p>
         </w:tc>
@@ -4106,7 +4359,7 @@
                 <w:color w:val="000000"/>
                 <w:sz w:val="22"/>
               </w:rPr>
-              <w:t>POST /api/replace</w:t>
+              <w:t>POST /api/auth/logout</w:t>
             </w:r>
           </w:p>
         </w:tc>
@@ -4126,7 +4379,7 @@
                 <w:color w:val="000000"/>
                 <w:sz w:val="22"/>
               </w:rPr>
-              <w:t>item_id, recipe_id, expected_revision</w:t>
+              <w:t>Пустой объект</w:t>
             </w:r>
           </w:p>
         </w:tc>
@@ -4146,7 +4399,7 @@
                 <w:color w:val="000000"/>
                 <w:sz w:val="22"/>
               </w:rPr>
-              <w:t>Замена одной позиции, корзина и новая версия; 409 при конфликте</w:t>
+              <w:t>Удаление сессии и cookie</w:t>
             </w:r>
           </w:p>
         </w:tc>
@@ -4171,7 +4424,7 @@
                 <w:color w:val="000000"/>
                 <w:sz w:val="22"/>
               </w:rPr>
-              <w:t>PUT /api/pantry</w:t>
+              <w:t>GET /api/state</w:t>
             </w:r>
           </w:p>
         </w:tc>
@@ -4191,7 +4444,7 @@
                 <w:color w:val="000000"/>
                 <w:sz w:val="22"/>
               </w:rPr>
-              <w:t>ingredient_id, amount, purchased</w:t>
+              <w:t>Сессия</w:t>
             </w:r>
           </w:p>
         </w:tc>
@@ -4211,7 +4464,7 @@
                 <w:color w:val="000000"/>
                 <w:sz w:val="22"/>
               </w:rPr>
-              <w:t>Сохранённый запас и пересчитанный снимок</w:t>
+              <w:t>Профиль, каталог, текущий план, список и корзины</w:t>
             </w:r>
           </w:p>
         </w:tc>
@@ -4236,6 +4489,396 @@
                 <w:color w:val="000000"/>
                 <w:sz w:val="22"/>
               </w:rPr>
+              <w:t>PUT /api/profile</w:t>
+            </w:r>
+          </w:p>
+        </w:tc>
+        <w:tc>
+          <w:tcPr>
+            <w:tcW w:type="dxa" w:w="3458"/>
+          </w:tcPr>
+          <w:p>
+            <w:pPr>
+              <w:spacing w:line="252" w:lineRule="auto" w:after="60" w:before="60"/>
+              <w:ind w:firstLine="0"/>
+            </w:pPr>
+            <w:r>
+              <w:rPr>
+                <w:rFonts w:ascii="Times New Roman" w:hAnsi="Times New Roman"/>
+                <w:b w:val="0"/>
+                <w:color w:val="000000"/>
+                <w:sz w:val="22"/>
+              </w:rPr>
+              <w:t>Параметры человека, активность, цель, ограничения</w:t>
+            </w:r>
+          </w:p>
+        </w:tc>
+        <w:tc>
+          <w:tcPr>
+            <w:tcW w:type="dxa" w:w="3515"/>
+          </w:tcPr>
+          <w:p>
+            <w:pPr>
+              <w:spacing w:line="252" w:lineRule="auto" w:after="60" w:before="60"/>
+              <w:ind w:firstLine="0"/>
+            </w:pPr>
+            <w:r>
+              <w:rPr>
+                <w:rFonts w:ascii="Times New Roman" w:hAnsi="Times New Roman"/>
+                <w:b w:val="0"/>
+                <w:color w:val="000000"/>
+                <w:sz w:val="22"/>
+              </w:rPr>
+              <w:t>Сохранённый профиль, profile_complete и состояние приложения</w:t>
+            </w:r>
+          </w:p>
+        </w:tc>
+      </w:tr>
+      <w:tr>
+        <w:trPr>
+          <w:cantSplit/>
+        </w:trPr>
+        <w:tc>
+          <w:tcPr>
+            <w:tcW w:type="dxa" w:w="2381"/>
+          </w:tcPr>
+          <w:p>
+            <w:pPr>
+              <w:spacing w:line="252" w:lineRule="auto" w:after="60" w:before="60"/>
+              <w:ind w:firstLine="0"/>
+            </w:pPr>
+            <w:r>
+              <w:rPr>
+                <w:rFonts w:ascii="Times New Roman" w:hAnsi="Times New Roman"/>
+                <w:b w:val="0"/>
+                <w:color w:val="000000"/>
+                <w:sz w:val="22"/>
+              </w:rPr>
+              <w:t>POST /api/plan</w:t>
+            </w:r>
+          </w:p>
+        </w:tc>
+        <w:tc>
+          <w:tcPr>
+            <w:tcW w:type="dxa" w:w="3458"/>
+          </w:tcPr>
+          <w:p>
+            <w:pPr>
+              <w:spacing w:line="252" w:lineRule="auto" w:after="60" w:before="60"/>
+              <w:ind w:firstLine="0"/>
+            </w:pPr>
+            <w:r>
+              <w:rPr>
+                <w:rFonts w:ascii="Times New Roman" w:hAnsi="Times New Roman"/>
+                <w:b w:val="0"/>
+                <w:color w:val="000000"/>
+                <w:sz w:val="22"/>
+              </w:rPr>
+              <w:t>Период и настройки плана</w:t>
+            </w:r>
+          </w:p>
+        </w:tc>
+        <w:tc>
+          <w:tcPr>
+            <w:tcW w:type="dxa" w:w="3515"/>
+          </w:tcPr>
+          <w:p>
+            <w:pPr>
+              <w:spacing w:line="252" w:lineRule="auto" w:after="60" w:before="60"/>
+              <w:ind w:firstLine="0"/>
+            </w:pPr>
+            <w:r>
+              <w:rPr>
+                <w:rFonts w:ascii="Times New Roman" w:hAnsi="Times New Roman"/>
+                <w:b w:val="0"/>
+                <w:color w:val="000000"/>
+                <w:sz w:val="22"/>
+              </w:rPr>
+              <w:t>201; параметры человека берутся из готового профиля</w:t>
+            </w:r>
+          </w:p>
+        </w:tc>
+      </w:tr>
+      <w:tr>
+        <w:trPr>
+          <w:cantSplit/>
+        </w:trPr>
+        <w:tc>
+          <w:tcPr>
+            <w:tcW w:type="dxa" w:w="2381"/>
+          </w:tcPr>
+          <w:p>
+            <w:pPr>
+              <w:spacing w:line="252" w:lineRule="auto" w:after="60" w:before="60"/>
+              <w:ind w:firstLine="0"/>
+            </w:pPr>
+            <w:r>
+              <w:rPr>
+                <w:rFonts w:ascii="Times New Roman" w:hAnsi="Times New Roman"/>
+                <w:b w:val="0"/>
+                <w:color w:val="000000"/>
+                <w:sz w:val="22"/>
+              </w:rPr>
+              <w:t>POST /api/plan/save</w:t>
+            </w:r>
+          </w:p>
+        </w:tc>
+        <w:tc>
+          <w:tcPr>
+            <w:tcW w:type="dxa" w:w="3458"/>
+          </w:tcPr>
+          <w:p>
+            <w:pPr>
+              <w:spacing w:line="252" w:lineRule="auto" w:after="60" w:before="60"/>
+              <w:ind w:firstLine="0"/>
+            </w:pPr>
+            <w:r>
+              <w:rPr>
+                <w:rFonts w:ascii="Times New Roman" w:hAnsi="Times New Roman"/>
+                <w:b w:val="0"/>
+                <w:color w:val="000000"/>
+                <w:sz w:val="22"/>
+              </w:rPr>
+              <w:t>plan_id, expected_revision</w:t>
+            </w:r>
+          </w:p>
+        </w:tc>
+        <w:tc>
+          <w:tcPr>
+            <w:tcW w:type="dxa" w:w="3515"/>
+          </w:tcPr>
+          <w:p>
+            <w:pPr>
+              <w:spacing w:line="252" w:lineRule="auto" w:after="60" w:before="60"/>
+              <w:ind w:firstLine="0"/>
+            </w:pPr>
+            <w:r>
+              <w:rPr>
+                <w:rFonts w:ascii="Times New Roman" w:hAnsi="Times New Roman"/>
+                <w:b w:val="0"/>
+                <w:color w:val="000000"/>
+                <w:sz w:val="22"/>
+              </w:rPr>
+              <w:t>Статус saved и дата; 409 при устаревшей версии</w:t>
+            </w:r>
+          </w:p>
+        </w:tc>
+      </w:tr>
+      <w:tr>
+        <w:trPr>
+          <w:cantSplit/>
+        </w:trPr>
+        <w:tc>
+          <w:tcPr>
+            <w:tcW w:type="dxa" w:w="2381"/>
+          </w:tcPr>
+          <w:p>
+            <w:pPr>
+              <w:spacing w:line="252" w:lineRule="auto" w:after="60" w:before="60"/>
+              <w:ind w:firstLine="0"/>
+            </w:pPr>
+            <w:r>
+              <w:rPr>
+                <w:rFonts w:ascii="Times New Roman" w:hAnsi="Times New Roman"/>
+                <w:b w:val="0"/>
+                <w:color w:val="000000"/>
+                <w:sz w:val="22"/>
+              </w:rPr>
+              <w:t>GET /api/alternatives?item_id=…</w:t>
+            </w:r>
+          </w:p>
+        </w:tc>
+        <w:tc>
+          <w:tcPr>
+            <w:tcW w:type="dxa" w:w="3458"/>
+          </w:tcPr>
+          <w:p>
+            <w:pPr>
+              <w:spacing w:line="252" w:lineRule="auto" w:after="60" w:before="60"/>
+              <w:ind w:firstLine="0"/>
+            </w:pPr>
+            <w:r>
+              <w:rPr>
+                <w:rFonts w:ascii="Times New Roman" w:hAnsi="Times New Roman"/>
+                <w:b w:val="0"/>
+                <w:color w:val="000000"/>
+                <w:sz w:val="22"/>
+              </w:rPr>
+              <w:t>ID позиции своего плана</w:t>
+            </w:r>
+          </w:p>
+        </w:tc>
+        <w:tc>
+          <w:tcPr>
+            <w:tcW w:type="dxa" w:w="3515"/>
+          </w:tcPr>
+          <w:p>
+            <w:pPr>
+              <w:spacing w:line="252" w:lineRule="auto" w:after="60" w:before="60"/>
+              <w:ind w:firstLine="0"/>
+            </w:pPr>
+            <w:r>
+              <w:rPr>
+                <w:rFonts w:ascii="Times New Roman" w:hAnsi="Times New Roman"/>
+                <w:b w:val="0"/>
+                <w:color w:val="000000"/>
+                <w:sz w:val="22"/>
+              </w:rPr>
+              <w:t>Массив допустимых рецептов</w:t>
+            </w:r>
+          </w:p>
+        </w:tc>
+      </w:tr>
+      <w:tr>
+        <w:trPr>
+          <w:cantSplit/>
+        </w:trPr>
+        <w:tc>
+          <w:tcPr>
+            <w:tcW w:type="dxa" w:w="2381"/>
+          </w:tcPr>
+          <w:p>
+            <w:pPr>
+              <w:spacing w:line="252" w:lineRule="auto" w:after="60" w:before="60"/>
+              <w:ind w:firstLine="0"/>
+            </w:pPr>
+            <w:r>
+              <w:rPr>
+                <w:rFonts w:ascii="Times New Roman" w:hAnsi="Times New Roman"/>
+                <w:b w:val="0"/>
+                <w:color w:val="000000"/>
+                <w:sz w:val="22"/>
+              </w:rPr>
+              <w:t>POST /api/replace</w:t>
+            </w:r>
+          </w:p>
+        </w:tc>
+        <w:tc>
+          <w:tcPr>
+            <w:tcW w:type="dxa" w:w="3458"/>
+          </w:tcPr>
+          <w:p>
+            <w:pPr>
+              <w:spacing w:line="252" w:lineRule="auto" w:after="60" w:before="60"/>
+              <w:ind w:firstLine="0"/>
+            </w:pPr>
+            <w:r>
+              <w:rPr>
+                <w:rFonts w:ascii="Times New Roman" w:hAnsi="Times New Roman"/>
+                <w:b w:val="0"/>
+                <w:color w:val="000000"/>
+                <w:sz w:val="22"/>
+              </w:rPr>
+              <w:t>item_id, recipe_id, expected_revision</w:t>
+            </w:r>
+          </w:p>
+        </w:tc>
+        <w:tc>
+          <w:tcPr>
+            <w:tcW w:type="dxa" w:w="3515"/>
+          </w:tcPr>
+          <w:p>
+            <w:pPr>
+              <w:spacing w:line="252" w:lineRule="auto" w:after="60" w:before="60"/>
+              <w:ind w:firstLine="0"/>
+            </w:pPr>
+            <w:r>
+              <w:rPr>
+                <w:rFonts w:ascii="Times New Roman" w:hAnsi="Times New Roman"/>
+                <w:b w:val="0"/>
+                <w:color w:val="000000"/>
+                <w:sz w:val="22"/>
+              </w:rPr>
+              <w:t>Замена одной позиции, корзина и новая версия; 409 при конфликте</w:t>
+            </w:r>
+          </w:p>
+        </w:tc>
+      </w:tr>
+      <w:tr>
+        <w:trPr>
+          <w:cantSplit/>
+        </w:trPr>
+        <w:tc>
+          <w:tcPr>
+            <w:tcW w:type="dxa" w:w="2381"/>
+          </w:tcPr>
+          <w:p>
+            <w:pPr>
+              <w:spacing w:line="252" w:lineRule="auto" w:after="60" w:before="60"/>
+              <w:ind w:firstLine="0"/>
+            </w:pPr>
+            <w:r>
+              <w:rPr>
+                <w:rFonts w:ascii="Times New Roman" w:hAnsi="Times New Roman"/>
+                <w:b w:val="0"/>
+                <w:color w:val="000000"/>
+                <w:sz w:val="22"/>
+              </w:rPr>
+              <w:t>PUT /api/pantry</w:t>
+            </w:r>
+          </w:p>
+        </w:tc>
+        <w:tc>
+          <w:tcPr>
+            <w:tcW w:type="dxa" w:w="3458"/>
+          </w:tcPr>
+          <w:p>
+            <w:pPr>
+              <w:spacing w:line="252" w:lineRule="auto" w:after="60" w:before="60"/>
+              <w:ind w:firstLine="0"/>
+            </w:pPr>
+            <w:r>
+              <w:rPr>
+                <w:rFonts w:ascii="Times New Roman" w:hAnsi="Times New Roman"/>
+                <w:b w:val="0"/>
+                <w:color w:val="000000"/>
+                <w:sz w:val="22"/>
+              </w:rPr>
+              <w:t>ingredient_id, amount, purchased</w:t>
+            </w:r>
+          </w:p>
+        </w:tc>
+        <w:tc>
+          <w:tcPr>
+            <w:tcW w:type="dxa" w:w="3515"/>
+          </w:tcPr>
+          <w:p>
+            <w:pPr>
+              <w:spacing w:line="252" w:lineRule="auto" w:after="60" w:before="60"/>
+              <w:ind w:firstLine="0"/>
+            </w:pPr>
+            <w:r>
+              <w:rPr>
+                <w:rFonts w:ascii="Times New Roman" w:hAnsi="Times New Roman"/>
+                <w:b w:val="0"/>
+                <w:color w:val="000000"/>
+                <w:sz w:val="22"/>
+              </w:rPr>
+              <w:t>Сохранённый запас и пересчитанный снимок</w:t>
+            </w:r>
+          </w:p>
+        </w:tc>
+      </w:tr>
+      <w:tr>
+        <w:trPr>
+          <w:cantSplit/>
+        </w:trPr>
+        <w:tc>
+          <w:tcPr>
+            <w:tcW w:type="dxa" w:w="2381"/>
+          </w:tcPr>
+          <w:p>
+            <w:pPr>
+              <w:spacing w:line="252" w:lineRule="auto" w:after="60" w:before="60"/>
+              <w:ind w:firstLine="0"/>
+            </w:pPr>
+            <w:r>
+              <w:rPr>
+                <w:rFonts w:ascii="Times New Roman" w:hAnsi="Times New Roman"/>
+                <w:b w:val="0"/>
+                <w:color w:val="000000"/>
+                <w:sz w:val="22"/>
+              </w:rPr>
               <w:t>POST /api/prices/refresh</w:t>
             </w:r>
           </w:p>
@@ -4299,6 +4942,7 @@
     </w:p>
     <w:p>
       <w:pPr>
+        <w:keepNext/>
         <w:spacing w:line="240" w:lineRule="auto" w:after="40"/>
       </w:pPr>
       <w:r>
@@ -4311,6 +4955,7 @@
     </w:p>
     <w:p>
       <w:pPr>
+        <w:keepNext/>
         <w:spacing w:line="240" w:lineRule="auto" w:after="40"/>
       </w:pPr>
       <w:r>
@@ -4323,6 +4968,7 @@
     </w:p>
     <w:p>
       <w:pPr>
+        <w:keepNext/>
         <w:spacing w:line="240" w:lineRule="auto" w:after="40"/>
       </w:pPr>
       <w:r>
@@ -4335,6 +4981,7 @@
     </w:p>
     <w:p>
       <w:pPr>
+        <w:keepNext w:val="0"/>
         <w:spacing w:line="240" w:lineRule="auto" w:after="40"/>
       </w:pPr>
       <w:r>
@@ -4357,6 +5004,7 @@
     </w:p>
     <w:p>
       <w:pPr>
+        <w:keepNext/>
         <w:spacing w:line="240" w:lineRule="auto" w:after="40"/>
       </w:pPr>
       <w:r>
@@ -4369,6 +5017,7 @@
     </w:p>
     <w:p>
       <w:pPr>
+        <w:keepNext w:val="0"/>
         <w:spacing w:line="240" w:lineRule="auto" w:after="40"/>
       </w:pPr>
       <w:r>
@@ -4394,11 +5043,61 @@
         <w:pStyle w:val="2"/>
       </w:pPr>
       <w:r>
-        <w:t>5.3 Внутренние контракты</w:t>
-      </w:r>
-    </w:p>
-    <w:p>
-      <w:pPr>
+        <w:t>5.3 JSON контракты ключевых операций</w:t>
+      </w:r>
+    </w:p>
+    <w:p>
+      <w:pPr>
+        <w:spacing w:line="360" w:lineRule="auto"/>
+        <w:ind w:firstLine="709"/>
+        <w:jc w:val="both"/>
+      </w:pPr>
+      <w:r>
+        <w:t>Ниже описаны четыре действующих маршрута из prototype/server.py. Это описание текущего прототипа, без изменения серверного кода. Запросы и ответы передаются как JSON в UTF-8. Для всех четырёх маршрутов требуется cookie session, полученная после регистрации или входа. Пользователь определяется по сессии, поэтому user_id не принимается из браузера.</w:t>
+      </w:r>
+    </w:p>
+    <w:p>
+      <w:pPr>
+        <w:spacing w:line="360" w:lineRule="auto"/>
+        <w:ind w:firstLine="709"/>
+        <w:jc w:val="both"/>
+      </w:pPr>
+      <w:r>
+        <w:t>Примеры ответов сокращены до полей, используемых в данном сценарии. Это проекции полных JSON-ответов, а не отдельные форматы API. Идентификаторы и числовые результаты условны; они поясняют структуру и не являются результатами нового запуска. Полный снимок содержит также каталог recipes, ingredients, allergens, профиль и признаки состояния. Цена в запросе budget указывается в рублях, поля с суффиксом _kopecks в ответе содержат целые копейки. Поле recommended содержит ID магазина, а не объект корзины.</w:t>
+      </w:r>
+    </w:p>
+    <w:p>
+      <w:pPr>
+        <w:pStyle w:val="3"/>
+      </w:pPr>
+      <w:r>
+        <w:t>5.3.1 Сохранение профиля</w:t>
+      </w:r>
+    </w:p>
+    <w:p>
+      <w:pPr>
+        <w:spacing w:line="360" w:lineRule="auto"/>
+        <w:ind w:firstLine="709"/>
+        <w:jc w:val="both"/>
+      </w:pPr>
+      <w:r>
+        <w:t>Метод: PUT. URL: /api/profile. Фронтенд вызывает его на сводке онбординга. Метод PUT сохранён по фактической реализации, хотя генерация и замена используют POST.</w:t>
+      </w:r>
+    </w:p>
+    <w:p>
+      <w:pPr>
+        <w:keepNext/>
+        <w:spacing w:line="360" w:lineRule="auto"/>
+        <w:ind w:firstLine="709"/>
+        <w:jc w:val="both"/>
+      </w:pPr>
+      <w:r>
+        <w:t>JSON-запрос:</w:t>
+      </w:r>
+    </w:p>
+    <w:p>
+      <w:pPr>
+        <w:keepNext/>
         <w:spacing w:line="240" w:lineRule="auto" w:after="40"/>
       </w:pPr>
       <w:r>
@@ -4406,11 +5105,12 @@
           <w:rFonts w:ascii="Consolas" w:hAnsi="Consolas"/>
           <w:sz w:val="18"/>
         </w:rPr>
-        <w:t>validate_settings(data: dict) -&gt; dict</w:t>
-      </w:r>
-    </w:p>
-    <w:p>
-      <w:pPr>
+        <w:t>{</w:t>
+      </w:r>
+    </w:p>
+    <w:p>
+      <w:pPr>
+        <w:keepNext/>
         <w:spacing w:line="240" w:lineRule="auto" w:after="40"/>
       </w:pPr>
       <w:r>
@@ -4418,11 +5118,12 @@
           <w:rFonts w:ascii="Consolas" w:hAnsi="Consolas"/>
           <w:sz w:val="18"/>
         </w:rPr>
-        <w:t>generate_plan(settings: dict, recipes: dict, ingredients: dict) -&gt; list[dict]</w:t>
-      </w:r>
-    </w:p>
-    <w:p>
-      <w:pPr>
+        <w:t>"name": "Азамат", "sex": "male", "age": 22,</w:t>
+      </w:r>
+    </w:p>
+    <w:p>
+      <w:pPr>
+        <w:keepNext/>
         <w:spacing w:line="240" w:lineRule="auto" w:after="40"/>
       </w:pPr>
       <w:r>
@@ -4430,11 +5131,12 @@
           <w:rFonts w:ascii="Consolas" w:hAnsi="Consolas"/>
           <w:sz w:val="18"/>
         </w:rPr>
-        <w:t>nutrition(recipe: dict, ingredients: dict, scale: float = 1) -&gt; dict</w:t>
-      </w:r>
-    </w:p>
-    <w:p>
-      <w:pPr>
+        <w:t>"weight": 85, "height": 180, "activity": 1.375,</w:t>
+      </w:r>
+    </w:p>
+    <w:p>
+      <w:pPr>
+        <w:keepNext/>
         <w:spacing w:line="240" w:lineRule="auto" w:after="40"/>
       </w:pPr>
       <w:r>
@@ -4442,11 +5144,12 @@
           <w:rFonts w:ascii="Consolas" w:hAnsi="Consolas"/>
           <w:sz w:val="18"/>
         </w:rPr>
-        <w:t>shopping(items: list, recipes: dict, ingredients: dict, pantry: dict) -&gt; list[dict]</w:t>
-      </w:r>
-    </w:p>
-    <w:p>
-      <w:pPr>
+        <w:t>"goal": "lose", "allergens": ["арахис"],</w:t>
+      </w:r>
+    </w:p>
+    <w:p>
+      <w:pPr>
+        <w:keepNext/>
         <w:spacing w:line="240" w:lineRule="auto" w:after="40"/>
       </w:pPr>
       <w:r>
@@ -4454,11 +5157,12 @@
           <w:rFonts w:ascii="Consolas" w:hAnsi="Consolas"/>
           <w:sz w:val="18"/>
         </w:rPr>
-        <w:t>calculate_baskets(lines: list, stores: list, offers: list, budget: float) -&gt; dict</w:t>
-      </w:r>
-    </w:p>
-    <w:p>
-      <w:pPr>
+        <w:t>"preferences": ["no_fish"], "other_allergies": "",</w:t>
+      </w:r>
+    </w:p>
+    <w:p>
+      <w:pPr>
+        <w:keepNext/>
         <w:spacing w:line="240" w:lineRule="auto" w:after="40"/>
       </w:pPr>
       <w:r>
@@ -4466,11 +5170,12 @@
           <w:rFonts w:ascii="Consolas" w:hAnsi="Consolas"/>
           <w:sz w:val="18"/>
         </w:rPr>
-        <w:t>DemoPriceProvider.read(db) -&gt; list[dict]</w:t>
-      </w:r>
-    </w:p>
-    <w:p>
-      <w:pPr>
+        <w:t>"budget_week": 3500</w:t>
+      </w:r>
+    </w:p>
+    <w:p>
+      <w:pPr>
+        <w:keepNext w:val="0"/>
         <w:spacing w:line="240" w:lineRule="auto" w:after="40"/>
       </w:pPr>
       <w:r>
@@ -4478,6 +5183,1091 @@
           <w:rFonts w:ascii="Consolas" w:hAnsi="Consolas"/>
           <w:sz w:val="18"/>
         </w:rPr>
+        <w:t>}</w:t>
+      </w:r>
+    </w:p>
+    <w:p>
+      <w:pPr>
+        <w:keepNext/>
+        <w:spacing w:line="360" w:lineRule="auto"/>
+        <w:ind w:firstLine="709"/>
+        <w:jc w:val="both"/>
+      </w:pPr>
+      <w:r>
+        <w:t>HTTP 200. JSON-ответ, проекция снимка без существующего плана:</w:t>
+      </w:r>
+    </w:p>
+    <w:p>
+      <w:pPr>
+        <w:keepNext/>
+        <w:spacing w:line="240" w:lineRule="auto" w:after="40"/>
+      </w:pPr>
+      <w:r>
+        <w:rPr>
+          <w:rFonts w:ascii="Consolas" w:hAnsi="Consolas"/>
+          <w:sz w:val="18"/>
+        </w:rPr>
+        <w:t>{</w:t>
+      </w:r>
+    </w:p>
+    <w:p>
+      <w:pPr>
+        <w:keepNext/>
+        <w:spacing w:line="240" w:lineRule="auto" w:after="40"/>
+      </w:pPr>
+      <w:r>
+        <w:rPr>
+          <w:rFonts w:ascii="Consolas" w:hAnsi="Consolas"/>
+          <w:sz w:val="18"/>
+        </w:rPr>
+        <w:t>"profile": {</w:t>
+      </w:r>
+    </w:p>
+    <w:p>
+      <w:pPr>
+        <w:keepNext/>
+        <w:spacing w:line="240" w:lineRule="auto" w:after="40"/>
+      </w:pPr>
+      <w:r>
+        <w:rPr>
+          <w:rFonts w:ascii="Consolas" w:hAnsi="Consolas"/>
+          <w:sz w:val="18"/>
+        </w:rPr>
+        <w:t>"name": "Азамат", "sex": "male", "age": 22,</w:t>
+      </w:r>
+    </w:p>
+    <w:p>
+      <w:pPr>
+        <w:keepNext/>
+        <w:spacing w:line="240" w:lineRule="auto" w:after="40"/>
+      </w:pPr>
+      <w:r>
+        <w:rPr>
+          <w:rFonts w:ascii="Consolas" w:hAnsi="Consolas"/>
+          <w:sz w:val="18"/>
+        </w:rPr>
+        <w:t>"weight": 85.0, "height": 180, "activity": 1.375,</w:t>
+      </w:r>
+    </w:p>
+    <w:p>
+      <w:pPr>
+        <w:keepNext/>
+        <w:spacing w:line="240" w:lineRule="auto" w:after="40"/>
+      </w:pPr>
+      <w:r>
+        <w:rPr>
+          <w:rFonts w:ascii="Consolas" w:hAnsi="Consolas"/>
+          <w:sz w:val="18"/>
+        </w:rPr>
+        <w:t>"goal": "lose", "allergens": ["арахис"],</w:t>
+      </w:r>
+    </w:p>
+    <w:p>
+      <w:pPr>
+        <w:keepNext/>
+        <w:spacing w:line="240" w:lineRule="auto" w:after="40"/>
+      </w:pPr>
+      <w:r>
+        <w:rPr>
+          <w:rFonts w:ascii="Consolas" w:hAnsi="Consolas"/>
+          <w:sz w:val="18"/>
+        </w:rPr>
+        <w:t>"preferences": ["no_fish"], "other_allergies": "",</w:t>
+      </w:r>
+    </w:p>
+    <w:p>
+      <w:pPr>
+        <w:keepNext/>
+        <w:spacing w:line="240" w:lineRule="auto" w:after="40"/>
+      </w:pPr>
+      <w:r>
+        <w:rPr>
+          <w:rFonts w:ascii="Consolas" w:hAnsi="Consolas"/>
+          <w:sz w:val="18"/>
+        </w:rPr>
+        <w:t>"budget_week": 3500, "completed": true</w:t>
+      </w:r>
+    </w:p>
+    <w:p>
+      <w:pPr>
+        <w:keepNext/>
+        <w:spacing w:line="240" w:lineRule="auto" w:after="40"/>
+      </w:pPr>
+      <w:r>
+        <w:rPr>
+          <w:rFonts w:ascii="Consolas" w:hAnsi="Consolas"/>
+          <w:sz w:val="18"/>
+        </w:rPr>
+        <w:t>},</w:t>
+      </w:r>
+    </w:p>
+    <w:p>
+      <w:pPr>
+        <w:keepNext/>
+        <w:spacing w:line="240" w:lineRule="auto" w:after="40"/>
+      </w:pPr>
+      <w:r>
+        <w:rPr>
+          <w:rFonts w:ascii="Consolas" w:hAnsi="Consolas"/>
+          <w:sz w:val="18"/>
+        </w:rPr>
+        <w:t>"profile_complete": true, "plan": null, "test_data": true</w:t>
+      </w:r>
+    </w:p>
+    <w:p>
+      <w:pPr>
+        <w:keepNext w:val="0"/>
+        <w:spacing w:line="240" w:lineRule="auto" w:after="40"/>
+      </w:pPr>
+      <w:r>
+        <w:rPr>
+          <w:rFonts w:ascii="Consolas" w:hAnsi="Consolas"/>
+          <w:sz w:val="18"/>
+        </w:rPr>
+        <w:t>}</w:t>
+      </w:r>
+    </w:p>
+    <w:p>
+      <w:pPr>
+        <w:spacing w:line="360" w:lineRule="auto"/>
+        <w:ind w:firstLine="709"/>
+        <w:jc w:val="both"/>
+      </w:pPr>
+      <w:r>
+        <w:t>Сервер проверяет обязательные поля, диапазоны, шаг шкал и допустимые значения списков. Повторный PUT обновляет единственную строку profiles данного пользователя. При изменении параметров, влияющих на расчёт, старый план не удаляется, но скрывается из актуального снимка с previous_plan_requires_update: true. Нужна повторная генерация. Ошибка полей возвращает 422, отсутствие сессии возвращает 401.</w:t>
+      </w:r>
+    </w:p>
+    <w:p>
+      <w:pPr>
+        <w:pStyle w:val="3"/>
+      </w:pPr>
+      <w:r>
+        <w:t>5.3.2 Генерация меню</w:t>
+      </w:r>
+    </w:p>
+    <w:p>
+      <w:pPr>
+        <w:spacing w:line="360" w:lineRule="auto"/>
+        <w:ind w:firstLine="709"/>
+        <w:jc w:val="both"/>
+      </w:pPr>
+      <w:r>
+        <w:t>Метод: POST. URL: /api/plan. Фронтенд передаёт параметры периода; параметры человека и аллергии сервер берёт из сохранённого профиля.</w:t>
+      </w:r>
+    </w:p>
+    <w:p>
+      <w:pPr>
+        <w:keepNext/>
+        <w:spacing w:line="360" w:lineRule="auto"/>
+        <w:ind w:firstLine="709"/>
+        <w:jc w:val="both"/>
+      </w:pPr>
+      <w:r>
+        <w:t>JSON-запрос:</w:t>
+      </w:r>
+    </w:p>
+    <w:p>
+      <w:pPr>
+        <w:keepNext/>
+        <w:spacing w:line="240" w:lineRule="auto" w:after="40"/>
+      </w:pPr>
+      <w:r>
+        <w:rPr>
+          <w:rFonts w:ascii="Consolas" w:hAnsi="Consolas"/>
+          <w:sz w:val="18"/>
+        </w:rPr>
+        <w:t>{</w:t>
+      </w:r>
+    </w:p>
+    <w:p>
+      <w:pPr>
+        <w:keepNext/>
+        <w:spacing w:line="240" w:lineRule="auto" w:after="40"/>
+      </w:pPr>
+      <w:r>
+        <w:rPr>
+          <w:rFonts w:ascii="Consolas" w:hAnsi="Consolas"/>
+          <w:sz w:val="18"/>
+        </w:rPr>
+        <w:t>"start_date": "2026-10-26", "days": 7, "meals": 3,</w:t>
+      </w:r>
+    </w:p>
+    <w:p>
+      <w:pPr>
+        <w:keepNext/>
+        <w:spacing w:line="240" w:lineRule="auto" w:after="40"/>
+      </w:pPr>
+      <w:r>
+        <w:rPr>
+          <w:rFonts w:ascii="Consolas" w:hAnsi="Consolas"/>
+          <w:sz w:val="18"/>
+        </w:rPr>
+        <w:t>"budget": 3500, "minutes": 30, "repeat": 2,</w:t>
+      </w:r>
+    </w:p>
+    <w:p>
+      <w:pPr>
+        <w:keepNext/>
+        <w:spacing w:line="240" w:lineRule="auto" w:after="40"/>
+      </w:pPr>
+      <w:r>
+        <w:rPr>
+          <w:rFonts w:ascii="Consolas" w:hAnsi="Consolas"/>
+          <w:sz w:val="18"/>
+        </w:rPr>
+        <w:t>"preferences": ["no_fish"]</w:t>
+      </w:r>
+    </w:p>
+    <w:p>
+      <w:pPr>
+        <w:keepNext w:val="0"/>
+        <w:spacing w:line="240" w:lineRule="auto" w:after="40"/>
+      </w:pPr>
+      <w:r>
+        <w:rPr>
+          <w:rFonts w:ascii="Consolas" w:hAnsi="Consolas"/>
+          <w:sz w:val="18"/>
+        </w:rPr>
+        <w:t>}</w:t>
+      </w:r>
+    </w:p>
+    <w:p>
+      <w:pPr>
+        <w:keepNext/>
+        <w:spacing w:line="360" w:lineRule="auto"/>
+        <w:ind w:firstLine="709"/>
+        <w:jc w:val="both"/>
+      </w:pPr>
+      <w:r>
+        <w:t>HTTP 201. JSON-ответ, проекция; items и baskets сокращены до одной записи:</w:t>
+      </w:r>
+    </w:p>
+    <w:p>
+      <w:pPr>
+        <w:keepNext/>
+        <w:spacing w:line="240" w:lineRule="auto" w:after="40"/>
+      </w:pPr>
+      <w:r>
+        <w:rPr>
+          <w:rFonts w:ascii="Consolas" w:hAnsi="Consolas"/>
+          <w:sz w:val="18"/>
+        </w:rPr>
+        <w:t>{</w:t>
+      </w:r>
+    </w:p>
+    <w:p>
+      <w:pPr>
+        <w:keepNext/>
+        <w:spacing w:line="240" w:lineRule="auto" w:after="40"/>
+      </w:pPr>
+      <w:r>
+        <w:rPr>
+          <w:rFonts w:ascii="Consolas" w:hAnsi="Consolas"/>
+          <w:sz w:val="18"/>
+        </w:rPr>
+        <w:t>"profile_complete": true,</w:t>
+      </w:r>
+    </w:p>
+    <w:p>
+      <w:pPr>
+        <w:keepNext/>
+        <w:spacing w:line="240" w:lineRule="auto" w:after="40"/>
+      </w:pPr>
+      <w:r>
+        <w:rPr>
+          <w:rFonts w:ascii="Consolas" w:hAnsi="Consolas"/>
+          <w:sz w:val="18"/>
+        </w:rPr>
+        <w:t>"plan": {</w:t>
+      </w:r>
+    </w:p>
+    <w:p>
+      <w:pPr>
+        <w:keepNext/>
+        <w:spacing w:line="240" w:lineRule="auto" w:after="40"/>
+      </w:pPr>
+      <w:r>
+        <w:rPr>
+          <w:rFonts w:ascii="Consolas" w:hAnsi="Consolas"/>
+          <w:sz w:val="18"/>
+        </w:rPr>
+        <w:t>"id": "plan_example", "start_date": "2026-10-26",</w:t>
+      </w:r>
+    </w:p>
+    <w:p>
+      <w:pPr>
+        <w:keepNext/>
+        <w:spacing w:line="240" w:lineRule="auto" w:after="40"/>
+      </w:pPr>
+      <w:r>
+        <w:rPr>
+          <w:rFonts w:ascii="Consolas" w:hAnsi="Consolas"/>
+          <w:sz w:val="18"/>
+        </w:rPr>
+        <w:t>"days": 7, "status": "draft", "revision": 0,</w:t>
+      </w:r>
+    </w:p>
+    <w:p>
+      <w:pPr>
+        <w:keepNext/>
+        <w:spacing w:line="240" w:lineRule="auto" w:after="40"/>
+      </w:pPr>
+      <w:r>
+        <w:rPr>
+          <w:rFonts w:ascii="Consolas" w:hAnsi="Consolas"/>
+          <w:sz w:val="18"/>
+        </w:rPr>
+        <w:t>"saved_at": null,</w:t>
+      </w:r>
+    </w:p>
+    <w:p>
+      <w:pPr>
+        <w:keepNext/>
+        <w:spacing w:line="240" w:lineRule="auto" w:after="40"/>
+      </w:pPr>
+      <w:r>
+        <w:rPr>
+          <w:rFonts w:ascii="Consolas" w:hAnsi="Consolas"/>
+          <w:sz w:val="18"/>
+        </w:rPr>
+        <w:t>"settings": {"days": 7, "meals": 3, "budget": 3500},</w:t>
+      </w:r>
+    </w:p>
+    <w:p>
+      <w:pPr>
+        <w:keepNext/>
+        <w:spacing w:line="240" w:lineRule="auto" w:after="40"/>
+      </w:pPr>
+      <w:r>
+        <w:rPr>
+          <w:rFonts w:ascii="Consolas" w:hAnsi="Consolas"/>
+          <w:sz w:val="18"/>
+        </w:rPr>
+        <w:t>"items": [{</w:t>
+      </w:r>
+    </w:p>
+    <w:p>
+      <w:pPr>
+        <w:keepNext/>
+        <w:spacing w:line="240" w:lineRule="auto" w:after="40"/>
+      </w:pPr>
+      <w:r>
+        <w:rPr>
+          <w:rFonts w:ascii="Consolas" w:hAnsi="Consolas"/>
+          <w:sz w:val="18"/>
+        </w:rPr>
+        <w:t>"id": "meal_example", "plan_id": "plan_example",</w:t>
+      </w:r>
+    </w:p>
+    <w:p>
+      <w:pPr>
+        <w:keepNext/>
+        <w:spacing w:line="240" w:lineRule="auto" w:after="40"/>
+      </w:pPr>
+      <w:r>
+        <w:rPr>
+          <w:rFonts w:ascii="Consolas" w:hAnsi="Consolas"/>
+          <w:sz w:val="18"/>
+        </w:rPr>
+        <w:t>"day": 0, "slot": 0, "recipe_id": "r01", "scale": 1.2,</w:t>
+      </w:r>
+    </w:p>
+    <w:p>
+      <w:pPr>
+        <w:keepNext/>
+        <w:spacing w:line="240" w:lineRule="auto" w:after="40"/>
+      </w:pPr>
+      <w:r>
+        <w:rPr>
+          <w:rFonts w:ascii="Consolas" w:hAnsi="Consolas"/>
+          <w:sz w:val="18"/>
+        </w:rPr>
+        <w:t>"nutrition": {"kcal": 600.0},</w:t>
+      </w:r>
+    </w:p>
+    <w:p>
+      <w:pPr>
+        <w:keepNext/>
+        <w:spacing w:line="240" w:lineRule="auto" w:after="40"/>
+      </w:pPr>
+      <w:r>
+        <w:rPr>
+          <w:rFonts w:ascii="Consolas" w:hAnsi="Consolas"/>
+          <w:sz w:val="18"/>
+        </w:rPr>
+        <w:t>"estimated_cost_kopecks": 8500</w:t>
+      </w:r>
+    </w:p>
+    <w:p>
+      <w:pPr>
+        <w:keepNext/>
+        <w:spacing w:line="240" w:lineRule="auto" w:after="40"/>
+      </w:pPr>
+      <w:r>
+        <w:rPr>
+          <w:rFonts w:ascii="Consolas" w:hAnsi="Consolas"/>
+          <w:sz w:val="18"/>
+        </w:rPr>
+        <w:t>}]</w:t>
+      </w:r>
+    </w:p>
+    <w:p>
+      <w:pPr>
+        <w:keepNext/>
+        <w:spacing w:line="240" w:lineRule="auto" w:after="40"/>
+      </w:pPr>
+      <w:r>
+        <w:rPr>
+          <w:rFonts w:ascii="Consolas" w:hAnsi="Consolas"/>
+          <w:sz w:val="18"/>
+        </w:rPr>
+        <w:t>},</w:t>
+      </w:r>
+    </w:p>
+    <w:p>
+      <w:pPr>
+        <w:keepNext/>
+        <w:spacing w:line="240" w:lineRule="auto" w:after="40"/>
+      </w:pPr>
+      <w:r>
+        <w:rPr>
+          <w:rFonts w:ascii="Consolas" w:hAnsi="Consolas"/>
+          <w:sz w:val="18"/>
+        </w:rPr>
+        <w:t>"recommended": "lenta",</w:t>
+      </w:r>
+    </w:p>
+    <w:p>
+      <w:pPr>
+        <w:keepNext/>
+        <w:spacing w:line="240" w:lineRule="auto" w:after="40"/>
+      </w:pPr>
+      <w:r>
+        <w:rPr>
+          <w:rFonts w:ascii="Consolas" w:hAnsi="Consolas"/>
+          <w:sz w:val="18"/>
+        </w:rPr>
+        <w:t>"baskets": [{"id": "lenta", "complete": true,</w:t>
+      </w:r>
+    </w:p>
+    <w:p>
+      <w:pPr>
+        <w:keepNext/>
+        <w:spacing w:line="240" w:lineRule="auto" w:after="40"/>
+      </w:pPr>
+      <w:r>
+        <w:rPr>
+          <w:rFonts w:ascii="Consolas" w:hAnsi="Consolas"/>
+          <w:sz w:val="18"/>
+        </w:rPr>
+        <w:t>"total_kopecks": 320000, "over_budget_kopecks": 0}],</w:t>
+      </w:r>
+    </w:p>
+    <w:p>
+      <w:pPr>
+        <w:keepNext/>
+        <w:spacing w:line="240" w:lineRule="auto" w:after="40"/>
+      </w:pPr>
+      <w:r>
+        <w:rPr>
+          <w:rFonts w:ascii="Consolas" w:hAnsi="Consolas"/>
+          <w:sz w:val="18"/>
+        </w:rPr>
+        <w:t>"test_data": true</w:t>
+      </w:r>
+    </w:p>
+    <w:p>
+      <w:pPr>
+        <w:keepNext w:val="0"/>
+        <w:spacing w:line="240" w:lineRule="auto" w:after="40"/>
+      </w:pPr>
+      <w:r>
+        <w:rPr>
+          <w:rFonts w:ascii="Consolas" w:hAnsi="Consolas"/>
+          <w:sz w:val="18"/>
+        </w:rPr>
+        <w:t>}</w:t>
+      </w:r>
+    </w:p>
+    <w:p>
+      <w:pPr>
+        <w:spacing w:line="360" w:lineRule="auto"/>
+        <w:ind w:firstLine="709"/>
+        <w:jc w:val="both"/>
+      </w:pPr>
+      <w:r>
+        <w:t>days допускает 7-31, meals допускает 3-5, minutes допускает 5-180, repeat допускает 1-7; бюджет относится ко всему периоду. Индексы day и slot начинаются с нуля. Название блюда фронтенд получает из recipes по recipe_id. nutrition также содержит protein, fat, carbs. Полный settings включает цель, ограничения, target и отпечаток профиля. План и все позиции записываются одной транзакцией после успешного подбора. Если профиль не завершён, возраст менее 18 лет или меню невозможно, возвращается 422; предыдущий план сохраняется. Превышение бюджета само по себе не отменяет генерацию, а отображается в результате.</w:t>
+      </w:r>
+    </w:p>
+    <w:p>
+      <w:pPr>
+        <w:pStyle w:val="3"/>
+      </w:pPr>
+      <w:r>
+        <w:t>5.3.3 Получение альтернатив</w:t>
+      </w:r>
+    </w:p>
+    <w:p>
+      <w:pPr>
+        <w:spacing w:line="360" w:lineRule="auto"/>
+        <w:ind w:firstLine="709"/>
+        <w:jc w:val="both"/>
+      </w:pPr>
+      <w:r>
+        <w:t>Метод: GET. URL: /api/alternatives?item_id=meal_example. JSON-тело запроса отсутствует; item_id передаётся в строке запроса. Это ID конкретного приёма пищи, не ID рецепта.</w:t>
+      </w:r>
+    </w:p>
+    <w:p>
+      <w:pPr>
+        <w:keepNext/>
+        <w:spacing w:line="360" w:lineRule="auto"/>
+        <w:ind w:firstLine="709"/>
+        <w:jc w:val="both"/>
+      </w:pPr>
+      <w:r>
+        <w:t>HTTP 200. JSON-ответ, проекция:</w:t>
+      </w:r>
+    </w:p>
+    <w:p>
+      <w:pPr>
+        <w:keepNext/>
+        <w:spacing w:line="240" w:lineRule="auto" w:after="40"/>
+      </w:pPr>
+      <w:r>
+        <w:rPr>
+          <w:rFonts w:ascii="Consolas" w:hAnsi="Consolas"/>
+          <w:sz w:val="18"/>
+        </w:rPr>
+        <w:t>{</w:t>
+      </w:r>
+    </w:p>
+    <w:p>
+      <w:pPr>
+        <w:keepNext/>
+        <w:spacing w:line="240" w:lineRule="auto" w:after="40"/>
+      </w:pPr>
+      <w:r>
+        <w:rPr>
+          <w:rFonts w:ascii="Consolas" w:hAnsi="Consolas"/>
+          <w:sz w:val="18"/>
+        </w:rPr>
+        <w:t>"plan_id": "plan_example", "plan_revision": 0,</w:t>
+      </w:r>
+    </w:p>
+    <w:p>
+      <w:pPr>
+        <w:keepNext/>
+        <w:spacing w:line="240" w:lineRule="auto" w:after="40"/>
+      </w:pPr>
+      <w:r>
+        <w:rPr>
+          <w:rFonts w:ascii="Consolas" w:hAnsi="Consolas"/>
+          <w:sz w:val="18"/>
+        </w:rPr>
+        <w:t>"baseline_cart_kopecks": 320000, "baseline_store": "lenta",</w:t>
+      </w:r>
+    </w:p>
+    <w:p>
+      <w:pPr>
+        <w:keepNext/>
+        <w:spacing w:line="240" w:lineRule="auto" w:after="40"/>
+      </w:pPr>
+      <w:r>
+        <w:rPr>
+          <w:rFonts w:ascii="Consolas" w:hAnsi="Consolas"/>
+          <w:sz w:val="18"/>
+        </w:rPr>
+        <w:t>"alternatives": [{</w:t>
+      </w:r>
+    </w:p>
+    <w:p>
+      <w:pPr>
+        <w:keepNext/>
+        <w:spacing w:line="240" w:lineRule="auto" w:after="40"/>
+      </w:pPr>
+      <w:r>
+        <w:rPr>
+          <w:rFonts w:ascii="Consolas" w:hAnsi="Consolas"/>
+          <w:sz w:val="18"/>
+        </w:rPr>
+        <w:t>"id": "r02", "name": "Овсянка с бананом",</w:t>
+      </w:r>
+    </w:p>
+    <w:p>
+      <w:pPr>
+        <w:keepNext/>
+        <w:spacing w:line="240" w:lineRule="auto" w:after="40"/>
+      </w:pPr>
+      <w:r>
+        <w:rPr>
+          <w:rFonts w:ascii="Consolas" w:hAnsi="Consolas"/>
+          <w:sz w:val="18"/>
+        </w:rPr>
+        <w:t>"planned_nutrition": {"kcal": 600.0},</w:t>
+      </w:r>
+    </w:p>
+    <w:p>
+      <w:pPr>
+        <w:keepNext/>
+        <w:spacing w:line="240" w:lineRule="auto" w:after="40"/>
+      </w:pPr>
+      <w:r>
+        <w:rPr>
+          <w:rFonts w:ascii="Consolas" w:hAnsi="Consolas"/>
+          <w:sz w:val="18"/>
+        </w:rPr>
+        <w:t>"scale": 1.15, "cart_total_kopecks": 315000,</w:t>
+      </w:r>
+    </w:p>
+    <w:p>
+      <w:pPr>
+        <w:keepNext/>
+        <w:spacing w:line="240" w:lineRule="auto" w:after="40"/>
+      </w:pPr>
+      <w:r>
+        <w:rPr>
+          <w:rFonts w:ascii="Consolas" w:hAnsi="Consolas"/>
+          <w:sz w:val="18"/>
+        </w:rPr>
+        <w:t>"cart_delta_kopecks": -5000, "recommended_store": "lenta"</w:t>
+      </w:r>
+    </w:p>
+    <w:p>
+      <w:pPr>
+        <w:keepNext/>
+        <w:spacing w:line="240" w:lineRule="auto" w:after="40"/>
+      </w:pPr>
+      <w:r>
+        <w:rPr>
+          <w:rFonts w:ascii="Consolas" w:hAnsi="Consolas"/>
+          <w:sz w:val="18"/>
+        </w:rPr>
+        <w:t>}]</w:t>
+      </w:r>
+    </w:p>
+    <w:p>
+      <w:pPr>
+        <w:keepNext w:val="0"/>
+        <w:spacing w:line="240" w:lineRule="auto" w:after="40"/>
+      </w:pPr>
+      <w:r>
+        <w:rPr>
+          <w:rFonts w:ascii="Consolas" w:hAnsi="Consolas"/>
+          <w:sz w:val="18"/>
+        </w:rPr>
+        <w:t>}</w:t>
+      </w:r>
+    </w:p>
+    <w:p>
+      <w:pPr>
+        <w:spacing w:line="360" w:lineRule="auto"/>
+        <w:ind w:firstLine="709"/>
+        <w:jc w:val="both"/>
+      </w:pPr>
+      <w:r>
+        <w:t>Состав проверяется по ограничениям, после чего для каждого кандидата пересчитывается вся закупка с запасами и упаковками. GET ничего не записывает. При отсутствии вариантов alternatives равен []. Если полной корзины нет, соответствующая сумма и разница равны null, а не нулю. Чужая или отсутствующая позиция даёт 404. Изменённый профиль требует новой генерации и даёт 422.</w:t>
+      </w:r>
+    </w:p>
+    <w:p>
+      <w:pPr>
+        <w:pStyle w:val="3"/>
+      </w:pPr>
+      <w:r>
+        <w:t>5.3.4 Замена блюда</w:t>
+      </w:r>
+    </w:p>
+    <w:p>
+      <w:pPr>
+        <w:spacing w:line="360" w:lineRule="auto"/>
+        <w:ind w:firstLine="709"/>
+        <w:jc w:val="both"/>
+      </w:pPr>
+      <w:r>
+        <w:t>Метод: POST. URL: /api/replace. Нужны оба идентификатора: item_id указывает место в плане, recipe_id указывает выбранное блюдо. expected_revision берётся из plan_revision ответа альтернатив. Пользователь и план повторно проверяются сервером.</w:t>
+      </w:r>
+    </w:p>
+    <w:p>
+      <w:pPr>
+        <w:keepNext/>
+        <w:spacing w:line="360" w:lineRule="auto"/>
+        <w:ind w:firstLine="709"/>
+        <w:jc w:val="both"/>
+      </w:pPr>
+      <w:r>
+        <w:t>JSON-запрос:</w:t>
+      </w:r>
+    </w:p>
+    <w:p>
+      <w:pPr>
+        <w:keepNext/>
+        <w:spacing w:line="240" w:lineRule="auto" w:after="40"/>
+      </w:pPr>
+      <w:r>
+        <w:rPr>
+          <w:rFonts w:ascii="Consolas" w:hAnsi="Consolas"/>
+          <w:sz w:val="18"/>
+        </w:rPr>
+        <w:t>{</w:t>
+      </w:r>
+    </w:p>
+    <w:p>
+      <w:pPr>
+        <w:keepNext/>
+        <w:spacing w:line="240" w:lineRule="auto" w:after="40"/>
+      </w:pPr>
+      <w:r>
+        <w:rPr>
+          <w:rFonts w:ascii="Consolas" w:hAnsi="Consolas"/>
+          <w:sz w:val="18"/>
+        </w:rPr>
+        <w:t>"item_id": "meal_example", "recipe_id": "r02",</w:t>
+      </w:r>
+    </w:p>
+    <w:p>
+      <w:pPr>
+        <w:keepNext/>
+        <w:spacing w:line="240" w:lineRule="auto" w:after="40"/>
+      </w:pPr>
+      <w:r>
+        <w:rPr>
+          <w:rFonts w:ascii="Consolas" w:hAnsi="Consolas"/>
+          <w:sz w:val="18"/>
+        </w:rPr>
+        <w:t>"expected_revision": 0</w:t>
+      </w:r>
+    </w:p>
+    <w:p>
+      <w:pPr>
+        <w:keepNext w:val="0"/>
+        <w:spacing w:line="240" w:lineRule="auto" w:after="40"/>
+      </w:pPr>
+      <w:r>
+        <w:rPr>
+          <w:rFonts w:ascii="Consolas" w:hAnsi="Consolas"/>
+          <w:sz w:val="18"/>
+        </w:rPr>
+        <w:t>}</w:t>
+      </w:r>
+    </w:p>
+    <w:p>
+      <w:pPr>
+        <w:keepNext/>
+        <w:spacing w:line="360" w:lineRule="auto"/>
+        <w:ind w:firstLine="709"/>
+        <w:jc w:val="both"/>
+      </w:pPr>
+      <w:r>
+        <w:t>HTTP 200. JSON-ответ, проекция обновлённого снимка:</w:t>
+      </w:r>
+    </w:p>
+    <w:p>
+      <w:pPr>
+        <w:keepNext/>
+        <w:spacing w:line="240" w:lineRule="auto" w:after="40"/>
+      </w:pPr>
+      <w:r>
+        <w:rPr>
+          <w:rFonts w:ascii="Consolas" w:hAnsi="Consolas"/>
+          <w:sz w:val="18"/>
+        </w:rPr>
+        <w:t>{</w:t>
+      </w:r>
+    </w:p>
+    <w:p>
+      <w:pPr>
+        <w:keepNext/>
+        <w:spacing w:line="240" w:lineRule="auto" w:after="40"/>
+      </w:pPr>
+      <w:r>
+        <w:rPr>
+          <w:rFonts w:ascii="Consolas" w:hAnsi="Consolas"/>
+          <w:sz w:val="18"/>
+        </w:rPr>
+        <w:t>"plan": {</w:t>
+      </w:r>
+    </w:p>
+    <w:p>
+      <w:pPr>
+        <w:keepNext/>
+        <w:spacing w:line="240" w:lineRule="auto" w:after="40"/>
+      </w:pPr>
+      <w:r>
+        <w:rPr>
+          <w:rFonts w:ascii="Consolas" w:hAnsi="Consolas"/>
+          <w:sz w:val="18"/>
+        </w:rPr>
+        <w:t>"id": "plan_example", "status": "draft", "revision": 1,</w:t>
+      </w:r>
+    </w:p>
+    <w:p>
+      <w:pPr>
+        <w:keepNext/>
+        <w:spacing w:line="240" w:lineRule="auto" w:after="40"/>
+      </w:pPr>
+      <w:r>
+        <w:rPr>
+          <w:rFonts w:ascii="Consolas" w:hAnsi="Consolas"/>
+          <w:sz w:val="18"/>
+        </w:rPr>
+        <w:t>"saved_at": null,</w:t>
+      </w:r>
+    </w:p>
+    <w:p>
+      <w:pPr>
+        <w:keepNext/>
+        <w:spacing w:line="240" w:lineRule="auto" w:after="40"/>
+      </w:pPr>
+      <w:r>
+        <w:rPr>
+          <w:rFonts w:ascii="Consolas" w:hAnsi="Consolas"/>
+          <w:sz w:val="18"/>
+        </w:rPr>
+        <w:t>"items": [{"id": "meal_example", "recipe_id": "r02",</w:t>
+      </w:r>
+    </w:p>
+    <w:p>
+      <w:pPr>
+        <w:keepNext/>
+        <w:spacing w:line="240" w:lineRule="auto" w:after="40"/>
+      </w:pPr>
+      <w:r>
+        <w:rPr>
+          <w:rFonts w:ascii="Consolas" w:hAnsi="Consolas"/>
+          <w:sz w:val="18"/>
+        </w:rPr>
+        <w:t>"scale": 1.15, "nutrition": {"kcal": 600.0},</w:t>
+      </w:r>
+    </w:p>
+    <w:p>
+      <w:pPr>
+        <w:keepNext/>
+        <w:spacing w:line="240" w:lineRule="auto" w:after="40"/>
+      </w:pPr>
+      <w:r>
+        <w:rPr>
+          <w:rFonts w:ascii="Consolas" w:hAnsi="Consolas"/>
+          <w:sz w:val="18"/>
+        </w:rPr>
+        <w:t>"estimated_cost_kopecks": 8000}]</w:t>
+      </w:r>
+    </w:p>
+    <w:p>
+      <w:pPr>
+        <w:keepNext/>
+        <w:spacing w:line="240" w:lineRule="auto" w:after="40"/>
+      </w:pPr>
+      <w:r>
+        <w:rPr>
+          <w:rFonts w:ascii="Consolas" w:hAnsi="Consolas"/>
+          <w:sz w:val="18"/>
+        </w:rPr>
+        <w:t>},</w:t>
+      </w:r>
+    </w:p>
+    <w:p>
+      <w:pPr>
+        <w:keepNext/>
+        <w:spacing w:line="240" w:lineRule="auto" w:after="40"/>
+      </w:pPr>
+      <w:r>
+        <w:rPr>
+          <w:rFonts w:ascii="Consolas" w:hAnsi="Consolas"/>
+          <w:sz w:val="18"/>
+        </w:rPr>
+        <w:t>"recommended": "lenta",</w:t>
+      </w:r>
+    </w:p>
+    <w:p>
+      <w:pPr>
+        <w:keepNext/>
+        <w:spacing w:line="240" w:lineRule="auto" w:after="40"/>
+      </w:pPr>
+      <w:r>
+        <w:rPr>
+          <w:rFonts w:ascii="Consolas" w:hAnsi="Consolas"/>
+          <w:sz w:val="18"/>
+        </w:rPr>
+        <w:t>"baskets": [{"id": "lenta", "complete": true,</w:t>
+      </w:r>
+    </w:p>
+    <w:p>
+      <w:pPr>
+        <w:keepNext/>
+        <w:spacing w:line="240" w:lineRule="auto" w:after="40"/>
+      </w:pPr>
+      <w:r>
+        <w:rPr>
+          <w:rFonts w:ascii="Consolas" w:hAnsi="Consolas"/>
+          <w:sz w:val="18"/>
+        </w:rPr>
+        <w:t>"total_kopecks": 315000, "over_budget_kopecks": 0}]</w:t>
+      </w:r>
+    </w:p>
+    <w:p>
+      <w:pPr>
+        <w:keepNext w:val="0"/>
+        <w:spacing w:line="240" w:lineRule="auto" w:after="40"/>
+      </w:pPr>
+      <w:r>
+        <w:rPr>
+          <w:rFonts w:ascii="Consolas" w:hAnsi="Consolas"/>
+          <w:sz w:val="18"/>
+        </w:rPr>
+        <w:t>}</w:t>
+      </w:r>
+    </w:p>
+    <w:p>
+      <w:pPr>
+        <w:spacing w:line="360" w:lineRule="auto"/>
+        <w:ind w:firstLine="709"/>
+        <w:jc w:val="both"/>
+      </w:pPr>
+      <w:r>
+        <w:t>Новое блюдо возвращается в plan.items, новая сумма находится в baskets у recommended. API не возвращает отдельные new_dish или new_total: таких полей в реализации нет. Смена рецепта меняет только указанную позицию и увеличивает revision. Сохранённый план становится черновиком. Сервер заново фильтрует кандидата внутри транзакции, не доверяя открытому ранее окну браузера.</w:t>
+      </w:r>
+    </w:p>
+    <w:p>
+      <w:pPr>
+        <w:spacing w:line="360" w:lineRule="auto"/>
+        <w:ind w:firstLine="709"/>
+        <w:jc w:val="both"/>
+      </w:pPr>
+      <w:r>
+        <w:t>Пример HTTP 409 при устаревшей версии:</w:t>
+      </w:r>
+    </w:p>
+    <w:p>
+      <w:pPr>
+        <w:keepNext/>
+        <w:spacing w:line="240" w:lineRule="auto" w:after="40"/>
+      </w:pPr>
+      <w:r>
+        <w:rPr>
+          <w:rFonts w:ascii="Consolas" w:hAnsi="Consolas"/>
+          <w:sz w:val="18"/>
+        </w:rPr>
+        <w:t>{"error": "План изменился. Запросите альтернативы заново.",</w:t>
+      </w:r>
+    </w:p>
+    <w:p>
+      <w:pPr>
+        <w:keepNext w:val="0"/>
+        <w:spacing w:line="240" w:lineRule="auto" w:after="40"/>
+      </w:pPr>
+      <w:r>
+        <w:rPr>
+          <w:rFonts w:ascii="Consolas" w:hAnsi="Consolas"/>
+          <w:sz w:val="18"/>
+        </w:rPr>
+        <w:t>"code": "PLAN_CHANGED"}</w:t>
+      </w:r>
+    </w:p>
+    <w:p>
+      <w:pPr>
+        <w:spacing w:line="360" w:lineRule="auto"/>
+        <w:ind w:firstLine="709"/>
+        <w:jc w:val="both"/>
+      </w:pPr>
+      <w:r>
+        <w:t>Недопустимая замена возвращает 422, неизвестная или чужая позиция возвращает 404. При ошибке изменения не фиксируются. Для сохранения результата используется существующий POST /api/plan/save с plan_id и expected_revision; он возвращает снимок со status: saved и saved_at.</w:t>
+      </w:r>
+    </w:p>
+    <w:p>
+      <w:pPr>
+        <w:pStyle w:val="2"/>
+      </w:pPr>
+      <w:r>
+        <w:t>5.4 Внутренние контракты</w:t>
+      </w:r>
+    </w:p>
+    <w:p>
+      <w:pPr>
+        <w:keepNext/>
+        <w:spacing w:line="240" w:lineRule="auto" w:after="40"/>
+      </w:pPr>
+      <w:r>
+        <w:rPr>
+          <w:rFonts w:ascii="Consolas" w:hAnsi="Consolas"/>
+          <w:sz w:val="18"/>
+        </w:rPr>
+        <w:t>validate_settings(data: dict) -&gt; dict</w:t>
+      </w:r>
+    </w:p>
+    <w:p>
+      <w:pPr>
+        <w:keepNext/>
+        <w:spacing w:line="240" w:lineRule="auto" w:after="40"/>
+      </w:pPr>
+      <w:r>
+        <w:rPr>
+          <w:rFonts w:ascii="Consolas" w:hAnsi="Consolas"/>
+          <w:sz w:val="18"/>
+        </w:rPr>
+        <w:t>generate_plan(settings: dict, recipes: dict, ingredients: dict) -&gt; list[dict]</w:t>
+      </w:r>
+    </w:p>
+    <w:p>
+      <w:pPr>
+        <w:keepNext/>
+        <w:spacing w:line="240" w:lineRule="auto" w:after="40"/>
+      </w:pPr>
+      <w:r>
+        <w:rPr>
+          <w:rFonts w:ascii="Consolas" w:hAnsi="Consolas"/>
+          <w:sz w:val="18"/>
+        </w:rPr>
+        <w:t>nutrition(recipe: dict, ingredients: dict, scale: float = 1) -&gt; dict</w:t>
+      </w:r>
+    </w:p>
+    <w:p>
+      <w:pPr>
+        <w:keepNext/>
+        <w:spacing w:line="240" w:lineRule="auto" w:after="40"/>
+      </w:pPr>
+      <w:r>
+        <w:rPr>
+          <w:rFonts w:ascii="Consolas" w:hAnsi="Consolas"/>
+          <w:sz w:val="18"/>
+        </w:rPr>
+        <w:t>shopping(items: list, recipes: dict, ingredients: dict, pantry: dict) -&gt; list[dict]</w:t>
+      </w:r>
+    </w:p>
+    <w:p>
+      <w:pPr>
+        <w:keepNext/>
+        <w:spacing w:line="240" w:lineRule="auto" w:after="40"/>
+      </w:pPr>
+      <w:r>
+        <w:rPr>
+          <w:rFonts w:ascii="Consolas" w:hAnsi="Consolas"/>
+          <w:sz w:val="18"/>
+        </w:rPr>
+        <w:t>calculate_baskets(lines: list, stores: list, offers: list, budget: float) -&gt; dict</w:t>
+      </w:r>
+    </w:p>
+    <w:p>
+      <w:pPr>
+        <w:keepNext/>
+        <w:spacing w:line="240" w:lineRule="auto" w:after="40"/>
+      </w:pPr>
+      <w:r>
+        <w:rPr>
+          <w:rFonts w:ascii="Consolas" w:hAnsi="Consolas"/>
+          <w:sz w:val="18"/>
+        </w:rPr>
+        <w:t>DemoPriceProvider.read(db) -&gt; list[dict]</w:t>
+      </w:r>
+    </w:p>
+    <w:p>
+      <w:pPr>
+        <w:keepNext w:val="0"/>
+        <w:spacing w:line="240" w:lineRule="auto" w:after="40"/>
+      </w:pPr>
+      <w:r>
+        <w:rPr>
+          <w:rFonts w:ascii="Consolas" w:hAnsi="Consolas"/>
+          <w:sz w:val="18"/>
+        </w:rPr>
         <w:t>DemoPriceProvider.refresh(db, simulate_failure: bool = False) -&gt; None</w:t>
       </w:r>
     </w:p>
@@ -4507,7 +6297,7 @@
         <w:jc w:val="both"/>
       </w:pPr>
       <w:r>
-        <w:t>Приняты шесть ADR: архитектурный стиль, хранение, детерминированные расчёты, изоляция источника цен, безопасность учётных записей и разделение профиля с планом. Каждый документ содержит контекст с FR/NFR, альтернативы, решение, последствия и роль агента. Полные тексты включены далее; отдельные файлы находятся в docs/lab2/adr/.</w:t>
+        <w:t>Приняты десять ADR. Новые ADR-007–010 уточняют SQLite, Python, серверные расчёты и фильтрацию аллергенов. ADR-006 о разделении профиля и плана сохранён. Полные тексты приведены далее и в docs/lab2/adr/.</w:t>
       </w:r>
     </w:p>
     <w:p>
@@ -4528,7 +6318,7 @@
     </w:p>
     <w:p>
       <w:pPr>
-        <w:pStyle w:val="2"/>
+        <w:pStyle w:val="3"/>
         <w:spacing w:line="288" w:lineRule="auto" w:before="80" w:after="40"/>
       </w:pPr>
       <w:r>
@@ -4559,7 +6349,7 @@
     </w:p>
     <w:p>
       <w:pPr>
-        <w:pStyle w:val="2"/>
+        <w:pStyle w:val="3"/>
         <w:spacing w:line="288" w:lineRule="auto" w:before="80" w:after="40"/>
       </w:pPr>
       <w:r>
@@ -4590,7 +6380,7 @@
     </w:p>
     <w:p>
       <w:pPr>
-        <w:pStyle w:val="2"/>
+        <w:pStyle w:val="3"/>
         <w:spacing w:line="288" w:lineRule="auto" w:before="80" w:after="40"/>
       </w:pPr>
       <w:r>
@@ -4653,7 +6443,7 @@
     </w:p>
     <w:p>
       <w:pPr>
-        <w:pStyle w:val="2"/>
+        <w:pStyle w:val="3"/>
         <w:spacing w:line="288" w:lineRule="auto" w:before="80" w:after="40"/>
       </w:pPr>
       <w:r>
@@ -4684,7 +6474,7 @@
     </w:p>
     <w:p>
       <w:pPr>
-        <w:pStyle w:val="2"/>
+        <w:pStyle w:val="3"/>
         <w:spacing w:line="288" w:lineRule="auto" w:before="80" w:after="40"/>
       </w:pPr>
       <w:r>
@@ -4715,7 +6505,7 @@
     </w:p>
     <w:p>
       <w:pPr>
-        <w:pStyle w:val="2"/>
+        <w:pStyle w:val="3"/>
         <w:spacing w:line="288" w:lineRule="auto" w:before="80" w:after="40"/>
       </w:pPr>
       <w:r>
@@ -4762,7 +6552,7 @@
     </w:p>
     <w:p>
       <w:pPr>
-        <w:pStyle w:val="2"/>
+        <w:pStyle w:val="3"/>
         <w:spacing w:line="288" w:lineRule="auto" w:before="80" w:after="40"/>
       </w:pPr>
       <w:r>
@@ -4793,7 +6583,7 @@
     </w:p>
     <w:p>
       <w:pPr>
-        <w:pStyle w:val="2"/>
+        <w:pStyle w:val="3"/>
         <w:spacing w:line="288" w:lineRule="auto" w:before="80" w:after="40"/>
       </w:pPr>
       <w:r>
@@ -4824,7 +6614,7 @@
     </w:p>
     <w:p>
       <w:pPr>
-        <w:pStyle w:val="2"/>
+        <w:pStyle w:val="3"/>
         <w:spacing w:line="288" w:lineRule="auto" w:before="80" w:after="40"/>
       </w:pPr>
       <w:r>
@@ -4887,7 +6677,7 @@
     </w:p>
     <w:p>
       <w:pPr>
-        <w:pStyle w:val="2"/>
+        <w:pStyle w:val="3"/>
         <w:spacing w:line="288" w:lineRule="auto" w:before="80" w:after="40"/>
       </w:pPr>
       <w:r>
@@ -4918,7 +6708,7 @@
     </w:p>
     <w:p>
       <w:pPr>
-        <w:pStyle w:val="2"/>
+        <w:pStyle w:val="3"/>
         <w:spacing w:line="288" w:lineRule="auto" w:before="80" w:after="40"/>
       </w:pPr>
       <w:r>
@@ -4949,7 +6739,7 @@
     </w:p>
     <w:p>
       <w:pPr>
-        <w:pStyle w:val="2"/>
+        <w:pStyle w:val="3"/>
         <w:spacing w:line="288" w:lineRule="auto" w:before="80" w:after="40"/>
       </w:pPr>
       <w:r>
@@ -4996,7 +6786,7 @@
     </w:p>
     <w:p>
       <w:pPr>
-        <w:pStyle w:val="2"/>
+        <w:pStyle w:val="3"/>
         <w:spacing w:line="288" w:lineRule="auto" w:before="80" w:after="40"/>
       </w:pPr>
       <w:r>
@@ -5027,7 +6817,7 @@
     </w:p>
     <w:p>
       <w:pPr>
-        <w:pStyle w:val="2"/>
+        <w:pStyle w:val="3"/>
         <w:spacing w:line="288" w:lineRule="auto" w:before="80" w:after="40"/>
       </w:pPr>
       <w:r>
@@ -5058,7 +6848,7 @@
     </w:p>
     <w:p>
       <w:pPr>
-        <w:pStyle w:val="2"/>
+        <w:pStyle w:val="3"/>
         <w:spacing w:line="288" w:lineRule="auto" w:before="80" w:after="40"/>
       </w:pPr>
       <w:r>
@@ -5121,7 +6911,7 @@
     </w:p>
     <w:p>
       <w:pPr>
-        <w:pStyle w:val="2"/>
+        <w:pStyle w:val="3"/>
         <w:spacing w:line="288" w:lineRule="auto" w:before="80" w:after="40"/>
       </w:pPr>
       <w:r>
@@ -5152,7 +6942,7 @@
     </w:p>
     <w:p>
       <w:pPr>
-        <w:pStyle w:val="2"/>
+        <w:pStyle w:val="3"/>
         <w:spacing w:line="288" w:lineRule="auto" w:before="80" w:after="40"/>
       </w:pPr>
       <w:r>
@@ -5183,7 +6973,7 @@
     </w:p>
     <w:p>
       <w:pPr>
-        <w:pStyle w:val="2"/>
+        <w:pStyle w:val="3"/>
         <w:spacing w:line="288" w:lineRule="auto" w:before="80" w:after="40"/>
       </w:pPr>
       <w:r>
@@ -5230,7 +7020,7 @@
     </w:p>
     <w:p>
       <w:pPr>
-        <w:pStyle w:val="2"/>
+        <w:pStyle w:val="3"/>
         <w:spacing w:line="288" w:lineRule="auto" w:before="80" w:after="40"/>
       </w:pPr>
       <w:r>
@@ -5261,7 +7051,7 @@
     </w:p>
     <w:p>
       <w:pPr>
-        <w:pStyle w:val="2"/>
+        <w:pStyle w:val="3"/>
         <w:spacing w:line="288" w:lineRule="auto" w:before="80" w:after="40"/>
       </w:pPr>
       <w:r>
@@ -5292,7 +7082,7 @@
     </w:p>
     <w:p>
       <w:pPr>
-        <w:pStyle w:val="2"/>
+        <w:pStyle w:val="3"/>
         <w:spacing w:line="288" w:lineRule="auto" w:before="80" w:after="40"/>
       </w:pPr>
       <w:r>
@@ -5355,7 +7145,7 @@
     </w:p>
     <w:p>
       <w:pPr>
-        <w:pStyle w:val="2"/>
+        <w:pStyle w:val="3"/>
         <w:spacing w:line="288" w:lineRule="auto" w:before="80" w:after="40"/>
       </w:pPr>
       <w:r>
@@ -5386,7 +7176,7 @@
     </w:p>
     <w:p>
       <w:pPr>
-        <w:pStyle w:val="2"/>
+        <w:pStyle w:val="3"/>
         <w:spacing w:line="288" w:lineRule="auto" w:before="80" w:after="40"/>
       </w:pPr>
       <w:r>
@@ -5417,7 +7207,7 @@
     </w:p>
     <w:p>
       <w:pPr>
-        <w:pStyle w:val="2"/>
+        <w:pStyle w:val="3"/>
         <w:spacing w:line="288" w:lineRule="auto" w:before="80" w:after="40"/>
       </w:pPr>
       <w:r>
@@ -5464,7 +7254,7 @@
     </w:p>
     <w:p>
       <w:pPr>
-        <w:pStyle w:val="2"/>
+        <w:pStyle w:val="3"/>
         <w:spacing w:line="288" w:lineRule="auto" w:before="80" w:after="40"/>
       </w:pPr>
       <w:r>
@@ -5495,7 +7285,7 @@
     </w:p>
     <w:p>
       <w:pPr>
-        <w:pStyle w:val="2"/>
+        <w:pStyle w:val="3"/>
         <w:spacing w:line="288" w:lineRule="auto" w:before="80" w:after="40"/>
       </w:pPr>
       <w:r>
@@ -5526,7 +7316,7 @@
     </w:p>
     <w:p>
       <w:pPr>
-        <w:pStyle w:val="2"/>
+        <w:pStyle w:val="3"/>
         <w:spacing w:line="288" w:lineRule="auto" w:before="80" w:after="40"/>
       </w:pPr>
       <w:r>
@@ -5589,7 +7379,7 @@
     </w:p>
     <w:p>
       <w:pPr>
-        <w:pStyle w:val="2"/>
+        <w:pStyle w:val="3"/>
         <w:spacing w:line="288" w:lineRule="auto" w:before="80" w:after="40"/>
       </w:pPr>
       <w:r>
@@ -5620,7 +7410,7 @@
     </w:p>
     <w:p>
       <w:pPr>
-        <w:pStyle w:val="2"/>
+        <w:pStyle w:val="3"/>
         <w:spacing w:line="288" w:lineRule="auto" w:before="80" w:after="40"/>
       </w:pPr>
       <w:r>
@@ -5651,7 +7441,7 @@
     </w:p>
     <w:p>
       <w:pPr>
-        <w:pStyle w:val="2"/>
+        <w:pStyle w:val="3"/>
         <w:spacing w:line="288" w:lineRule="auto" w:before="80" w:after="40"/>
       </w:pPr>
       <w:r>
@@ -5698,7 +7488,241 @@
     </w:p>
     <w:p>
       <w:pPr>
+        <w:pStyle w:val="3"/>
+        <w:spacing w:line="288" w:lineRule="auto" w:before="80" w:after="40"/>
+      </w:pPr>
+      <w:r>
+        <w:rPr>
+          <w:rFonts w:ascii="Times New Roman" w:hAnsi="Times New Roman"/>
+          <w:b/>
+          <w:color w:val="000000"/>
+          <w:sz w:val="24"/>
+        </w:rPr>
+        <w:t>Статус</w:t>
+      </w:r>
+    </w:p>
+    <w:p>
+      <w:pPr>
+        <w:spacing w:line="288" w:lineRule="auto" w:after="40"/>
+        <w:ind w:firstLine="709"/>
+        <w:jc w:val="both"/>
+      </w:pPr>
+      <w:r>
+        <w:rPr>
+          <w:rFonts w:ascii="Times New Roman" w:hAnsi="Times New Roman"/>
+          <w:b w:val="0"/>
+          <w:color w:val="000000"/>
+          <w:sz w:val="24"/>
+        </w:rPr>
+        <w:t>Принято</w:t>
+      </w:r>
+    </w:p>
+    <w:p>
+      <w:pPr>
+        <w:pStyle w:val="3"/>
+        <w:spacing w:line="288" w:lineRule="auto" w:before="80" w:after="40"/>
+      </w:pPr>
+      <w:r>
+        <w:rPr>
+          <w:rFonts w:ascii="Times New Roman" w:hAnsi="Times New Roman"/>
+          <w:b/>
+          <w:color w:val="000000"/>
+          <w:sz w:val="24"/>
+        </w:rPr>
+        <w:t>Контекст</w:t>
+      </w:r>
+    </w:p>
+    <w:p>
+      <w:pPr>
+        <w:spacing w:line="288" w:lineRule="auto" w:after="40"/>
+        <w:ind w:firstLine="709"/>
+        <w:jc w:val="both"/>
+      </w:pPr>
+      <w:r>
+        <w:rPr>
+          <w:rFonts w:ascii="Times New Roman" w:hAnsi="Times New Roman"/>
+          <w:b w:val="0"/>
+          <w:color w:val="000000"/>
+          <w:sz w:val="24"/>
+        </w:rPr>
+        <w:t>FR-01 предусматривает регистрацию, FR-02 и FR-03 задают параметры человека и исключения, FR-05 и FR-15 относятся к плану на выбранный период. В задании пользователя от 26.10.2026 после регистрации обязателен профиль из трёх шагов и сводки, затем дашборд и отдельная настройка плана.</w:t>
+      </w:r>
+    </w:p>
+    <w:p>
+      <w:pPr>
+        <w:pStyle w:val="3"/>
+        <w:spacing w:line="288" w:lineRule="auto" w:before="80" w:after="40"/>
+      </w:pPr>
+      <w:r>
+        <w:rPr>
+          <w:rFonts w:ascii="Times New Roman" w:hAnsi="Times New Roman"/>
+          <w:b/>
+          <w:color w:val="000000"/>
+          <w:sz w:val="24"/>
+        </w:rPr>
+        <w:t>Рассмотренные альтернативы</w:t>
+      </w:r>
+    </w:p>
+    <w:p>
+      <w:pPr>
+        <w:spacing w:line="288" w:lineRule="auto" w:after="40"/>
+        <w:ind w:firstLine="709"/>
+        <w:jc w:val="both"/>
+      </w:pPr>
+      <w:r>
+        <w:rPr>
+          <w:rFonts w:ascii="Times New Roman" w:hAnsi="Times New Roman"/>
+          <w:b w:val="0"/>
+          <w:color w:val="000000"/>
+          <w:sz w:val="24"/>
+        </w:rPr>
+        <w:t>1. Одна форма: меньше экранов, но смешивает устойчивые данные с периодом и не соответствует заданному потоку.</w:t>
+      </w:r>
+    </w:p>
+    <w:p>
+      <w:pPr>
+        <w:spacing w:line="288" w:lineRule="auto" w:after="40"/>
+        <w:ind w:firstLine="709"/>
+        <w:jc w:val="both"/>
+      </w:pPr>
+      <w:r>
+        <w:rPr>
+          <w:rFonts w:ascii="Times New Roman" w:hAnsi="Times New Roman"/>
+          <w:b w:val="0"/>
+          <w:color w:val="000000"/>
+          <w:sz w:val="24"/>
+        </w:rPr>
+        <w:t>2. Пропускаемый профиль: быстрее открывает приложение, но допускает расчёт без обязательных исходных данных.</w:t>
+      </w:r>
+    </w:p>
+    <w:p>
+      <w:pPr>
+        <w:spacing w:line="288" w:lineRule="auto" w:after="40"/>
+        <w:ind w:firstLine="709"/>
+        <w:jc w:val="both"/>
+      </w:pPr>
+      <w:r>
+        <w:rPr>
+          <w:rFonts w:ascii="Times New Roman" w:hAnsi="Times New Roman"/>
+          <w:b w:val="0"/>
+          <w:color w:val="000000"/>
+          <w:sz w:val="24"/>
+        </w:rPr>
+        <w:t>3. Только localStorage: не требует серверного маршрута, но готовый профиль оказывается привязан к одному браузеру и расходится с существующей авторизацией.</w:t>
+      </w:r>
+    </w:p>
+    <w:p>
+      <w:pPr>
+        <w:pStyle w:val="3"/>
+        <w:spacing w:line="288" w:lineRule="auto" w:before="80" w:after="40"/>
+      </w:pPr>
+      <w:r>
+        <w:rPr>
+          <w:rFonts w:ascii="Times New Roman" w:hAnsi="Times New Roman"/>
+          <w:b/>
+          <w:color w:val="000000"/>
+          <w:sz w:val="24"/>
+        </w:rPr>
+        <w:t>Принятое решение</w:t>
+      </w:r>
+    </w:p>
+    <w:p>
+      <w:pPr>
+        <w:spacing w:line="288" w:lineRule="auto" w:after="40"/>
+        <w:ind w:firstLine="709"/>
+        <w:jc w:val="both"/>
+      </w:pPr>
+      <w:r>
+        <w:rPr>
+          <w:rFonts w:ascii="Times New Roman" w:hAnsi="Times New Roman"/>
+          <w:b w:val="0"/>
+          <w:color w:val="000000"/>
+          <w:sz w:val="24"/>
+        </w:rPr>
+        <w:t>Хранить профиль в profiles отдельно от снимка settings_json конкретного плана. Ввести PUT /api/profile и серверную проверку profile_complete перед генерацией. Черновик шагов хранить в localStorage по аккаунту; после успешного сохранения удалять его и переходить на дашборд. Для ограниченных чисел применять заданные пользователем шкалы, подтверждая значения серверной валидацией. В плане сохранять отпечаток значимых параметров профиля, чтобы не выдавать старый рацион за актуальный после изменения исключений.</w:t>
+      </w:r>
+    </w:p>
+    <w:p>
+      <w:pPr>
+        <w:pStyle w:val="3"/>
+        <w:spacing w:line="288" w:lineRule="auto" w:before="80" w:after="40"/>
+      </w:pPr>
+      <w:r>
+        <w:rPr>
+          <w:rFonts w:ascii="Times New Roman" w:hAnsi="Times New Roman"/>
+          <w:b/>
+          <w:color w:val="000000"/>
+          <w:sz w:val="24"/>
+        </w:rPr>
+        <w:t>Последствия</w:t>
+      </w:r>
+    </w:p>
+    <w:p>
+      <w:pPr>
+        <w:spacing w:line="288" w:lineRule="auto" w:after="40"/>
+        <w:ind w:firstLine="709"/>
+        <w:jc w:val="both"/>
+      </w:pPr>
+      <w:r>
+        <w:rPr>
+          <w:rFonts w:ascii="Times New Roman" w:hAnsi="Times New Roman"/>
+          <w:b w:val="0"/>
+          <w:color w:val="000000"/>
+          <w:sz w:val="24"/>
+        </w:rPr>
+        <w:t>Повторный план не требует заново заполнять профиль. Возврат и перезагрузка не стирают черновик. Усложняется синхронизация черновика и готового профиля; теперь есть два состояния данных. Старый план после изменения параметров нужно пересоставить, хотя запись сохраняется. Дополнительный API требует проверки входных значений и принадлежности аккаунту. Автоматический расчёт для возраста 14-17 лет в этой итерации не добавляется.</w:t>
+      </w:r>
+    </w:p>
+    <w:p>
+      <w:pPr>
+        <w:pStyle w:val="3"/>
+        <w:spacing w:line="288" w:lineRule="auto" w:before="80" w:after="40"/>
+      </w:pPr>
+      <w:r>
+        <w:rPr>
+          <w:rFonts w:ascii="Times New Roman" w:hAnsi="Times New Roman"/>
+          <w:b/>
+          <w:color w:val="000000"/>
+          <w:sz w:val="24"/>
+        </w:rPr>
+        <w:t>Роль агента</w:t>
+      </w:r>
+    </w:p>
+    <w:p>
+      <w:pPr>
+        <w:spacing w:line="288" w:lineRule="auto" w:after="40"/>
+        <w:ind w:firstLine="709"/>
+        <w:jc w:val="both"/>
+      </w:pPr>
+      <w:r>
+        <w:rPr>
+          <w:rFonts w:ascii="Times New Roman" w:hAnsi="Times New Roman"/>
+          <w:b w:val="0"/>
+          <w:color w:val="000000"/>
+          <w:sz w:val="24"/>
+        </w:rPr>
+        <w:t>Пользователь сформулировал явную задачу с четырьмя состояниями онбординга и дашбордом. Агент разделил модели, реализовал формы и серверную защиту, сохранил заданные диапазоны шкал, добавил тесты возврата, перезагрузки и обхода маршрута. Отпечаток плана предложен и реализован агентом как защита от скрытого использования старых ограничений. Числовые поля и одна общая форма рассмотрены при реализации и отклонены по требованиям этого запроса.</w:t>
+      </w:r>
+    </w:p>
+    <w:p>
+      <w:pPr>
         <w:pStyle w:val="2"/>
+        <w:pageBreakBefore/>
+        <w:spacing w:line="288" w:lineRule="auto" w:before="160" w:after="80"/>
+      </w:pPr>
+      <w:r>
+        <w:rPr>
+          <w:rFonts w:ascii="Times New Roman" w:hAnsi="Times New Roman"/>
+          <w:b/>
+          <w:color w:val="000000"/>
+          <w:sz w:val="28"/>
+        </w:rPr>
+        <w:t>ADR-007 SQLite для локального прототипа</w:t>
+      </w:r>
+    </w:p>
+    <w:p>
+      <w:pPr>
+        <w:pStyle w:val="3"/>
         <w:spacing w:line="288" w:lineRule="auto" w:before="80" w:after="40"/>
       </w:pPr>
       <w:r>
@@ -5724,12 +7748,214 @@
           <w:color w:val="000000"/>
           <w:sz w:val="24"/>
         </w:rPr>
-        <w:t>Принято</w:t>
+        <w:t>Принято. Уточнение архитектуры действующего прототипа от 26.10.2026.</w:t>
+      </w:r>
+    </w:p>
+    <w:p>
+      <w:pPr>
+        <w:pStyle w:val="3"/>
+        <w:spacing w:line="288" w:lineRule="auto" w:before="80" w:after="40"/>
+      </w:pPr>
+      <w:r>
+        <w:rPr>
+          <w:rFonts w:ascii="Times New Roman" w:hAnsi="Times New Roman"/>
+          <w:b/>
+          <w:color w:val="000000"/>
+          <w:sz w:val="24"/>
+        </w:rPr>
+        <w:t>Контекст</w:t>
+      </w:r>
+    </w:p>
+    <w:p>
+      <w:pPr>
+        <w:spacing w:line="288" w:lineRule="auto" w:after="40"/>
+        <w:ind w:firstLine="709"/>
+        <w:jc w:val="both"/>
+      </w:pPr>
+      <w:r>
+        <w:rPr>
+          <w:rFonts w:ascii="Times New Roman" w:hAnsi="Times New Roman"/>
+          <w:b w:val="0"/>
+          <w:color w:val="000000"/>
+          <w:sz w:val="24"/>
+        </w:rPr>
+        <w:t>Данные профиля, планов и каталога уже хранятся через sqlite3. FR-01 и FR-10 требуют сохранения между сеансами, FR-05 и FR-07 требуют целостных изменений. ADR-002 зафиксировал способ хранения; этот ADR уточняет выбор СУБД для текущего масштаба.</w:t>
+      </w:r>
+    </w:p>
+    <w:p>
+      <w:pPr>
+        <w:pStyle w:val="3"/>
+        <w:spacing w:line="288" w:lineRule="auto" w:before="80" w:after="40"/>
+      </w:pPr>
+      <w:r>
+        <w:rPr>
+          <w:rFonts w:ascii="Times New Roman" w:hAnsi="Times New Roman"/>
+          <w:b/>
+          <w:color w:val="000000"/>
+          <w:sz w:val="24"/>
+        </w:rPr>
+        <w:t>Проблема</w:t>
+      </w:r>
+    </w:p>
+    <w:p>
+      <w:pPr>
+        <w:spacing w:line="288" w:lineRule="auto" w:after="40"/>
+        <w:ind w:firstLine="709"/>
+        <w:jc w:val="both"/>
+      </w:pPr>
+      <w:r>
+        <w:rPr>
+          <w:rFonts w:ascii="Times New Roman" w:hAnsi="Times New Roman"/>
+          <w:b w:val="0"/>
+          <w:color w:val="000000"/>
+          <w:sz w:val="24"/>
+        </w:rPr>
+        <w:t>Нужна база, которую можно запустить на защите без отдельного сервиса, сохранив транзакции, уникальность и внешние ключи.</w:t>
+      </w:r>
+    </w:p>
+    <w:p>
+      <w:pPr>
+        <w:pStyle w:val="3"/>
+        <w:spacing w:line="288" w:lineRule="auto" w:before="80" w:after="40"/>
+      </w:pPr>
+      <w:r>
+        <w:rPr>
+          <w:rFonts w:ascii="Times New Roman" w:hAnsi="Times New Roman"/>
+          <w:b/>
+          <w:color w:val="000000"/>
+          <w:sz w:val="24"/>
+        </w:rPr>
+        <w:t>Рассмотренные альтернативы</w:t>
+      </w:r>
+    </w:p>
+    <w:p>
+      <w:pPr>
+        <w:spacing w:line="288" w:lineRule="auto" w:after="40"/>
+        <w:ind w:firstLine="709"/>
+        <w:jc w:val="both"/>
+      </w:pPr>
+      <w:r>
+        <w:rPr>
+          <w:rFonts w:ascii="Times New Roman" w:hAnsi="Times New Roman"/>
+          <w:b w:val="0"/>
+          <w:color w:val="000000"/>
+          <w:sz w:val="24"/>
+        </w:rPr>
+        <w:t>PostgreSQL требует отдельного сервера, конфигурации доступа и доставки окружения. JSON-файл потребовал бы ручной реализации связей и согласованной записи. localStorage подходит для черновика формы, но не для общей серверной базы.</w:t>
+      </w:r>
+    </w:p>
+    <w:p>
+      <w:pPr>
+        <w:pStyle w:val="3"/>
+        <w:spacing w:line="288" w:lineRule="auto" w:before="80" w:after="40"/>
+      </w:pPr>
+      <w:r>
+        <w:rPr>
+          <w:rFonts w:ascii="Times New Roman" w:hAnsi="Times New Roman"/>
+          <w:b/>
+          <w:color w:val="000000"/>
+          <w:sz w:val="24"/>
+        </w:rPr>
+        <w:t>Принятое решение</w:t>
+      </w:r>
+    </w:p>
+    <w:p>
+      <w:pPr>
+        <w:spacing w:line="288" w:lineRule="auto" w:after="40"/>
+        <w:ind w:firstLine="709"/>
+        <w:jc w:val="both"/>
+      </w:pPr>
+      <w:r>
+        <w:rPr>
+          <w:rFonts w:ascii="Times New Roman" w:hAnsi="Times New Roman"/>
+          <w:b w:val="0"/>
+          <w:color w:val="000000"/>
+          <w:sz w:val="24"/>
+        </w:rPr>
+        <w:t>Оставить SQLite. Соединение создаётся на запрос, foreign_keys включается явно. Новый план и его позиции записываются вместе; замена использует BEGIN IMMEDIATE и номер revision. SQL-значения передаются параметрами. Это уточнение ADR-002, а не смена хранилища.</w:t>
+      </w:r>
+    </w:p>
+    <w:p>
+      <w:pPr>
+        <w:pStyle w:val="3"/>
+        <w:spacing w:line="288" w:lineRule="auto" w:before="80" w:after="40"/>
+      </w:pPr>
+      <w:r>
+        <w:rPr>
+          <w:rFonts w:ascii="Times New Roman" w:hAnsi="Times New Roman"/>
+          <w:b/>
+          <w:color w:val="000000"/>
+          <w:sz w:val="24"/>
+        </w:rPr>
+        <w:t>Последствия</w:t>
+      </w:r>
+    </w:p>
+    <w:p>
+      <w:pPr>
+        <w:spacing w:line="288" w:lineRule="auto" w:after="40"/>
+        <w:ind w:firstLine="709"/>
+        <w:jc w:val="both"/>
+      </w:pPr>
+      <w:r>
+        <w:rPr>
+          <w:rFonts w:ascii="Times New Roman" w:hAnsi="Times New Roman"/>
+          <w:b w:val="0"/>
+          <w:color w:val="000000"/>
+          <w:sz w:val="24"/>
+        </w:rPr>
+        <w:t>Упрощаются установка и резервное копирование. Записи конкурируют за блокировку файла; многопользовательская нагрузка в этой итерации не измерялась. При переходе к публичному сервису потребуется оценить PostgreSQL и подготовить миграции. JSON-состав рецептов пока не имеет SQL FK.</w:t>
+      </w:r>
+    </w:p>
+    <w:p>
+      <w:pPr>
+        <w:pStyle w:val="3"/>
+        <w:spacing w:line="288" w:lineRule="auto" w:before="80" w:after="40"/>
+      </w:pPr>
+      <w:r>
+        <w:rPr>
+          <w:rFonts w:ascii="Times New Roman" w:hAnsi="Times New Roman"/>
+          <w:b/>
+          <w:color w:val="000000"/>
+          <w:sz w:val="24"/>
+        </w:rPr>
+        <w:t>Роль агента</w:t>
+      </w:r>
+    </w:p>
+    <w:p>
+      <w:pPr>
+        <w:spacing w:line="288" w:lineRule="auto" w:after="40"/>
+        <w:ind w:firstLine="709"/>
+        <w:jc w:val="both"/>
+      </w:pPr>
+      <w:r>
+        <w:rPr>
+          <w:rFonts w:ascii="Times New Roman" w:hAnsi="Times New Roman"/>
+          <w:b w:val="0"/>
+          <w:color w:val="000000"/>
+          <w:sz w:val="24"/>
+        </w:rPr>
+        <w:t>Агент сопоставил решение с schema.sql и обработчиками server.py. В этой документальной итерации код и база не изменялись; новые испытания производительности не проводились.</w:t>
       </w:r>
     </w:p>
     <w:p>
       <w:pPr>
         <w:pStyle w:val="2"/>
+        <w:pageBreakBefore/>
+        <w:spacing w:line="288" w:lineRule="auto" w:before="160" w:after="80"/>
+      </w:pPr>
+      <w:r>
+        <w:rPr>
+          <w:rFonts w:ascii="Times New Roman" w:hAnsi="Times New Roman"/>
+          <w:b/>
+          <w:color w:val="000000"/>
+          <w:sz w:val="28"/>
+        </w:rPr>
+        <w:t>ADR-008 Python для серверной логики</w:t>
+      </w:r>
+    </w:p>
+    <w:p>
+      <w:pPr>
+        <w:pStyle w:val="3"/>
         <w:spacing w:line="288" w:lineRule="auto" w:before="80" w:after="40"/>
       </w:pPr>
       <w:r>
@@ -5739,6 +7965,37 @@
           <w:color w:val="000000"/>
           <w:sz w:val="24"/>
         </w:rPr>
+        <w:t>Статус</w:t>
+      </w:r>
+    </w:p>
+    <w:p>
+      <w:pPr>
+        <w:spacing w:line="288" w:lineRule="auto" w:after="40"/>
+        <w:ind w:firstLine="709"/>
+        <w:jc w:val="both"/>
+      </w:pPr>
+      <w:r>
+        <w:rPr>
+          <w:rFonts w:ascii="Times New Roman" w:hAnsi="Times New Roman"/>
+          <w:b w:val="0"/>
+          <w:color w:val="000000"/>
+          <w:sz w:val="24"/>
+        </w:rPr>
+        <w:t>Принято. Уточнение архитектуры действующего прототипа от 26.10.2026.</w:t>
+      </w:r>
+    </w:p>
+    <w:p>
+      <w:pPr>
+        <w:pStyle w:val="3"/>
+        <w:spacing w:line="288" w:lineRule="auto" w:before="80" w:after="40"/>
+      </w:pPr>
+      <w:r>
+        <w:rPr>
+          <w:rFonts w:ascii="Times New Roman" w:hAnsi="Times New Roman"/>
+          <w:b/>
+          <w:color w:val="000000"/>
+          <w:sz w:val="24"/>
+        </w:rPr>
         <w:t>Контекст</w:t>
       </w:r>
     </w:p>
@@ -5755,12 +8012,183 @@
           <w:color w:val="000000"/>
           <w:sz w:val="24"/>
         </w:rPr>
-        <w:t>FR-01 предусматривает регистрацию, FR-02 и FR-03 задают параметры человека и исключения, FR-05 и FR-15 относятся к плану на выбранный период. В задании пользователя от 26.10.2026 после регистрации обязателен профиль из трёх шагов и сводки, затем дашборд и отдельная настройка плана.</w:t>
+        <w:t>Действующий сервер использует Python, http.server, sqlite3 и bcrypt. Расчёты вынесены в domain.py, проверка профиля в profiles.py, замены в replacements.py, источник учебных цен в prices.py.</w:t>
+      </w:r>
+    </w:p>
+    <w:p>
+      <w:pPr>
+        <w:pStyle w:val="3"/>
+        <w:spacing w:line="288" w:lineRule="auto" w:before="80" w:after="40"/>
+      </w:pPr>
+      <w:r>
+        <w:rPr>
+          <w:rFonts w:ascii="Times New Roman" w:hAnsi="Times New Roman"/>
+          <w:b/>
+          <w:color w:val="000000"/>
+          <w:sz w:val="24"/>
+        </w:rPr>
+        <w:t>Проблема</w:t>
+      </w:r>
+    </w:p>
+    <w:p>
+      <w:pPr>
+        <w:spacing w:line="288" w:lineRule="auto" w:after="40"/>
+        <w:ind w:firstLine="709"/>
+        <w:jc w:val="both"/>
+      </w:pPr>
+      <w:r>
+        <w:rPr>
+          <w:rFonts w:ascii="Times New Roman" w:hAnsi="Times New Roman"/>
+          <w:b w:val="0"/>
+          <w:color w:val="000000"/>
+          <w:sz w:val="24"/>
+        </w:rPr>
+        <w:t>Нужно сохранить понятный и воспроизводимый прототип без сборки фронтенда и без повторной реализации готовых расчётов на другом языке.</w:t>
+      </w:r>
+    </w:p>
+    <w:p>
+      <w:pPr>
+        <w:pStyle w:val="3"/>
+        <w:spacing w:line="288" w:lineRule="auto" w:before="80" w:after="40"/>
+      </w:pPr>
+      <w:r>
+        <w:rPr>
+          <w:rFonts w:ascii="Times New Roman" w:hAnsi="Times New Roman"/>
+          <w:b/>
+          <w:color w:val="000000"/>
+          <w:sz w:val="24"/>
+        </w:rPr>
+        <w:t>Рассмотренные альтернативы</w:t>
+      </w:r>
+    </w:p>
+    <w:p>
+      <w:pPr>
+        <w:spacing w:line="288" w:lineRule="auto" w:after="40"/>
+        <w:ind w:firstLine="709"/>
+        <w:jc w:val="both"/>
+      </w:pPr>
+      <w:r>
+        <w:rPr>
+          <w:rFonts w:ascii="Times New Roman" w:hAnsi="Times New Roman"/>
+          <w:b w:val="0"/>
+          <w:color w:val="000000"/>
+          <w:sz w:val="24"/>
+        </w:rPr>
+        <w:t>Node.js позволил бы использовать JavaScript на обеих сторонах, но потребовал бы переноса расчётов и слоя БД. Python с FastAPI дал бы декларативные контракты, но добавил бы зависимости и настройку приложения. Переписывание на Java или C# не решает задачу текущей итерации.</w:t>
+      </w:r>
+    </w:p>
+    <w:p>
+      <w:pPr>
+        <w:pStyle w:val="3"/>
+        <w:spacing w:line="288" w:lineRule="auto" w:before="80" w:after="40"/>
+      </w:pPr>
+      <w:r>
+        <w:rPr>
+          <w:rFonts w:ascii="Times New Roman" w:hAnsi="Times New Roman"/>
+          <w:b/>
+          <w:color w:val="000000"/>
+          <w:sz w:val="24"/>
+        </w:rPr>
+        <w:t>Принятое решение</w:t>
+      </w:r>
+    </w:p>
+    <w:p>
+      <w:pPr>
+        <w:spacing w:line="288" w:lineRule="auto" w:after="40"/>
+        <w:ind w:firstLine="709"/>
+        <w:jc w:val="both"/>
+      </w:pPr>
+      <w:r>
+        <w:rPr>
+          <w:rFonts w:ascii="Times New Roman" w:hAnsi="Times New Roman"/>
+          <w:b w:val="0"/>
+          <w:color w:val="000000"/>
+          <w:sz w:val="24"/>
+        </w:rPr>
+        <w:t>Продолжать использовать Python 3.10+ и стандартный ThreadingHTTPServer для локальной демонстрации. Оставить один серверный процесс и модули по ответственности. Внешняя зависимость приложения нужна для bcrypt; инструменты построения отчёта не входят в рабочий стек.</w:t>
+      </w:r>
+    </w:p>
+    <w:p>
+      <w:pPr>
+        <w:pStyle w:val="3"/>
+        <w:spacing w:line="288" w:lineRule="auto" w:before="80" w:after="40"/>
+      </w:pPr>
+      <w:r>
+        <w:rPr>
+          <w:rFonts w:ascii="Times New Roman" w:hAnsi="Times New Roman"/>
+          <w:b/>
+          <w:color w:val="000000"/>
+          <w:sz w:val="24"/>
+        </w:rPr>
+        <w:t>Последствия</w:t>
+      </w:r>
+    </w:p>
+    <w:p>
+      <w:pPr>
+        <w:spacing w:line="288" w:lineRule="auto" w:after="40"/>
+        <w:ind w:firstLine="709"/>
+        <w:jc w:val="both"/>
+      </w:pPr>
+      <w:r>
+        <w:rPr>
+          <w:rFonts w:ascii="Times New Roman" w:hAnsi="Times New Roman"/>
+          <w:b w:val="0"/>
+          <w:color w:val="000000"/>
+          <w:sz w:val="24"/>
+        </w:rPr>
+        <w:t>Сохраняется простой запуск и единое место вычислений. Валидация маршрутов написана вручную, интерактивная спецификация OpenAPI отсутствует. http.server не является выбранным сервером публичного продукта. Перед публикацией нужны сервер приложений, HTTPS и пересмотр эксплуатации.</w:t>
+      </w:r>
+    </w:p>
+    <w:p>
+      <w:pPr>
+        <w:pStyle w:val="3"/>
+        <w:spacing w:line="288" w:lineRule="auto" w:before="80" w:after="40"/>
+      </w:pPr>
+      <w:r>
+        <w:rPr>
+          <w:rFonts w:ascii="Times New Roman" w:hAnsi="Times New Roman"/>
+          <w:b/>
+          <w:color w:val="000000"/>
+          <w:sz w:val="24"/>
+        </w:rPr>
+        <w:t>Роль агента</w:t>
+      </w:r>
+    </w:p>
+    <w:p>
+      <w:pPr>
+        <w:spacing w:line="288" w:lineRule="auto" w:after="40"/>
+        <w:ind w:firstLine="709"/>
+        <w:jc w:val="both"/>
+      </w:pPr>
+      <w:r>
+        <w:rPr>
+          <w:rFonts w:ascii="Times New Roman" w:hAnsi="Times New Roman"/>
+          <w:b w:val="0"/>
+          <w:color w:val="000000"/>
+          <w:sz w:val="24"/>
+        </w:rPr>
+        <w:t>Агент описал существующее разбиение модулей и альтернативы без изменения стека. Заявление о сравнительной скорости языков не делается, соответствующих измерений нет.</w:t>
       </w:r>
     </w:p>
     <w:p>
       <w:pPr>
         <w:pStyle w:val="2"/>
+        <w:pageBreakBefore/>
+        <w:spacing w:line="288" w:lineRule="auto" w:before="160" w:after="80"/>
+      </w:pPr>
+      <w:r>
+        <w:rPr>
+          <w:rFonts w:ascii="Times New Roman" w:hAnsi="Times New Roman"/>
+          <w:b/>
+          <w:color w:val="000000"/>
+          <w:sz w:val="28"/>
+        </w:rPr>
+        <w:t>ADR-009 Расчёт калорий и корзин на сервере</w:t>
+      </w:r>
+    </w:p>
+    <w:p>
+      <w:pPr>
+        <w:pStyle w:val="3"/>
         <w:spacing w:line="288" w:lineRule="auto" w:before="80" w:after="40"/>
       </w:pPr>
       <w:r>
@@ -5770,6 +8198,99 @@
           <w:color w:val="000000"/>
           <w:sz w:val="24"/>
         </w:rPr>
+        <w:t>Статус</w:t>
+      </w:r>
+    </w:p>
+    <w:p>
+      <w:pPr>
+        <w:spacing w:line="288" w:lineRule="auto" w:after="40"/>
+        <w:ind w:firstLine="709"/>
+        <w:jc w:val="both"/>
+      </w:pPr>
+      <w:r>
+        <w:rPr>
+          <w:rFonts w:ascii="Times New Roman" w:hAnsi="Times New Roman"/>
+          <w:b w:val="0"/>
+          <w:color w:val="000000"/>
+          <w:sz w:val="24"/>
+        </w:rPr>
+        <w:t>Принято. Уточнение архитектуры действующего прототипа от 26.10.2026.</w:t>
+      </w:r>
+    </w:p>
+    <w:p>
+      <w:pPr>
+        <w:pStyle w:val="3"/>
+        <w:spacing w:line="288" w:lineRule="auto" w:before="80" w:after="40"/>
+      </w:pPr>
+      <w:r>
+        <w:rPr>
+          <w:rFonts w:ascii="Times New Roman" w:hAnsi="Times New Roman"/>
+          <w:b/>
+          <w:color w:val="000000"/>
+          <w:sz w:val="24"/>
+        </w:rPr>
+        <w:t>Контекст</w:t>
+      </w:r>
+    </w:p>
+    <w:p>
+      <w:pPr>
+        <w:spacing w:line="288" w:lineRule="auto" w:after="40"/>
+        <w:ind w:firstLine="709"/>
+        <w:jc w:val="both"/>
+      </w:pPr>
+      <w:r>
+        <w:rPr>
+          <w:rFonts w:ascii="Times New Roman" w:hAnsi="Times New Roman"/>
+          <w:b w:val="0"/>
+          <w:color w:val="000000"/>
+          <w:sz w:val="24"/>
+        </w:rPr>
+        <w:t>FR-02, FR-05, FR-07 и FR-09–15 связывают нормы, порции, список, упаковки и бюджет. ADR-003 определил детерминированную арифметику. Данные профиля и предложения магазинов находятся на сервере.</w:t>
+      </w:r>
+    </w:p>
+    <w:p>
+      <w:pPr>
+        <w:pStyle w:val="3"/>
+        <w:spacing w:line="288" w:lineRule="auto" w:before="80" w:after="40"/>
+      </w:pPr>
+      <w:r>
+        <w:rPr>
+          <w:rFonts w:ascii="Times New Roman" w:hAnsi="Times New Roman"/>
+          <w:b/>
+          <w:color w:val="000000"/>
+          <w:sz w:val="24"/>
+        </w:rPr>
+        <w:t>Проблема</w:t>
+      </w:r>
+    </w:p>
+    <w:p>
+      <w:pPr>
+        <w:spacing w:line="288" w:lineRule="auto" w:after="40"/>
+        <w:ind w:firstLine="709"/>
+        <w:jc w:val="both"/>
+      </w:pPr>
+      <w:r>
+        <w:rPr>
+          <w:rFonts w:ascii="Times New Roman" w:hAnsi="Times New Roman"/>
+          <w:b w:val="0"/>
+          <w:color w:val="000000"/>
+          <w:sz w:val="24"/>
+        </w:rPr>
+        <w:t>Расчёт в браузере и на сервере может разойтись из-за округления, устаревших данных или изменённого клиентского запроса. Нельзя принимать из UI готовую стоимость и считать её результатом системы.</w:t>
+      </w:r>
+    </w:p>
+    <w:p>
+      <w:pPr>
+        <w:pStyle w:val="3"/>
+        <w:spacing w:line="288" w:lineRule="auto" w:before="80" w:after="40"/>
+      </w:pPr>
+      <w:r>
+        <w:rPr>
+          <w:rFonts w:ascii="Times New Roman" w:hAnsi="Times New Roman"/>
+          <w:b/>
+          <w:color w:val="000000"/>
+          <w:sz w:val="24"/>
+        </w:rPr>
         <w:t>Рассмотренные альтернативы</w:t>
       </w:r>
     </w:p>
@@ -5786,7 +8307,22 @@
           <w:color w:val="000000"/>
           <w:sz w:val="24"/>
         </w:rPr>
-        <w:t>1. Одна форма: меньше экранов, но смешивает устойчивые данные с периодом и не соответствует заданному потоку.</w:t>
+        <w:t>Расчёт только в браузере уменьшает число запросов, но дублирует правила и позволяет подменить итог. Две независимые реализации повышают стоимость сопровождения. Внешняя языковая модель не нужна для арифметики и не используется.</w:t>
+      </w:r>
+    </w:p>
+    <w:p>
+      <w:pPr>
+        <w:pStyle w:val="3"/>
+        <w:spacing w:line="288" w:lineRule="auto" w:before="80" w:after="40"/>
+      </w:pPr>
+      <w:r>
+        <w:rPr>
+          <w:rFonts w:ascii="Times New Roman" w:hAnsi="Times New Roman"/>
+          <w:b/>
+          <w:color w:val="000000"/>
+          <w:sz w:val="24"/>
+        </w:rPr>
+        <w:t>Принятое решение</w:t>
       </w:r>
     </w:p>
     <w:p>
@@ -5802,7 +8338,22 @@
           <w:color w:val="000000"/>
           <w:sz w:val="24"/>
         </w:rPr>
-        <w:t>2. Пропускаемый профиль: быстрее открывает приложение, но допускает расчёт без обязательных исходных данных.</w:t>
+        <w:t>Считать целевые нормы, порции, допустимые замены, список и полные корзины Python-функциями на сервере. Фронтенд отправляет параметры и идентификаторы, затем отображает снимок. Копейки целочисленные, число упаковок округляется вверх. Прогноз замены применяет те же shopping и calculate_baskets, что итог. Решение уточняет границу компонентов из ADR-003.</w:t>
+      </w:r>
+    </w:p>
+    <w:p>
+      <w:pPr>
+        <w:pStyle w:val="3"/>
+        <w:spacing w:line="288" w:lineRule="auto" w:before="80" w:after="40"/>
+      </w:pPr>
+      <w:r>
+        <w:rPr>
+          <w:rFonts w:ascii="Times New Roman" w:hAnsi="Times New Roman"/>
+          <w:b/>
+          <w:color w:val="000000"/>
+          <w:sz w:val="24"/>
+        </w:rPr>
+        <w:t>Последствия</w:t>
       </w:r>
     </w:p>
     <w:p>
@@ -5818,12 +8369,59 @@
           <w:color w:val="000000"/>
           <w:sz w:val="24"/>
         </w:rPr>
-        <w:t>3. Только localStorage: не требует серверного маршрута, но готовый профиль оказывается привязан к одному браузеру и расходится с существующей авторизацией.</w:t>
+        <w:t>Сервер остаётся источником расчётного результата, едины правила округления и ограничений. Для замены требуется сетевой запрос; автономная работа пока не предусмотрена. Предварительная оценка перебирает кандидатов и пересчитывает корзину, поэтому рост каталога потребует замеров и возможного кэширования. Оптимальность бюджета не гарантируется.</w:t>
+      </w:r>
+    </w:p>
+    <w:p>
+      <w:pPr>
+        <w:pStyle w:val="3"/>
+        <w:spacing w:line="288" w:lineRule="auto" w:before="80" w:after="40"/>
+      </w:pPr>
+      <w:r>
+        <w:rPr>
+          <w:rFonts w:ascii="Times New Roman" w:hAnsi="Times New Roman"/>
+          <w:b/>
+          <w:color w:val="000000"/>
+          <w:sz w:val="24"/>
+        </w:rPr>
+        <w:t>Роль агента</w:t>
+      </w:r>
+    </w:p>
+    <w:p>
+      <w:pPr>
+        <w:spacing w:line="288" w:lineRule="auto" w:after="40"/>
+        <w:ind w:firstLine="709"/>
+        <w:jc w:val="both"/>
+      </w:pPr>
+      <w:r>
+        <w:rPr>
+          <w:rFonts w:ascii="Times New Roman" w:hAnsi="Times New Roman"/>
+          <w:b w:val="0"/>
+          <w:color w:val="000000"/>
+          <w:sz w:val="24"/>
+        </w:rPr>
+        <w:t>Агент проверил описание по вызовам snapshot и preview_replacements. В отчёте сохранены ранее полученные результаты, но новые тесты в этой итерации не запускались.</w:t>
       </w:r>
     </w:p>
     <w:p>
       <w:pPr>
         <w:pStyle w:val="2"/>
+        <w:pageBreakBefore/>
+        <w:spacing w:line="288" w:lineRule="auto" w:before="160" w:after="80"/>
+      </w:pPr>
+      <w:r>
+        <w:rPr>
+          <w:rFonts w:ascii="Times New Roman" w:hAnsi="Times New Roman"/>
+          <w:b/>
+          <w:color w:val="000000"/>
+          <w:sz w:val="28"/>
+        </w:rPr>
+        <w:t>ADR-010 Повторная проверка аллергенов при замене</w:t>
+      </w:r>
+    </w:p>
+    <w:p>
+      <w:pPr>
+        <w:pStyle w:val="3"/>
         <w:spacing w:line="288" w:lineRule="auto" w:before="80" w:after="40"/>
       </w:pPr>
       <w:r>
@@ -5833,6 +8431,130 @@
           <w:color w:val="000000"/>
           <w:sz w:val="24"/>
         </w:rPr>
+        <w:t>Статус</w:t>
+      </w:r>
+    </w:p>
+    <w:p>
+      <w:pPr>
+        <w:spacing w:line="288" w:lineRule="auto" w:after="40"/>
+        <w:ind w:firstLine="709"/>
+        <w:jc w:val="both"/>
+      </w:pPr>
+      <w:r>
+        <w:rPr>
+          <w:rFonts w:ascii="Times New Roman" w:hAnsi="Times New Roman"/>
+          <w:b w:val="0"/>
+          <w:color w:val="000000"/>
+          <w:sz w:val="24"/>
+        </w:rPr>
+        <w:t>Принято. Уточнение архитектуры действующего прототипа от 26.10.2026.</w:t>
+      </w:r>
+    </w:p>
+    <w:p>
+      <w:pPr>
+        <w:pStyle w:val="3"/>
+        <w:spacing w:line="288" w:lineRule="auto" w:before="80" w:after="40"/>
+      </w:pPr>
+      <w:r>
+        <w:rPr>
+          <w:rFonts w:ascii="Times New Roman" w:hAnsi="Times New Roman"/>
+          <w:b/>
+          <w:color w:val="000000"/>
+          <w:sz w:val="24"/>
+        </w:rPr>
+        <w:t>Контекст</w:t>
+      </w:r>
+    </w:p>
+    <w:p>
+      <w:pPr>
+        <w:spacing w:line="288" w:lineRule="auto" w:after="40"/>
+        <w:ind w:firstLine="709"/>
+        <w:jc w:val="both"/>
+      </w:pPr>
+      <w:r>
+        <w:rPr>
+          <w:rFonts w:ascii="Times New Roman" w:hAnsi="Times New Roman"/>
+          <w:b w:val="0"/>
+          <w:color w:val="000000"/>
+          <w:sz w:val="24"/>
+        </w:rPr>
+        <w:t>FR-03 задаёт исключения, FR-07 требует допустимую замену. Пользователь может открыть окно вариантов, затем изменить профиль или план в другом окне. Каталог содержит метки аллергенов ингредиентов.</w:t>
+      </w:r>
+    </w:p>
+    <w:p>
+      <w:pPr>
+        <w:pStyle w:val="3"/>
+        <w:spacing w:line="288" w:lineRule="auto" w:before="80" w:after="40"/>
+      </w:pPr>
+      <w:r>
+        <w:rPr>
+          <w:rFonts w:ascii="Times New Roman" w:hAnsi="Times New Roman"/>
+          <w:b/>
+          <w:color w:val="000000"/>
+          <w:sz w:val="24"/>
+        </w:rPr>
+        <w:t>Проблема</w:t>
+      </w:r>
+    </w:p>
+    <w:p>
+      <w:pPr>
+        <w:spacing w:line="288" w:lineRule="auto" w:after="40"/>
+        <w:ind w:firstLine="709"/>
+        <w:jc w:val="both"/>
+      </w:pPr>
+      <w:r>
+        <w:rPr>
+          <w:rFonts w:ascii="Times New Roman" w:hAnsi="Times New Roman"/>
+          <w:b w:val="0"/>
+          <w:color w:val="000000"/>
+          <w:sz w:val="24"/>
+        </w:rPr>
+        <w:t>Фильтра только в интерфейсе недостаточно: клиент может отправить произвольный recipe_id, а открытый список может устареть.</w:t>
+      </w:r>
+    </w:p>
+    <w:p>
+      <w:pPr>
+        <w:pStyle w:val="3"/>
+        <w:spacing w:line="288" w:lineRule="auto" w:before="80" w:after="40"/>
+      </w:pPr>
+      <w:r>
+        <w:rPr>
+          <w:rFonts w:ascii="Times New Roman" w:hAnsi="Times New Roman"/>
+          <w:b/>
+          <w:color w:val="000000"/>
+          <w:sz w:val="24"/>
+        </w:rPr>
+        <w:t>Рассмотренные альтернативы</w:t>
+      </w:r>
+    </w:p>
+    <w:p>
+      <w:pPr>
+        <w:spacing w:line="288" w:lineRule="auto" w:after="40"/>
+        <w:ind w:firstLine="709"/>
+        <w:jc w:val="both"/>
+      </w:pPr>
+      <w:r>
+        <w:rPr>
+          <w:rFonts w:ascii="Times New Roman" w:hAnsi="Times New Roman"/>
+          <w:b w:val="0"/>
+          <w:color w:val="000000"/>
+          <w:sz w:val="24"/>
+        </w:rPr>
+        <w:t>Клиентская проверка даёт быстрый отклик, но не является границей правил. Проверка только при GET не защищает последующий POST. Снятие ограничений при отсутствии вариантов противоречит потребности пользователя.</w:t>
+      </w:r>
+    </w:p>
+    <w:p>
+      <w:pPr>
+        <w:pStyle w:val="3"/>
+        <w:spacing w:line="288" w:lineRule="auto" w:before="80" w:after="40"/>
+      </w:pPr>
+      <w:r>
+        <w:rPr>
+          <w:rFonts w:ascii="Times New Roman" w:hAnsi="Times New Roman"/>
+          <w:b/>
+          <w:color w:val="000000"/>
+          <w:sz w:val="24"/>
+        </w:rPr>
         <w:t>Принятое решение</w:t>
       </w:r>
     </w:p>
@@ -5849,12 +8571,12 @@
           <w:color w:val="000000"/>
           <w:sz w:val="24"/>
         </w:rPr>
-        <w:t>Хранить профиль в profiles отдельно от снимка settings_json конкретного плана. Ввести PUT /api/profile и серверную проверку profile_complete перед генерацией. Черновик шагов хранить в localStorage по аккаунту; после успешного сохранения удалять его и переходить на дашборд. Для ограниченных чисел применять заданные пользователем шкалы, подтверждая значения серверной валидацией. В плане сохранять отпечаток значимых параметров профиля, чтобы не выдавать старый рацион за актуальный после изменения исключений.</w:t>
-      </w:r>
-    </w:p>
-    <w:p>
-      <w:pPr>
-        <w:pStyle w:val="2"/>
+        <w:t>Использовать общий replacement_candidates для GET /api/alternatives и повторно для POST /api/replace. allowed проверяет каждый ингредиент: пересечение его аллергенов с запретами должно быть пустым, исключённые продукты запрещены. Также учитываются предпочтения, время, тип приёма, повторы и диапазон калорий ±15% до подстройки порции. POST проверяет владельца, отпечаток профиля и revision в транзакции. При нарушении возвращается ошибка без записи.</w:t>
+      </w:r>
+    </w:p>
+    <w:p>
+      <w:pPr>
+        <w:pStyle w:val="3"/>
         <w:spacing w:line="288" w:lineRule="auto" w:before="80" w:after="40"/>
       </w:pPr>
       <w:r>
@@ -5880,12 +8602,12 @@
           <w:color w:val="000000"/>
           <w:sz w:val="24"/>
         </w:rPr>
-        <w:t>Повторный план не требует заново заполнять профиль. Возврат и перезагрузка не стирают черновик. Усложняется синхронизация черновика и готового профиля; теперь есть два состояния данных. Старый план после изменения параметров нужно пересоставить, хотя запись сохраняется. Дополнительный API требует проверки входных значений и принадлежности аккаунту. Автоматический расчёт для возраста 14-17 лет в этой итерации не добавляется.</w:t>
-      </w:r>
-    </w:p>
-    <w:p>
-      <w:pPr>
-        <w:pStyle w:val="2"/>
+        <w:t>Предварительный список и применение подчиняются одним правилам. При отсутствии вариантов ограничения сохраняются. Корректность зависит от полноты меток фиксированного каталога: следы аллергенов и производственные загрязнения не моделируются. Неопознанный текст из «Других аллергий» блокирует генерацию до уточнения, а не игнорируется.</w:t>
+      </w:r>
+    </w:p>
+    <w:p>
+      <w:pPr>
+        <w:pStyle w:val="3"/>
         <w:spacing w:line="288" w:lineRule="auto" w:before="80" w:after="40"/>
       </w:pPr>
       <w:r>
@@ -5911,7 +8633,7 @@
           <w:color w:val="000000"/>
           <w:sz w:val="24"/>
         </w:rPr>
-        <w:t>Пользователь сформулировал явную задачу с четырьмя состояниями онбординга и дашбордом. Агент разделил модели, реализовал формы и серверную защиту, сохранил заданные диапазоны шкал, добавил тесты возврата, перезагрузки и обхода маршрута. Отпечаток плана предложен и реализован агентом как защита от скрытого использования старых ограничений. Числовые поля и одна общая форма рассмотрены при реализации и отклонены по требованиям этого запроса.</w:t>
+        <w:t>Агент сопоставил решение с allowed, plan_settings и обработчиком замены, отметил зависимость от данных каталога. В этой итерации подготовлены документы и схемы без изменения фильтра и запуска тестов.</w:t>
       </w:r>
     </w:p>
     <w:p>
@@ -5998,7 +8720,7 @@
           <w:color w:val="000000"/>
           <w:sz w:val="24"/>
         </w:rPr>
-        <w:t>Таблица 4</w:t>
+        <w:t>Таблица 5</w:t>
       </w:r>
     </w:p>
     <w:tbl>
@@ -6857,6 +9579,16 @@
         <w:jc w:val="both"/>
       </w:pPr>
       <w:r>
+        <w:t>В документальной итерации пользователь задал: «Нам нужно завершить архитектурную часть ЛР2 для отчета», затем перечислил шесть сущностей ER, JSON-контракты, четыре дополнительных ADR и два процесса activity. Агент сверил требования с schema.sql, server.py, profiles.py, domain.py и replacements.py. При сверке уточнены PUT для профиля, два идентификатора при замене и логическая M:N связь состава в JSON. Подготовлены ADR-007–010 и схемы с редактируемыми исходниками. По просьбе пользователя тесты в этой итерации не запускались; протокол приложения содержит результаты предыдущей итерации.</w:t>
+      </w:r>
+    </w:p>
+    <w:p>
+      <w:pPr>
+        <w:spacing w:line="360" w:lineRule="auto"/>
+        <w:ind w:firstLine="709"/>
+        <w:jc w:val="both"/>
+      </w:pPr>
+      <w:r>
         <w:t>Следующая явная задача пользователя: «Реализуй экран результата после нажатия кнопки "Составить меню"». В постановке заданы дни, калории, цены, бюджет, сохранение и замены с влиянием на всю корзину. Агент реализовал экран, общий фильтр и предварительный пересчёт, затем проверил равенство прогноза и итоговой суммы. Activity-схема обновлена по фактическому процессу. Это отдельная реальная итерация разработки после онбординга.</w:t>
       </w:r>
     </w:p>
@@ -6936,7 +9668,7 @@
         <w:jc w:val="both"/>
       </w:pPr>
       <w:r>
-        <w:t>Подготовлены структурная схема, use case, три диаграммы активности, ER-модель, контракты, экраны и шесть ADR. Прототип включает регистрацию, обязательный профиль, дашборд, отдельный план, замену блюд, список и пять учебных корзин. Документы и код находятся в одном репозитории. Следующий этап: проверенный каталог и реальный разрешённый источник цен.</w:t>
+        <w:t>Подготовлены структурная схема, use case, пять диаграмм активности, физическая и предметная ER-модели, JSON-контракты, экраны и десять ADR. Прототип включает регистрацию, обязательный профиль, дашборд, отдельный план, замену блюд, список и пять учебных корзин. Документы и код находятся в одном репозитории. Следующий этап: проверенный каталог и реальный разрешённый источник цен.</w:t>
       </w:r>
     </w:p>
     <w:p>
@@ -7775,6 +10507,246 @@
       <w:pPr>
         <w:sectPr>
           <w:pgSz w:w="23811" w:h="16838" w:orient="landscape"/>
+          <w:pgMar w:top="850" w:right="850" w:bottom="850" w:left="1134" w:header="708" w:footer="567" w:gutter="0"/>
+          <w:cols w:space="708"/>
+          <w:docGrid w:linePitch="360"/>
+        </w:sectPr>
+      </w:pPr>
+    </w:p>
+    <w:p>
+      <w:pPr>
+        <w:spacing w:after="240"/>
+      </w:pPr>
+      <w:r>
+        <w:rPr>
+          <w:rFonts w:ascii="Times New Roman" w:hAnsi="Times New Roman"/>
+          <w:b w:val="0"/>
+          <w:color w:val="000000"/>
+          <w:sz w:val="24"/>
+        </w:rPr>
+        <w:t>Приложение А Продолжение</w:t>
+      </w:r>
+    </w:p>
+    <w:p>
+      <w:pPr>
+        <w:keepNext/>
+        <w:spacing w:line="240" w:lineRule="auto"/>
+        <w:jc w:val="center"/>
+      </w:pPr>
+      <w:r>
+        <w:drawing>
+          <wp:inline xmlns:a="http://schemas.openxmlformats.org/drawingml/2006/main" xmlns:pic="http://schemas.openxmlformats.org/drawingml/2006/picture">
+            <wp:extent cx="13860145" cy="8291965"/>
+            <wp:docPr id="10" name="Picture 10"/>
+            <wp:cNvGraphicFramePr>
+              <a:graphicFrameLocks noChangeAspect="1"/>
+            </wp:cNvGraphicFramePr>
+            <a:graphic>
+              <a:graphicData uri="http://schemas.openxmlformats.org/drawingml/2006/picture">
+                <pic:pic>
+                  <pic:nvPicPr>
+                    <pic:cNvPr id="0" name="er_domain.png"/>
+                    <pic:cNvPicPr/>
+                  </pic:nvPicPr>
+                  <pic:blipFill>
+                    <a:blip r:embed="rId18"/>
+                    <a:stretch>
+                      <a:fillRect/>
+                    </a:stretch>
+                  </pic:blipFill>
+                  <pic:spPr>
+                    <a:xfrm>
+                      <a:off x="0" y="0"/>
+                      <a:ext cx="13860145" cy="8291965"/>
+                    </a:xfrm>
+                    <a:prstGeom prst="rect"/>
+                  </pic:spPr>
+                </pic:pic>
+              </a:graphicData>
+            </a:graphic>
+          </wp:inline>
+        </w:drawing>
+      </w:r>
+    </w:p>
+    <w:p>
+      <w:pPr>
+        <w:spacing w:line="276" w:lineRule="auto"/>
+        <w:jc w:val="center"/>
+      </w:pPr>
+      <w:r>
+        <w:rPr>
+          <w:rFonts w:ascii="Times New Roman" w:hAnsi="Times New Roman"/>
+          <w:b w:val="0"/>
+          <w:color w:val="000000"/>
+          <w:sz w:val="24"/>
+        </w:rPr>
+        <w:t>Рисунок 10 - Предметная ER-модель и соответствие SQLite</w:t>
+      </w:r>
+    </w:p>
+    <w:p>
+      <w:pPr>
+        <w:sectPr>
+          <w:pgSz w:w="23811" w:h="16838" w:orient="landscape"/>
+          <w:pgMar w:top="850" w:right="850" w:bottom="850" w:left="1134" w:header="708" w:footer="567" w:gutter="0"/>
+          <w:cols w:space="708"/>
+          <w:docGrid w:linePitch="360"/>
+        </w:sectPr>
+      </w:pPr>
+    </w:p>
+    <w:p>
+      <w:pPr>
+        <w:spacing w:after="240"/>
+      </w:pPr>
+      <w:r>
+        <w:rPr>
+          <w:rFonts w:ascii="Times New Roman" w:hAnsi="Times New Roman"/>
+          <w:b w:val="0"/>
+          <w:color w:val="000000"/>
+          <w:sz w:val="24"/>
+        </w:rPr>
+        <w:t>Приложение А Продолжение</w:t>
+      </w:r>
+    </w:p>
+    <w:p>
+      <w:pPr>
+        <w:keepNext/>
+        <w:spacing w:line="240" w:lineRule="auto"/>
+        <w:jc w:val="center"/>
+      </w:pPr>
+      <w:r>
+        <w:drawing>
+          <wp:inline xmlns:a="http://schemas.openxmlformats.org/drawingml/2006/main" xmlns:pic="http://schemas.openxmlformats.org/drawingml/2006/picture">
+            <wp:extent cx="6496233" cy="12960485"/>
+            <wp:docPr id="11" name="Picture 11"/>
+            <wp:cNvGraphicFramePr>
+              <a:graphicFrameLocks noChangeAspect="1"/>
+            </wp:cNvGraphicFramePr>
+            <a:graphic>
+              <a:graphicData uri="http://schemas.openxmlformats.org/drawingml/2006/picture">
+                <pic:pic>
+                  <pic:nvPicPr>
+                    <pic:cNvPr id="0" name="activity_registration.png"/>
+                    <pic:cNvPicPr/>
+                  </pic:nvPicPr>
+                  <pic:blipFill>
+                    <a:blip r:embed="rId19"/>
+                    <a:stretch>
+                      <a:fillRect/>
+                    </a:stretch>
+                  </pic:blipFill>
+                  <pic:spPr>
+                    <a:xfrm>
+                      <a:off x="0" y="0"/>
+                      <a:ext cx="6496233" cy="12960485"/>
+                    </a:xfrm>
+                    <a:prstGeom prst="rect"/>
+                  </pic:spPr>
+                </pic:pic>
+              </a:graphicData>
+            </a:graphic>
+          </wp:inline>
+        </w:drawing>
+      </w:r>
+    </w:p>
+    <w:p>
+      <w:pPr>
+        <w:spacing w:line="276" w:lineRule="auto"/>
+        <w:jc w:val="center"/>
+      </w:pPr>
+      <w:r>
+        <w:rPr>
+          <w:rFonts w:ascii="Times New Roman" w:hAnsi="Times New Roman"/>
+          <w:b w:val="0"/>
+          <w:color w:val="000000"/>
+          <w:sz w:val="24"/>
+        </w:rPr>
+        <w:t>Рисунок 11 - Регистрация и заполнение профиля</w:t>
+      </w:r>
+    </w:p>
+    <w:p>
+      <w:pPr>
+        <w:sectPr>
+          <w:pgSz w:w="16838" w:h="23811"/>
+          <w:pgMar w:top="850" w:right="850" w:bottom="850" w:left="1134" w:header="708" w:footer="567" w:gutter="0"/>
+          <w:cols w:space="708"/>
+          <w:docGrid w:linePitch="360"/>
+        </w:sectPr>
+      </w:pPr>
+    </w:p>
+    <w:p>
+      <w:pPr>
+        <w:spacing w:after="240"/>
+      </w:pPr>
+      <w:r>
+        <w:rPr>
+          <w:rFonts w:ascii="Times New Roman" w:hAnsi="Times New Roman"/>
+          <w:b w:val="0"/>
+          <w:color w:val="000000"/>
+          <w:sz w:val="24"/>
+        </w:rPr>
+        <w:t>Приложение А Продолжение</w:t>
+      </w:r>
+    </w:p>
+    <w:p>
+      <w:pPr>
+        <w:keepNext/>
+        <w:spacing w:line="240" w:lineRule="auto"/>
+        <w:jc w:val="center"/>
+      </w:pPr>
+      <w:r>
+        <w:drawing>
+          <wp:inline xmlns:a="http://schemas.openxmlformats.org/drawingml/2006/main" xmlns:pic="http://schemas.openxmlformats.org/drawingml/2006/picture">
+            <wp:extent cx="5016250" cy="12960483"/>
+            <wp:docPr id="12" name="Picture 12"/>
+            <wp:cNvGraphicFramePr>
+              <a:graphicFrameLocks noChangeAspect="1"/>
+            </wp:cNvGraphicFramePr>
+            <a:graphic>
+              <a:graphicData uri="http://schemas.openxmlformats.org/drawingml/2006/picture">
+                <pic:pic>
+                  <pic:nvPicPr>
+                    <pic:cNvPr id="0" name="activity_generation.png"/>
+                    <pic:cNvPicPr/>
+                  </pic:nvPicPr>
+                  <pic:blipFill>
+                    <a:blip r:embed="rId20"/>
+                    <a:stretch>
+                      <a:fillRect/>
+                    </a:stretch>
+                  </pic:blipFill>
+                  <pic:spPr>
+                    <a:xfrm>
+                      <a:off x="0" y="0"/>
+                      <a:ext cx="5016250" cy="12960483"/>
+                    </a:xfrm>
+                    <a:prstGeom prst="rect"/>
+                  </pic:spPr>
+                </pic:pic>
+              </a:graphicData>
+            </a:graphic>
+          </wp:inline>
+        </w:drawing>
+      </w:r>
+    </w:p>
+    <w:p>
+      <w:pPr>
+        <w:spacing w:line="276" w:lineRule="auto"/>
+        <w:jc w:val="center"/>
+      </w:pPr>
+      <w:r>
+        <w:rPr>
+          <w:rFonts w:ascii="Times New Roman" w:hAnsi="Times New Roman"/>
+          <w:b w:val="0"/>
+          <w:color w:val="000000"/>
+          <w:sz w:val="24"/>
+        </w:rPr>
+        <w:t>Рисунок 12 - Генерация меню</w:t>
+      </w:r>
+    </w:p>
+    <w:p>
+      <w:pPr>
+        <w:sectPr>
+          <w:pgSz w:w="16838" w:h="23811"/>
           <w:pgMar w:top="850" w:right="850" w:bottom="850" w:left="1134" w:header="708" w:footer="567" w:gutter="0"/>
           <w:cols w:space="708"/>
           <w:docGrid w:linePitch="360"/>

</xml_diff>

<commit_message>
docs: align ADR format and architecture with profile and replacements
</commit_message>
<xml_diff>
--- a/output/lab2/Fit_Nutrition_Supply_LR2.docx
+++ b/output/lab2/Fit_Nutrition_Supply_LR2.docx
@@ -1521,7 +1521,7 @@
         <w:jc w:val="both"/>
       </w:pPr>
       <w:r>
-        <w:t>Принят модульный монолит с браузерным интерфейсом и одним серверным процессом. Интерфейс отправляет JSON-запросы; сервер проверяет сессию и входные данные, вызывает прикладные функции и обращается к SQLite. Доменные расчёты вынесены из HTTP-обработчика в domain.py.</w:t>
+        <w:t>Архитектура - модульный монолит. Браузер обращается к HTTP API; сервер проверяет сессию и ввод, вызывает расчётные функции и сохраняет данные в SQLite.</w:t>
       </w:r>
     </w:p>
     <w:p>
@@ -1675,7 +1675,7 @@
                 <w:color w:val="000000"/>
                 <w:sz w:val="22"/>
               </w:rPr>
-              <w:t>Формы, маршруты экранов, диалог рецепта, состояния ошибок</w:t>
+              <w:t>Навигация, онбординг, результат и выбор замены</w:t>
             </w:r>
           </w:p>
         </w:tc>
@@ -1695,7 +1695,7 @@
                 <w:color w:val="000000"/>
                 <w:sz w:val="22"/>
               </w:rPr>
-              <w:t>static/index.html, app.js, style.css</w:t>
+              <w:t>index.html, app.js, flow.js, result.js, style.css</w:t>
             </w:r>
           </w:p>
         </w:tc>
@@ -1850,7 +1850,7 @@
                 <w:color w:val="000000"/>
                 <w:sz w:val="22"/>
               </w:rPr>
-              <w:t>Планирование</w:t>
+              <w:t>Профиль</w:t>
             </w:r>
           </w:p>
         </w:tc>
@@ -1870,7 +1870,7 @@
                 <w:color w:val="000000"/>
                 <w:sz w:val="22"/>
               </w:rPr>
-              <w:t>Норма калорий, подбор допустимых блюд, размеры порций</w:t>
+              <w:t>Валидация, готовность, объединение с параметрами плана</w:t>
             </w:r>
           </w:p>
         </w:tc>
@@ -1890,7 +1890,7 @@
                 <w:color w:val="000000"/>
                 <w:sz w:val="22"/>
               </w:rPr>
-              <w:t>domain.py, validate_settings, generate_plan</w:t>
+              <w:t>profiles.py, validate_profile, plan_settings</w:t>
             </w:r>
           </w:p>
         </w:tc>
@@ -1915,7 +1915,7 @@
                 <w:color w:val="000000"/>
                 <w:sz w:val="22"/>
               </w:rPr>
-              <w:t>Закупки</w:t>
+              <w:t>Планирование</w:t>
             </w:r>
           </w:p>
         </w:tc>
@@ -1935,7 +1935,7 @@
                 <w:color w:val="000000"/>
                 <w:sz w:val="22"/>
               </w:rPr>
-              <w:t>Список, запасы, упаковки, полнота, сравнение, бюджет</w:t>
+              <w:t>Норма калорий, подбор допустимых блюд, размеры порций</w:t>
             </w:r>
           </w:p>
         </w:tc>
@@ -1955,7 +1955,7 @@
                 <w:color w:val="000000"/>
                 <w:sz w:val="22"/>
               </w:rPr>
-              <w:t>domain.py, shopping, calculate_baskets</w:t>
+              <w:t>domain.py, validate_settings, generate_plan</w:t>
             </w:r>
           </w:p>
         </w:tc>
@@ -1980,7 +1980,7 @@
                 <w:color w:val="000000"/>
                 <w:sz w:val="22"/>
               </w:rPr>
-              <w:t>Источник цен</w:t>
+              <w:t>Замена блюда</w:t>
             </w:r>
           </w:p>
         </w:tc>
@@ -2000,7 +2000,7 @@
                 <w:color w:val="000000"/>
                 <w:sz w:val="22"/>
               </w:rPr>
-              <w:t>Чтение предложений и обновление демонстрационного набора</w:t>
+              <w:t>Фильтр кандидатов, прогноз корзины и цена ингредиентов</w:t>
             </w:r>
           </w:p>
         </w:tc>
@@ -2020,7 +2020,7 @@
                 <w:color w:val="000000"/>
                 <w:sz w:val="22"/>
               </w:rPr>
-              <w:t>prices.py, DemoPriceProvider</w:t>
+              <w:t>replacements.py, replacement_candidates, preview_replacements, meal_cost</w:t>
             </w:r>
           </w:p>
         </w:tc>
@@ -2045,6 +2045,136 @@
                 <w:color w:val="000000"/>
                 <w:sz w:val="22"/>
               </w:rPr>
+              <w:t>Закупки</w:t>
+            </w:r>
+          </w:p>
+        </w:tc>
+        <w:tc>
+          <w:tcPr>
+            <w:tcW w:type="dxa" w:w="3458"/>
+          </w:tcPr>
+          <w:p>
+            <w:pPr>
+              <w:spacing w:line="252" w:lineRule="auto" w:after="60" w:before="60"/>
+              <w:ind w:firstLine="0"/>
+            </w:pPr>
+            <w:r>
+              <w:rPr>
+                <w:rFonts w:ascii="Times New Roman" w:hAnsi="Times New Roman"/>
+                <w:b w:val="0"/>
+                <w:color w:val="000000"/>
+                <w:sz w:val="22"/>
+              </w:rPr>
+              <w:t>Список, запасы, упаковки, полнота, сравнение, бюджет</w:t>
+            </w:r>
+          </w:p>
+        </w:tc>
+        <w:tc>
+          <w:tcPr>
+            <w:tcW w:type="dxa" w:w="3515"/>
+          </w:tcPr>
+          <w:p>
+            <w:pPr>
+              <w:spacing w:line="252" w:lineRule="auto" w:after="60" w:before="60"/>
+              <w:ind w:firstLine="0"/>
+            </w:pPr>
+            <w:r>
+              <w:rPr>
+                <w:rFonts w:ascii="Times New Roman" w:hAnsi="Times New Roman"/>
+                <w:b w:val="0"/>
+                <w:color w:val="000000"/>
+                <w:sz w:val="22"/>
+              </w:rPr>
+              <w:t>domain.py, shopping, calculate_baskets</w:t>
+            </w:r>
+          </w:p>
+        </w:tc>
+      </w:tr>
+      <w:tr>
+        <w:trPr>
+          <w:cantSplit/>
+        </w:trPr>
+        <w:tc>
+          <w:tcPr>
+            <w:tcW w:type="dxa" w:w="2381"/>
+          </w:tcPr>
+          <w:p>
+            <w:pPr>
+              <w:spacing w:line="252" w:lineRule="auto" w:after="60" w:before="60"/>
+              <w:ind w:firstLine="0"/>
+            </w:pPr>
+            <w:r>
+              <w:rPr>
+                <w:rFonts w:ascii="Times New Roman" w:hAnsi="Times New Roman"/>
+                <w:b w:val="0"/>
+                <w:color w:val="000000"/>
+                <w:sz w:val="22"/>
+              </w:rPr>
+              <w:t>Источник цен</w:t>
+            </w:r>
+          </w:p>
+        </w:tc>
+        <w:tc>
+          <w:tcPr>
+            <w:tcW w:type="dxa" w:w="3458"/>
+          </w:tcPr>
+          <w:p>
+            <w:pPr>
+              <w:spacing w:line="252" w:lineRule="auto" w:after="60" w:before="60"/>
+              <w:ind w:firstLine="0"/>
+            </w:pPr>
+            <w:r>
+              <w:rPr>
+                <w:rFonts w:ascii="Times New Roman" w:hAnsi="Times New Roman"/>
+                <w:b w:val="0"/>
+                <w:color w:val="000000"/>
+                <w:sz w:val="22"/>
+              </w:rPr>
+              <w:t>Чтение предложений и обновление демонстрационного набора</w:t>
+            </w:r>
+          </w:p>
+        </w:tc>
+        <w:tc>
+          <w:tcPr>
+            <w:tcW w:type="dxa" w:w="3515"/>
+          </w:tcPr>
+          <w:p>
+            <w:pPr>
+              <w:spacing w:line="252" w:lineRule="auto" w:after="60" w:before="60"/>
+              <w:ind w:firstLine="0"/>
+            </w:pPr>
+            <w:r>
+              <w:rPr>
+                <w:rFonts w:ascii="Times New Roman" w:hAnsi="Times New Roman"/>
+                <w:b w:val="0"/>
+                <w:color w:val="000000"/>
+                <w:sz w:val="22"/>
+              </w:rPr>
+              <w:t>prices.py, DemoPriceProvider</w:t>
+            </w:r>
+          </w:p>
+        </w:tc>
+      </w:tr>
+      <w:tr>
+        <w:trPr>
+          <w:cantSplit/>
+        </w:trPr>
+        <w:tc>
+          <w:tcPr>
+            <w:tcW w:type="dxa" w:w="2381"/>
+          </w:tcPr>
+          <w:p>
+            <w:pPr>
+              <w:spacing w:line="252" w:lineRule="auto" w:after="60" w:before="60"/>
+              <w:ind w:firstLine="0"/>
+            </w:pPr>
+            <w:r>
+              <w:rPr>
+                <w:rFonts w:ascii="Times New Roman" w:hAnsi="Times New Roman"/>
+                <w:b w:val="0"/>
+                <w:color w:val="000000"/>
+                <w:sz w:val="22"/>
+              </w:rPr>
               <w:t>Хранение</w:t>
             </w:r>
           </w:p>
@@ -2103,7 +2233,7 @@
         <w:jc w:val="both"/>
       </w:pPr>
       <w:r>
-        <w:t>Авторизация и SQL находятся в server.py; вычисления и источник цен вынесены в отдельные модули одного процесса.</w:t>
+        <w:t>Онбординг связывает flow.js с profiles.py, замена - result.js с replacements.py. Handler передаёт им данные из SQLite. Расчёты используют domain.py без доступа к БД; SQL и авторизация находятся в server.py, цены - в prices.py.</w:t>
       </w:r>
     </w:p>
     <w:p>
@@ -2113,17 +2243,7 @@
         <w:jc w:val="both"/>
       </w:pPr>
       <w:r>
-        <w:t>Стек: Python 3.10+, http.server, sqlite3, SQLite, bcrypt 5.0.0, HTML5, CSS3, JavaScript ES2020, HTTP/JSON. Документы строятся через Graphviz, draw.io, python-docx и LibreOffice.</w:t>
-      </w:r>
-    </w:p>
-    <w:p>
-      <w:pPr>
-        <w:spacing w:line="360" w:lineRule="auto"/>
-        <w:ind w:firstLine="709"/>
-        <w:jc w:val="both"/>
-      </w:pPr>
-      <w:r>
-        <w:t>HTTP-сервер слушает 127.0.0.1. Для публикации нужны сервер приложений и HTTPS; эта часть NFR-01 пока не выполнена.</w:t>
+        <w:t>Стек: Python 3.10+, http.server, sqlite3, SQLite, bcrypt 5.0.0, HTML5, CSS3, JavaScript ES2020, HTTP/JSON.</w:t>
       </w:r>
     </w:p>
     <w:p>
@@ -7717,7 +7837,7 @@
           <w:color w:val="000000"/>
           <w:sz w:val="28"/>
         </w:rPr>
-        <w:t>ADR-007 SQLite для локального прототипа</w:t>
+        <w:t>ADR-007: SQLite для локального прототипа</w:t>
       </w:r>
     </w:p>
     <w:p>
@@ -7950,7 +8070,7 @@
           <w:color w:val="000000"/>
           <w:sz w:val="28"/>
         </w:rPr>
-        <w:t>ADR-008 Python для серверной логики</w:t>
+        <w:t>ADR-008: Python для серверной логики</w:t>
       </w:r>
     </w:p>
     <w:p>
@@ -8012,7 +8132,7 @@
           <w:color w:val="000000"/>
           <w:sz w:val="24"/>
         </w:rPr>
-        <w:t>Действующий сервер использует Python, http.server, sqlite3 и bcrypt. Расчёты вынесены в domain.py, проверка профиля в profiles.py, замены в replacements.py, источник учебных цен в prices.py.</w:t>
+        <w:t>FR-02 требует сохранения параметров и расчёта нормы, FR-05 - составления меню, FR-07 - замены блюда с пересчётом. NFR-01 задаёт bcrypt cost 12 и ограничение попыток входа; NFR-02 задаёт p95 генерации до 5 с на условиях ЛР1. Python объединяет эти правила на сервере: domain.py выполняет расчёты, profiles.py проверяет профиль, replacements.py обрабатывает замены. Выбор языка сам по себе не подтверждает выполнение NFR-02: соответствующие нагрузочные проверки не проводились. HTTPS из NFR-01 пока не реализован.</w:t>
       </w:r>
     </w:p>
     <w:p>
@@ -8183,7 +8303,7 @@
           <w:color w:val="000000"/>
           <w:sz w:val="28"/>
         </w:rPr>
-        <w:t>ADR-009 Расчёт калорий и корзин на сервере</w:t>
+        <w:t>ADR-009: Расчёт калорий и корзин на сервере</w:t>
       </w:r>
     </w:p>
     <w:p>
@@ -8416,7 +8536,7 @@
           <w:color w:val="000000"/>
           <w:sz w:val="28"/>
         </w:rPr>
-        <w:t>ADR-010 Повторная проверка аллергенов при замене</w:t>
+        <w:t>ADR-010: Повторная проверка аллергенов при замене</w:t>
       </w:r>
     </w:p>
     <w:p>
@@ -9816,7 +9936,7 @@
       <w:r>
         <w:drawing>
           <wp:inline xmlns:a="http://schemas.openxmlformats.org/drawingml/2006/main" xmlns:pic="http://schemas.openxmlformats.org/drawingml/2006/picture">
-            <wp:extent cx="7669886" cy="5400810"/>
+            <wp:extent cx="13860145" cy="7047571"/>
             <wp:docPr id="1" name="Picture 1"/>
             <wp:cNvGraphicFramePr>
               <a:graphicFrameLocks noChangeAspect="1"/>
@@ -9837,7 +9957,7 @@
                   <pic:spPr>
                     <a:xfrm>
                       <a:off x="0" y="0"/>
-                      <a:ext cx="7669886" cy="5400810"/>
+                      <a:ext cx="13860145" cy="7047571"/>
                     </a:xfrm>
                     <a:prstGeom prst="rect"/>
                   </pic:spPr>
@@ -9866,7 +9986,7 @@
     <w:p>
       <w:pPr>
         <w:sectPr>
-          <w:pgSz w:w="16838" w:h="11906" w:orient="landscape"/>
+          <w:pgSz w:w="23811" w:h="16838" w:orient="landscape"/>
           <w:pgMar w:top="850" w:right="850" w:bottom="850" w:left="1134" w:header="708" w:footer="567" w:gutter="0"/>
           <w:cols w:space="708"/>
           <w:docGrid w:linePitch="360"/>

</xml_diff>